<commit_message>
manage avenant naavigation and refactor a little bit
</commit_message>
<xml_diff>
--- a/documents/SEM-template.docx
+++ b/documents/SEM-template.docx
@@ -25,6 +25,7 @@
         </w:rPr>
         <w:t xml:space="preserve">{% if </w:t>
       </w:r>
+      <w:proofErr w:type="gramStart"/>
       <w:r>
         <w:rPr>
           <w:rFonts w:ascii="TimesNewRomanPS-BoldMT" w:hAnsi="TimesNewRomanPS-BoldMT" w:cs="TimesNewRomanPS-BoldMT"/>
@@ -32,6 +33,7 @@
         </w:rPr>
         <w:t>convention.numero</w:t>
       </w:r>
+      <w:proofErr w:type="gramEnd"/>
       <w:r>
         <w:rPr>
           <w:rFonts w:ascii="TimesNewRomanPSMT" w:hAnsi="TimesNewRomanPSMT" w:cs="TimesNewRomanPSMT"/>
@@ -219,11 +221,19 @@
       </w:r>
       <w:bookmarkStart w:id="0" w:name="NomBailleur1"/>
       <w:bookmarkEnd w:id="0"/>
-      <w:r>
-        <w:rPr>
-          <w:rFonts w:ascii="TimesNewRomanPSMT" w:hAnsi="TimesNewRomanPSMT" w:cs="TimesNewRomanPSMT"/>
-        </w:rPr>
-        <w:t>{{ bailleur.nom|upper }} (1)</w:t>
+      <w:proofErr w:type="gramStart"/>
+      <w:r>
+        <w:rPr>
+          <w:rFonts w:ascii="TimesNewRomanPSMT" w:hAnsi="TimesNewRomanPSMT" w:cs="TimesNewRomanPSMT"/>
+        </w:rPr>
+        <w:t>{{ bailleur.nom</w:t>
+      </w:r>
+      <w:proofErr w:type="gramEnd"/>
+      <w:r>
+        <w:rPr>
+          <w:rFonts w:ascii="TimesNewRomanPSMT" w:hAnsi="TimesNewRomanPSMT" w:cs="TimesNewRomanPSMT"/>
+        </w:rPr>
+        <w:t>|upper }} (1)</w:t>
       </w:r>
       <w:r>
         <w:rPr>
@@ -317,11 +327,19 @@
       <w:pPr>
         <w:jc w:val="both"/>
       </w:pPr>
-      <w:r>
-        <w:rPr>
-          <w:rFonts w:ascii="TimesNewRomanPSMT" w:hAnsi="TimesNewRomanPSMT" w:cs="TimesNewRomanPSMT"/>
-        </w:rPr>
-        <w:t>d'une part,</w:t>
+      <w:proofErr w:type="gramStart"/>
+      <w:r>
+        <w:rPr>
+          <w:rFonts w:ascii="TimesNewRomanPSMT" w:hAnsi="TimesNewRomanPSMT" w:cs="TimesNewRomanPSMT"/>
+        </w:rPr>
+        <w:t>d'une</w:t>
+      </w:r>
+      <w:proofErr w:type="gramEnd"/>
+      <w:r>
+        <w:rPr>
+          <w:rFonts w:ascii="TimesNewRomanPSMT" w:hAnsi="TimesNewRomanPSMT" w:cs="TimesNewRomanPSMT"/>
+        </w:rPr>
+        <w:t xml:space="preserve"> part,</w:t>
       </w:r>
     </w:p>
     <w:p>
@@ -423,30 +441,46 @@
       <w:pPr>
         <w:jc w:val="both"/>
       </w:pPr>
-      <w:r>
-        <w:rPr>
-          <w:rFonts w:ascii="TimesNewRomanPSMT" w:hAnsi="TimesNewRomanPSMT" w:cs="TimesNewRomanPSMT"/>
-        </w:rPr>
-        <w:t>d'autre part,</w:t>
-      </w:r>
-    </w:p>
-    <w:p>
-      <w:pPr>
-        <w:jc w:val="both"/>
-        <w:rPr>
-          <w:rFonts w:ascii="TimesNewRomanPSMT" w:hAnsi="TimesNewRomanPSMT" w:cs="TimesNewRomanPSMT"/>
-        </w:rPr>
-      </w:pPr>
-    </w:p>
-    <w:p>
-      <w:pPr>
-        <w:jc w:val="both"/>
-      </w:pPr>
-      <w:r>
-        <w:rPr>
-          <w:rFonts w:ascii="TimesNewRomanPSMT" w:hAnsi="TimesNewRomanPSMT" w:cs="TimesNewRomanPSMT"/>
-        </w:rPr>
-        <w:t>sont convenus de ce qui suit :</w:t>
+      <w:proofErr w:type="gramStart"/>
+      <w:r>
+        <w:rPr>
+          <w:rFonts w:ascii="TimesNewRomanPSMT" w:hAnsi="TimesNewRomanPSMT" w:cs="TimesNewRomanPSMT"/>
+        </w:rPr>
+        <w:t>d'autre</w:t>
+      </w:r>
+      <w:proofErr w:type="gramEnd"/>
+      <w:r>
+        <w:rPr>
+          <w:rFonts w:ascii="TimesNewRomanPSMT" w:hAnsi="TimesNewRomanPSMT" w:cs="TimesNewRomanPSMT"/>
+        </w:rPr>
+        <w:t xml:space="preserve"> part,</w:t>
+      </w:r>
+    </w:p>
+    <w:p>
+      <w:pPr>
+        <w:jc w:val="both"/>
+        <w:rPr>
+          <w:rFonts w:ascii="TimesNewRomanPSMT" w:hAnsi="TimesNewRomanPSMT" w:cs="TimesNewRomanPSMT"/>
+        </w:rPr>
+      </w:pPr>
+    </w:p>
+    <w:p>
+      <w:pPr>
+        <w:jc w:val="both"/>
+      </w:pPr>
+      <w:proofErr w:type="gramStart"/>
+      <w:r>
+        <w:rPr>
+          <w:rFonts w:ascii="TimesNewRomanPSMT" w:hAnsi="TimesNewRomanPSMT" w:cs="TimesNewRomanPSMT"/>
+        </w:rPr>
+        <w:t>sont</w:t>
+      </w:r>
+      <w:proofErr w:type="gramEnd"/>
+      <w:r>
+        <w:rPr>
+          <w:rFonts w:ascii="TimesNewRomanPSMT" w:hAnsi="TimesNewRomanPSMT" w:cs="TimesNewRomanPSMT"/>
+        </w:rPr>
+        <w:t xml:space="preserve"> convenus de ce qui suit :</w:t>
       </w:r>
     </w:p>
     <w:p>
@@ -596,11 +630,19 @@
       </w:r>
       <w:bookmarkStart w:id="14" w:name="NomProgramme2"/>
       <w:bookmarkEnd w:id="14"/>
-      <w:r>
-        <w:rPr>
-          <w:rFonts w:ascii="TimesNewRomanPSMT" w:hAnsi="TimesNewRomanPSMT" w:cs="TimesNewRomanPSMT"/>
-        </w:rPr>
-        <w:t xml:space="preserve">{{ programme.nom }} de </w:t>
+      <w:proofErr w:type="gramStart"/>
+      <w:r>
+        <w:rPr>
+          <w:rFonts w:ascii="TimesNewRomanPSMT" w:hAnsi="TimesNewRomanPSMT" w:cs="TimesNewRomanPSMT"/>
+        </w:rPr>
+        <w:t>{{ programme.nom</w:t>
+      </w:r>
+      <w:proofErr w:type="gramEnd"/>
+      <w:r>
+        <w:rPr>
+          <w:rFonts w:ascii="TimesNewRomanPSMT" w:hAnsi="TimesNewRomanPSMT" w:cs="TimesNewRomanPSMT"/>
+        </w:rPr>
+        <w:t xml:space="preserve"> }} de </w:t>
       </w:r>
       <w:bookmarkStart w:id="15" w:name="NbLogement2"/>
       <w:bookmarkEnd w:id="15"/>
@@ -781,11 +823,19 @@
       </w:r>
       <w:bookmarkStart w:id="20" w:name="DateExpir1"/>
       <w:bookmarkEnd w:id="20"/>
-      <w:r>
-        <w:rPr>
-          <w:rFonts w:ascii="TimesNewRomanPSMT" w:hAnsi="TimesNewRomanPSMT" w:cs="TimesNewRomanPSMT"/>
-        </w:rPr>
-        <w:t>{{ convention.date_fin_conventionnement|d }}</w:t>
+      <w:proofErr w:type="gramStart"/>
+      <w:r>
+        <w:rPr>
+          <w:rFonts w:ascii="TimesNewRomanPSMT" w:hAnsi="TimesNewRomanPSMT" w:cs="TimesNewRomanPSMT"/>
+        </w:rPr>
+        <w:t>{{ convention</w:t>
+      </w:r>
+      <w:proofErr w:type="gramEnd"/>
+      <w:r>
+        <w:rPr>
+          <w:rFonts w:ascii="TimesNewRomanPSMT" w:hAnsi="TimesNewRomanPSMT" w:cs="TimesNewRomanPSMT"/>
+        </w:rPr>
+        <w:t>.date_fin_conventionnement|d }}</w:t>
       </w:r>
     </w:p>
     <w:p>
@@ -1054,12 +1104,21 @@
       <w:pPr>
         <w:jc w:val="center"/>
       </w:pPr>
+      <w:proofErr w:type="gramStart"/>
       <w:r>
         <w:rPr>
           <w:rFonts w:ascii="TimesNewRomanPS-BoldMT" w:hAnsi="TimesNewRomanPS-BoldMT" w:cs="TimesNewRomanPS-BoldMT"/>
           <w:b/>
         </w:rPr>
-        <w:t>aux conditions de location des logements.</w:t>
+        <w:t>aux</w:t>
+      </w:r>
+      <w:proofErr w:type="gramEnd"/>
+      <w:r>
+        <w:rPr>
+          <w:rFonts w:ascii="TimesNewRomanPS-BoldMT" w:hAnsi="TimesNewRomanPS-BoldMT" w:cs="TimesNewRomanPS-BoldMT"/>
+          <w:b/>
+        </w:rPr>
+        <w:t xml:space="preserve"> conditions de location des logements.</w:t>
       </w:r>
     </w:p>
     <w:p>
@@ -1325,6 +1384,7 @@
       </w:r>
       <w:bookmarkStart w:id="22" w:name="Mix3092"/>
       <w:bookmarkEnd w:id="22"/>
+      <w:proofErr w:type="gramStart"/>
       <w:r>
         <w:rPr>
           <w:rFonts w:ascii="TimesNewRomanPSMT" w:hAnsi="TimesNewRomanPSMT" w:cs="TimesNewRomanPSMT"/>
@@ -1347,6 +1407,7 @@
         </w:rPr>
         <w:t>inf</w:t>
       </w:r>
+      <w:proofErr w:type="gramEnd"/>
       <w:r>
         <w:rPr>
           <w:rFonts w:ascii="TimesNewRomanPSMT" w:hAnsi="TimesNewRomanPSMT" w:cs="TimesNewRomanPSMT"/>
@@ -1527,6 +1588,7 @@
       </w:r>
       <w:bookmarkStart w:id="23" w:name="Mix1091"/>
       <w:bookmarkEnd w:id="23"/>
+      <w:proofErr w:type="gramStart"/>
       <w:r>
         <w:rPr>
           <w:rFonts w:ascii="TimesNewRomanPSMT" w:hAnsi="TimesNewRomanPSMT" w:cs="TimesNewRomanPSMT"/>
@@ -1539,7 +1601,15 @@
           <w:rFonts w:ascii="TimesNewRomanPSMT" w:hAnsi="TimesNewRomanPSMT" w:cs="TimesNewRomanPSMT"/>
           <w:b/>
         </w:rPr>
-        <w:t>mixPLUSinf10_10pc</w:t>
+        <w:t>mixPLUSinf</w:t>
+      </w:r>
+      <w:proofErr w:type="gramEnd"/>
+      <w:r>
+        <w:rPr>
+          <w:rFonts w:ascii="TimesNewRomanPSMT" w:hAnsi="TimesNewRomanPSMT" w:cs="TimesNewRomanPSMT"/>
+          <w:b/>
+        </w:rPr>
+        <w:t>10_10pc</w:t>
       </w:r>
       <w:r>
         <w:rPr>
@@ -1713,12 +1783,21 @@
       </w:r>
       <w:bookmarkStart w:id="24" w:name="Loyer1"/>
       <w:bookmarkEnd w:id="24"/>
+      <w:proofErr w:type="gramStart"/>
       <w:r>
         <w:rPr>
           <w:rFonts w:ascii="TimesNewRomanPSMT" w:hAnsi="TimesNewRomanPSMT" w:cs="TimesNewRomanPSMT"/>
           <w:b/>
         </w:rPr>
-        <w:t>{{ loyer_m2</w:t>
+        <w:t>{{ loyer</w:t>
+      </w:r>
+      <w:proofErr w:type="gramEnd"/>
+      <w:r>
+        <w:rPr>
+          <w:rFonts w:ascii="TimesNewRomanPSMT" w:hAnsi="TimesNewRomanPSMT" w:cs="TimesNewRomanPSMT"/>
+          <w:b/>
+        </w:rPr>
+        <w:t>_m2</w:t>
       </w:r>
       <w:r>
         <w:rPr>
@@ -3018,7 +3097,21 @@
         <w:rPr>
           <w:rFonts w:ascii="TimesNewRomanPSMT" w:hAnsi="TimesNewRomanPSMT" w:cs="TimesNewRomanPSMT"/>
         </w:rPr>
-        <w:t>Les logements peuvent également être loués dans les conditions prévues aux quatrième et cinquième alinéas du I de l’article L. 442-8-1 du code de la construction et de l’habitation.</w:t>
+        <w:t xml:space="preserve">Les logements peuvent également être loués dans les conditions prévues </w:t>
+      </w:r>
+      <w:proofErr w:type="gramStart"/>
+      <w:r>
+        <w:rPr>
+          <w:rFonts w:ascii="TimesNewRomanPSMT" w:hAnsi="TimesNewRomanPSMT" w:cs="TimesNewRomanPSMT"/>
+        </w:rPr>
+        <w:t>aux quatrième et cinquième alinéas</w:t>
+      </w:r>
+      <w:proofErr w:type="gramEnd"/>
+      <w:r>
+        <w:rPr>
+          <w:rFonts w:ascii="TimesNewRomanPSMT" w:hAnsi="TimesNewRomanPSMT" w:cs="TimesNewRomanPSMT"/>
+        </w:rPr>
+        <w:t xml:space="preserve"> du I de l’article L. 442-8-1 du code de la construction et de l’habitation.</w:t>
       </w:r>
     </w:p>
     <w:p>
@@ -3151,7 +3244,21 @@
         <w:rPr>
           <w:rFonts w:ascii="TimesNewRomanPSMT" w:hAnsi="TimesNewRomanPSMT" w:cs="TimesNewRomanPSMT"/>
         </w:rPr>
-        <w:t>Le locataire peut donner congé à tout moment, dans les conditions des treizième à vingt-deuxième alinéas du I de l'article 15 de la loi du 6 juillet 1989 précitée. Il est redevable du loyer et des charges pendant la durée effective du délai de préavis, de jour à jour, sauf si le logement se trouve occupé avant la fin du préavis par un autre locataire en accord avec le bailleur.</w:t>
+        <w:t xml:space="preserve">Le locataire peut donner congé à tout moment, dans les conditions </w:t>
+      </w:r>
+      <w:proofErr w:type="gramStart"/>
+      <w:r>
+        <w:rPr>
+          <w:rFonts w:ascii="TimesNewRomanPSMT" w:hAnsi="TimesNewRomanPSMT" w:cs="TimesNewRomanPSMT"/>
+        </w:rPr>
+        <w:t>des treizième</w:t>
+      </w:r>
+      <w:proofErr w:type="gramEnd"/>
+      <w:r>
+        <w:rPr>
+          <w:rFonts w:ascii="TimesNewRomanPSMT" w:hAnsi="TimesNewRomanPSMT" w:cs="TimesNewRomanPSMT"/>
+        </w:rPr>
+        <w:t xml:space="preserve"> à vingt-deuxième alinéas du I de l'article 15 de la loi du 6 juillet 1989 précitée. Il est redevable du loyer et des charges pendant la durée effective du délai de préavis, de jour à jour, sauf si le logement se trouve occupé avant la fin du préavis par un autre locataire en accord avec le bailleur.</w:t>
       </w:r>
     </w:p>
     <w:p>
@@ -3981,11 +4088,19 @@
       <w:pPr>
         <w:jc w:val="both"/>
       </w:pPr>
-      <w:r>
-        <w:rPr>
-          <w:rFonts w:ascii="TimesNewRomanPSMT" w:hAnsi="TimesNewRomanPSMT" w:cs="TimesNewRomanPSMT"/>
-        </w:rPr>
-        <w:t>paiement de l'APL une copie de la présente convention, de ses avenants éventuels ainsi que l'état prouvant qu'elle (ou ils) a (ont) bien fait l'objet d'une publication au fichier immobilier (ou d'une inscription au livre foncier).</w:t>
+      <w:proofErr w:type="gramStart"/>
+      <w:r>
+        <w:rPr>
+          <w:rFonts w:ascii="TimesNewRomanPSMT" w:hAnsi="TimesNewRomanPSMT" w:cs="TimesNewRomanPSMT"/>
+        </w:rPr>
+        <w:t>paiement</w:t>
+      </w:r>
+      <w:proofErr w:type="gramEnd"/>
+      <w:r>
+        <w:rPr>
+          <w:rFonts w:ascii="TimesNewRomanPSMT" w:hAnsi="TimesNewRomanPSMT" w:cs="TimesNewRomanPSMT"/>
+        </w:rPr>
+        <w:t xml:space="preserve"> de l'APL une copie de la présente convention, de ses avenants éventuels ainsi que l'état prouvant qu'elle (ou ils) a (ont) bien fait l'objet d'une publication au fichier immobilier (ou d'une inscription au livre foncier).</w:t>
       </w:r>
     </w:p>
     <w:p>
@@ -4044,7 +4159,33 @@
                               <w:rPr>
                                 <w:rFonts w:ascii="TimesNewRomanPSMT" w:hAnsi="TimesNewRomanPSMT" w:cs="TimesNewRomanPSMT"/>
                               </w:rPr>
-                              <w:t>Fait en trois originaux à {{administration.get_ville_signature_or_empty() }}, le</w:t>
+                              <w:t xml:space="preserve">Fait en </w:t>
+                            </w:r>
+                            <w:proofErr w:type="gramStart"/>
+                            <w:r>
+                              <w:rPr>
+                                <w:rFonts w:ascii="TimesNewRomanPSMT" w:hAnsi="TimesNewRomanPSMT" w:cs="TimesNewRomanPSMT"/>
+                              </w:rPr>
+                              <w:t>{{ administration</w:t>
+                            </w:r>
+                            <w:proofErr w:type="gramEnd"/>
+                            <w:r>
+                              <w:rPr>
+                                <w:rFonts w:ascii="TimesNewRomanPSMT" w:hAnsi="TimesNewRomanPSMT" w:cs="TimesNewRomanPSMT"/>
+                              </w:rPr>
+                              <w:t>.nb_convention_exemplaires }}</w:t>
+                            </w:r>
+                            <w:r>
+                              <w:rPr>
+                                <w:rFonts w:ascii="TimesNewRomanPSMT" w:hAnsi="TimesNewRomanPSMT" w:cs="TimesNewRomanPSMT"/>
+                              </w:rPr>
+                              <w:t xml:space="preserve"> </w:t>
+                            </w:r>
+                            <w:r>
+                              <w:rPr>
+                                <w:rFonts w:ascii="TimesNewRomanPSMT" w:hAnsi="TimesNewRomanPSMT" w:cs="TimesNewRomanPSMT"/>
+                              </w:rPr>
+                              <w:t>originaux à {{administration.get_ville_signature_or_empty() }}, le</w:t>
                             </w:r>
                           </w:p>
                           <w:p>
@@ -4141,7 +4282,7 @@
                 <v:stroke joinstyle="miter"/>
                 <v:path gradientshapeok="t" o:connecttype="rect"/>
               </v:shapetype>
-              <v:shape id="Text Box 25" o:spid="_x0000_s1026" type="#_x0000_t202" style="width:411.95pt;height:213.85pt;visibility:visible;mso-wrap-style:square;mso-left-percent:-10001;mso-top-percent:-10001;mso-position-horizontal:absolute;mso-position-horizontal-relative:char;mso-position-vertical:absolute;mso-position-vertical-relative:line;mso-left-percent:-10001;mso-top-percent:-10001;v-text-anchor:top" o:gfxdata="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" fillcolor="white [3201]" stroked="f" strokeweight=".5pt">
+              <v:shape id="Text Box 25" o:spid="_x0000_s1026" type="#_x0000_t202" style="width:411.95pt;height:213.85pt;visibility:visible;mso-wrap-style:square;mso-left-percent:-10001;mso-top-percent:-10001;mso-position-horizontal:absolute;mso-position-horizontal-relative:char;mso-position-vertical:absolute;mso-position-vertical-relative:line;mso-left-percent:-10001;mso-top-percent:-10001;v-text-anchor:top" o:gfxdata="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" fillcolor="white [3201]" stroked="f" strokeweight=".5pt">
                 <v:textbox inset="0,0,0,0">
                   <w:txbxContent>
                     <w:p>
@@ -4152,7 +4293,33 @@
                         <w:rPr>
                           <w:rFonts w:ascii="TimesNewRomanPSMT" w:hAnsi="TimesNewRomanPSMT" w:cs="TimesNewRomanPSMT"/>
                         </w:rPr>
-                        <w:t>Fait en trois originaux à {{administration.get_ville_signature_or_empty() }}, le</w:t>
+                        <w:t xml:space="preserve">Fait en </w:t>
+                      </w:r>
+                      <w:proofErr w:type="gramStart"/>
+                      <w:r>
+                        <w:rPr>
+                          <w:rFonts w:ascii="TimesNewRomanPSMT" w:hAnsi="TimesNewRomanPSMT" w:cs="TimesNewRomanPSMT"/>
+                        </w:rPr>
+                        <w:t>{{ administration</w:t>
+                      </w:r>
+                      <w:proofErr w:type="gramEnd"/>
+                      <w:r>
+                        <w:rPr>
+                          <w:rFonts w:ascii="TimesNewRomanPSMT" w:hAnsi="TimesNewRomanPSMT" w:cs="TimesNewRomanPSMT"/>
+                        </w:rPr>
+                        <w:t>.nb_convention_exemplaires }}</w:t>
+                      </w:r>
+                      <w:r>
+                        <w:rPr>
+                          <w:rFonts w:ascii="TimesNewRomanPSMT" w:hAnsi="TimesNewRomanPSMT" w:cs="TimesNewRomanPSMT"/>
+                        </w:rPr>
+                        <w:t xml:space="preserve"> </w:t>
+                      </w:r>
+                      <w:r>
+                        <w:rPr>
+                          <w:rFonts w:ascii="TimesNewRomanPSMT" w:hAnsi="TimesNewRomanPSMT" w:cs="TimesNewRomanPSMT"/>
+                        </w:rPr>
+                        <w:t>originaux à {{administration.get_ville_signature_or_empty() }}, le</w:t>
                       </w:r>
                     </w:p>
                     <w:p>
@@ -4273,11 +4440,19 @@
       </w:r>
       <w:bookmarkStart w:id="25" w:name="NomProgramme3"/>
       <w:bookmarkEnd w:id="25"/>
-      <w:r>
-        <w:rPr>
-          <w:rFonts w:ascii="TimesNewRomanPSMT" w:hAnsi="TimesNewRomanPSMT" w:cs="TimesNewRomanPSMT"/>
-        </w:rPr>
-        <w:t xml:space="preserve">{{ programme.nom }}, pour </w:t>
+      <w:proofErr w:type="gramStart"/>
+      <w:r>
+        <w:rPr>
+          <w:rFonts w:ascii="TimesNewRomanPSMT" w:hAnsi="TimesNewRomanPSMT" w:cs="TimesNewRomanPSMT"/>
+        </w:rPr>
+        <w:t>{{ programme.nom</w:t>
+      </w:r>
+      <w:proofErr w:type="gramEnd"/>
+      <w:r>
+        <w:rPr>
+          <w:rFonts w:ascii="TimesNewRomanPSMT" w:hAnsi="TimesNewRomanPSMT" w:cs="TimesNewRomanPSMT"/>
+        </w:rPr>
+        <w:t xml:space="preserve"> }}, pour </w:t>
       </w:r>
       <w:bookmarkStart w:id="26" w:name="NbLogement3"/>
       <w:bookmarkEnd w:id="26"/>
@@ -4479,18 +4654,33 @@
           <w:rFonts w:ascii="TimesNewRomanPSMT" w:hAnsi="TimesNewRomanPSMT" w:cs="TimesNewRomanPSMT"/>
           <w:lang w:val="en-US"/>
         </w:rPr>
-        <w:t>{% endfor %}</w:t>
-      </w:r>
-      <w:r>
-        <w:rPr>
-          <w:rFonts w:ascii="TimesNewRomanPSMT" w:hAnsi="TimesNewRomanPSMT" w:cs="TimesNewRomanPSMT"/>
-        </w:rPr>
-        <w:t>{% if references_cadastrales|len %}</w:t>
+        <w:t xml:space="preserve">{% endfor </w:t>
+      </w:r>
+      <w:proofErr w:type="gramStart"/>
+      <w:r>
+        <w:rPr>
+          <w:rFonts w:ascii="TimesNewRomanPSMT" w:hAnsi="TimesNewRomanPSMT" w:cs="TimesNewRomanPSMT"/>
+          <w:lang w:val="en-US"/>
+        </w:rPr>
+        <w:t>%}</w:t>
+      </w:r>
+      <w:r>
+        <w:rPr>
+          <w:rFonts w:ascii="TimesNewRomanPSMT" w:hAnsi="TimesNewRomanPSMT" w:cs="TimesNewRomanPSMT"/>
+        </w:rPr>
+        <w:t>{</w:t>
+      </w:r>
+      <w:proofErr w:type="gramEnd"/>
+      <w:r>
+        <w:rPr>
+          <w:rFonts w:ascii="TimesNewRomanPSMT" w:hAnsi="TimesNewRomanPSMT" w:cs="TimesNewRomanPSMT"/>
+        </w:rPr>
+        <w:t>% if references_cadastrales|len %}</w:t>
       </w:r>
     </w:p>
     <w:tbl>
       <w:tblPr>
-        <w:tblStyle w:val="Grilledutableau"/>
+        <w:tblStyle w:val="TableGrid"/>
         <w:tblW w:w="0" w:type="auto"/>
         <w:tblLook w:val="04A0" w:firstRow="1" w:lastRow="0" w:firstColumn="1" w:lastColumn="0" w:noHBand="0" w:noVBand="1"/>
       </w:tblPr>
@@ -4691,13 +4881,23 @@
                 <w:lang w:val="en-US"/>
               </w:rPr>
             </w:pPr>
-            <w:r>
-              <w:rPr>
-                <w:sz w:val="16"/>
-                <w:szCs w:val="16"/>
-                <w:lang w:val="en-US"/>
-              </w:rPr>
-              <w:t>{{ rc.section }}</w:t>
+            <w:proofErr w:type="gramStart"/>
+            <w:r>
+              <w:rPr>
+                <w:sz w:val="16"/>
+                <w:szCs w:val="16"/>
+                <w:lang w:val="en-US"/>
+              </w:rPr>
+              <w:t>{{ rc</w:t>
+            </w:r>
+            <w:proofErr w:type="gramEnd"/>
+            <w:r>
+              <w:rPr>
+                <w:sz w:val="16"/>
+                <w:szCs w:val="16"/>
+                <w:lang w:val="en-US"/>
+              </w:rPr>
+              <w:t>.section }}</w:t>
             </w:r>
           </w:p>
         </w:tc>
@@ -4714,6 +4914,7 @@
                 <w:lang w:val="en-US"/>
               </w:rPr>
             </w:pPr>
+            <w:proofErr w:type="gramStart"/>
             <w:r>
               <w:rPr>
                 <w:sz w:val="16"/>
@@ -4730,6 +4931,7 @@
               </w:rPr>
               <w:t xml:space="preserve"> rc</w:t>
             </w:r>
+            <w:proofErr w:type="gramEnd"/>
             <w:r>
               <w:rPr>
                 <w:sz w:val="16"/>
@@ -4769,6 +4971,7 @@
                 <w:lang w:val="en-US"/>
               </w:rPr>
             </w:pPr>
+            <w:proofErr w:type="gramStart"/>
             <w:r>
               <w:rPr>
                 <w:sz w:val="16"/>
@@ -4783,7 +4986,16 @@
                 <w:szCs w:val="16"/>
                 <w:lang w:val="en-US"/>
               </w:rPr>
-              <w:t>rc.lieudit</w:t>
+              <w:t>rc</w:t>
+            </w:r>
+            <w:proofErr w:type="gramEnd"/>
+            <w:r>
+              <w:rPr>
+                <w:sz w:val="16"/>
+                <w:szCs w:val="16"/>
+                <w:lang w:val="en-US"/>
+              </w:rPr>
+              <w:t>.lieudit</w:t>
             </w:r>
             <w:r>
               <w:rPr>
@@ -4809,6 +5021,7 @@
                 <w:lang w:val="en-US"/>
               </w:rPr>
             </w:pPr>
+            <w:proofErr w:type="gramStart"/>
             <w:r>
               <w:rPr>
                 <w:rFonts w:ascii="TimesNewRomanPSMT" w:hAnsi="TimesNewRomanPSMT" w:cs="TimesNewRomanPSMT"/>
@@ -4825,7 +5038,17 @@
                 <w:szCs w:val="16"/>
                 <w:lang w:val="en-US"/>
               </w:rPr>
-              <w:t xml:space="preserve">rc.surface </w:t>
+              <w:t>rc</w:t>
+            </w:r>
+            <w:proofErr w:type="gramEnd"/>
+            <w:r>
+              <w:rPr>
+                <w:rFonts w:ascii="TimesNewRomanPSMT" w:hAnsi="TimesNewRomanPSMT" w:cs="TimesNewRomanPSMT"/>
+                <w:sz w:val="16"/>
+                <w:szCs w:val="16"/>
+                <w:lang w:val="en-US"/>
+              </w:rPr>
+              <w:t xml:space="preserve">.surface </w:t>
             </w:r>
             <w:r>
               <w:rPr>
@@ -4879,13 +5102,27 @@
         <w:rPr>
           <w:rFonts w:ascii="TimesNewRomanPSMT" w:hAnsi="TimesNewRomanPSMT" w:cs="TimesNewRomanPSMT"/>
         </w:rPr>
-        <w:t>{% endif %}</w:t>
-      </w:r>
-      <w:r>
-        <w:rPr>
-          <w:rFonts w:ascii="TimesNewRomanPSMT" w:hAnsi="TimesNewRomanPSMT" w:cs="TimesNewRomanPSMT"/>
-        </w:rPr>
-        <w:t>{% for image in effet_relatif_images %}</w:t>
+        <w:t xml:space="preserve">{% endif </w:t>
+      </w:r>
+      <w:proofErr w:type="gramStart"/>
+      <w:r>
+        <w:rPr>
+          <w:rFonts w:ascii="TimesNewRomanPSMT" w:hAnsi="TimesNewRomanPSMT" w:cs="TimesNewRomanPSMT"/>
+        </w:rPr>
+        <w:t>%}</w:t>
+      </w:r>
+      <w:r>
+        <w:rPr>
+          <w:rFonts w:ascii="TimesNewRomanPSMT" w:hAnsi="TimesNewRomanPSMT" w:cs="TimesNewRomanPSMT"/>
+        </w:rPr>
+        <w:t>{</w:t>
+      </w:r>
+      <w:proofErr w:type="gramEnd"/>
+      <w:r>
+        <w:rPr>
+          <w:rFonts w:ascii="TimesNewRomanPSMT" w:hAnsi="TimesNewRomanPSMT" w:cs="TimesNewRomanPSMT"/>
+        </w:rPr>
+        <w:t>% for image in effet_relatif_images %}</w:t>
       </w:r>
     </w:p>
     <w:p>
@@ -4907,77 +5144,68 @@
         <w:jc w:val="both"/>
         <w:rPr>
           <w:rFonts w:ascii="TimesNewRomanPSMT" w:hAnsi="TimesNewRomanPSMT" w:cs="TimesNewRomanPSMT"/>
-        </w:rPr>
-      </w:pPr>
-      <w:r>
-        <w:rPr>
-          <w:rFonts w:ascii="TimesNewRomanPSMT" w:hAnsi="TimesNewRomanPSMT" w:cs="TimesNewRomanPSMT"/>
           <w:lang w:val="en-US"/>
         </w:rPr>
-        <w:t>{% endfor %}</w:t>
-      </w:r>
-      <w:r>
-        <w:rPr>
-          <w:rFonts w:ascii="TimesNewRomanPSMT" w:hAnsi="TimesNewRomanPSMT" w:cs="TimesNewRomanPSMT"/>
-        </w:rPr>
-        <w:t xml:space="preserve">{% if </w:t>
-      </w:r>
+      </w:pPr>
       <w:r>
         <w:rPr>
           <w:rFonts w:ascii="TimesNewRomanPSMT" w:hAnsi="TimesNewRomanPSMT" w:cs="TimesNewRomanPSMT"/>
           <w:lang w:val="en-US"/>
         </w:rPr>
+        <w:t xml:space="preserve">{% endfor </w:t>
+      </w:r>
+      <w:proofErr w:type="gramStart"/>
+      <w:r>
+        <w:rPr>
+          <w:rFonts w:ascii="TimesNewRomanPSMT" w:hAnsi="TimesNewRomanPSMT" w:cs="TimesNewRomanPSMT"/>
+          <w:lang w:val="en-US"/>
+        </w:rPr>
+        <w:t>%}</w:t>
+      </w:r>
+      <w:r>
+        <w:rPr>
+          <w:rFonts w:ascii="TimesNewRomanPSMT" w:hAnsi="TimesNewRomanPSMT" w:cs="TimesNewRomanPSMT"/>
+          <w:lang w:val="en-US"/>
+        </w:rPr>
+        <w:t>{</w:t>
+      </w:r>
+      <w:proofErr w:type="gramEnd"/>
+      <w:r>
+        <w:rPr>
+          <w:rFonts w:ascii="TimesNewRomanPSMT" w:hAnsi="TimesNewRomanPSMT" w:cs="TimesNewRomanPSMT"/>
+          <w:lang w:val="en-US"/>
+        </w:rPr>
+        <w:t xml:space="preserve">% if </w:t>
+      </w:r>
+      <w:r>
+        <w:rPr>
+          <w:rFonts w:ascii="TimesNewRomanPSMT" w:hAnsi="TimesNewRomanPSMT" w:cs="TimesNewRomanPSMT"/>
+          <w:lang w:val="en-US"/>
+        </w:rPr>
         <w:t>lot</w:t>
       </w:r>
       <w:r>
         <w:rPr>
           <w:rFonts w:ascii="TimesNewRomanPSMT" w:hAnsi="TimesNewRomanPSMT" w:cs="TimesNewRomanPSMT"/>
-        </w:rPr>
-        <w:t>.edd_volumetrique</w:t>
-      </w:r>
-      <w:r>
-        <w:rPr>
-          <w:rFonts w:ascii="TimesNewRomanPSMT" w:hAnsi="TimesNewRomanPSMT" w:cs="TimesNewRomanPSMT"/>
-        </w:rPr>
-        <w:t>_text()|len %}</w:t>
-      </w:r>
-    </w:p>
-    <w:p>
-      <w:pPr>
-        <w:jc w:val="both"/>
-        <w:rPr>
-          <w:rFonts w:ascii="TimesNewRomanPSMT" w:hAnsi="TimesNewRomanPSMT" w:cs="TimesNewRomanPSMT"/>
-        </w:rPr>
-      </w:pPr>
-      <w:r>
-        <w:rPr>
-          <w:rFonts w:ascii="TimesNewRomanPSMT" w:hAnsi="TimesNewRomanPSMT" w:cs="TimesNewRomanPSMT"/>
-        </w:rPr>
-        <w:t xml:space="preserve">{{ </w:t>
-      </w:r>
-      <w:r>
-        <w:rPr>
-          <w:rFonts w:ascii="TimesNewRomanPSMT" w:hAnsi="TimesNewRomanPSMT" w:cs="TimesNewRomanPSMT"/>
-        </w:rPr>
-        <w:t>lot</w:t>
-      </w:r>
-      <w:r>
-        <w:rPr>
-          <w:rFonts w:ascii="TimesNewRomanPSMT" w:hAnsi="TimesNewRomanPSMT" w:cs="TimesNewRomanPSMT"/>
-        </w:rPr>
-        <w:t>.edd_volumetrique</w:t>
-      </w:r>
-      <w:r>
-        <w:rPr>
-          <w:rFonts w:ascii="TimesNewRomanPSMT" w:hAnsi="TimesNewRomanPSMT" w:cs="TimesNewRomanPSMT"/>
-        </w:rPr>
-        <w:t>_text()</w:t>
-      </w:r>
-      <w:r>
-        <w:rPr>
-          <w:rFonts w:ascii="TimesNewRomanPSMT" w:hAnsi="TimesNewRomanPSMT" w:cs="TimesNewRomanPSMT"/>
-        </w:rPr>
-        <w:t xml:space="preserve"> }}</w:t>
+          <w:lang w:val="en-US"/>
+        </w:rPr>
+        <w:t>.edd_volumetrique_text()|len %}</w:t>
+      </w:r>
+    </w:p>
+    <w:p>
+      <w:pPr>
+        <w:jc w:val="both"/>
+        <w:rPr>
+          <w:rFonts w:ascii="TimesNewRomanPSMT" w:hAnsi="TimesNewRomanPSMT" w:cs="TimesNewRomanPSMT"/>
+          <w:lang w:val="en-US"/>
+        </w:rPr>
+      </w:pPr>
+      <w:r>
+        <w:rPr>
+          <w:rFonts w:ascii="TimesNewRomanPSMT" w:hAnsi="TimesNewRomanPSMT" w:cs="TimesNewRomanPSMT"/>
+          <w:lang w:val="en-US"/>
+        </w:rPr>
+        <w:t>{{ lot.edd_volumetrique_text() }}</w:t>
       </w:r>
       <w:bookmarkStart w:id="32" w:name="S4"/>
       <w:bookmarkEnd w:id="32"/>
@@ -4987,43 +5215,29 @@
         <w:jc w:val="both"/>
         <w:rPr>
           <w:rFonts w:ascii="TimesNewRomanPSMT" w:hAnsi="TimesNewRomanPSMT" w:cs="TimesNewRomanPSMT"/>
-        </w:rPr>
-      </w:pPr>
-      <w:r>
-        <w:rPr>
-          <w:rFonts w:ascii="TimesNewRomanPSMT" w:hAnsi="TimesNewRomanPSMT" w:cs="TimesNewRomanPSMT"/>
-        </w:rPr>
-        <w:t>{% endif %}</w:t>
-      </w:r>
-      <w:r>
-        <w:rPr>
-          <w:rFonts w:ascii="TimesNewRomanPSMT" w:hAnsi="TimesNewRomanPSMT" w:cs="TimesNewRomanPSMT"/>
-        </w:rPr>
-        <w:t xml:space="preserve">{% for image in </w:t>
-      </w:r>
-      <w:r>
-        <w:rPr>
-          <w:rFonts w:ascii="TimesNewRomanPSMT" w:hAnsi="TimesNewRomanPSMT" w:cs="TimesNewRomanPSMT"/>
-        </w:rPr>
-        <w:t>edd_volumetrique</w:t>
-      </w:r>
-      <w:r>
-        <w:rPr>
-          <w:rFonts w:ascii="TimesNewRomanPSMT" w:hAnsi="TimesNewRomanPSMT" w:cs="TimesNewRomanPSMT"/>
-        </w:rPr>
-        <w:t>_images %}</w:t>
-      </w:r>
-    </w:p>
-    <w:p>
-      <w:pPr>
-        <w:jc w:val="both"/>
-        <w:rPr>
-          <w:rFonts w:ascii="TimesNewRomanPSMT" w:hAnsi="TimesNewRomanPSMT" w:cs="TimesNewRomanPSMT"/>
-        </w:rPr>
-      </w:pPr>
-      <w:r>
-        <w:rPr>
-          <w:rFonts w:ascii="TimesNewRomanPSMT" w:hAnsi="TimesNewRomanPSMT" w:cs="TimesNewRomanPSMT"/>
+          <w:lang w:val="en-US"/>
+        </w:rPr>
+      </w:pPr>
+      <w:r>
+        <w:rPr>
+          <w:rFonts w:ascii="TimesNewRomanPSMT" w:hAnsi="TimesNewRomanPSMT" w:cs="TimesNewRomanPSMT"/>
+          <w:lang w:val="en-US"/>
+        </w:rPr>
+        <w:t>{% endif %}{% for image in edd_volumetrique_images %}</w:t>
+      </w:r>
+    </w:p>
+    <w:p>
+      <w:pPr>
+        <w:jc w:val="both"/>
+        <w:rPr>
+          <w:rFonts w:ascii="TimesNewRomanPSMT" w:hAnsi="TimesNewRomanPSMT" w:cs="TimesNewRomanPSMT"/>
+          <w:lang w:val="en-US"/>
+        </w:rPr>
+      </w:pPr>
+      <w:r>
+        <w:rPr>
+          <w:rFonts w:ascii="TimesNewRomanPSMT" w:hAnsi="TimesNewRomanPSMT" w:cs="TimesNewRomanPSMT"/>
+          <w:lang w:val="en-US"/>
         </w:rPr>
         <w:t>{{image}}</w:t>
       </w:r>
@@ -5033,19 +5247,30 @@
         <w:jc w:val="both"/>
         <w:rPr>
           <w:rFonts w:ascii="TimesNewRomanPSMT" w:hAnsi="TimesNewRomanPSMT" w:cs="TimesNewRomanPSMT"/>
-        </w:rPr>
-      </w:pPr>
-      <w:r>
-        <w:rPr>
-          <w:rFonts w:ascii="TimesNewRomanPSMT" w:hAnsi="TimesNewRomanPSMT" w:cs="TimesNewRomanPSMT"/>
-        </w:rPr>
-        <w:t>{% endfor %}</w:t>
-      </w:r>
-      <w:r>
-        <w:rPr>
-          <w:rFonts w:ascii="TimesNewRomanPSMT" w:hAnsi="TimesNewRomanPSMT" w:cs="TimesNewRomanPSMT"/>
-        </w:rPr>
-        <w:t xml:space="preserve">{% if </w:t>
+          <w:lang w:val="en-US"/>
+        </w:rPr>
+      </w:pPr>
+      <w:r>
+        <w:rPr>
+          <w:rFonts w:ascii="TimesNewRomanPSMT" w:hAnsi="TimesNewRomanPSMT" w:cs="TimesNewRomanPSMT"/>
+          <w:lang w:val="en-US"/>
+        </w:rPr>
+        <w:t>{% endfor %}{% if programme.mention_publication_edd_volumetrique %}</w:t>
+      </w:r>
+    </w:p>
+    <w:p>
+      <w:pPr>
+        <w:jc w:val="both"/>
+        <w:rPr>
+          <w:rFonts w:ascii="TimesNewRomanPSMT" w:hAnsi="TimesNewRomanPSMT" w:cs="TimesNewRomanPSMT"/>
+        </w:rPr>
+      </w:pPr>
+      <w:proofErr w:type="gramStart"/>
+      <w:r>
+        <w:rPr>
+          <w:rFonts w:ascii="TimesNewRomanPSMT" w:hAnsi="TimesNewRomanPSMT" w:cs="TimesNewRomanPSMT"/>
+        </w:rPr>
+        <w:t xml:space="preserve">{{ </w:t>
       </w:r>
       <w:r>
         <w:rPr>
@@ -5053,6 +5278,7 @@
         </w:rPr>
         <w:t>programme</w:t>
       </w:r>
+      <w:proofErr w:type="gramEnd"/>
       <w:r>
         <w:rPr>
           <w:rFonts w:ascii="TimesNewRomanPSMT" w:hAnsi="TimesNewRomanPSMT" w:cs="TimesNewRomanPSMT"/>
@@ -5087,62 +5313,6 @@
         <w:rPr>
           <w:rFonts w:ascii="TimesNewRomanPSMT" w:hAnsi="TimesNewRomanPSMT" w:cs="TimesNewRomanPSMT"/>
         </w:rPr>
-        <w:t xml:space="preserve"> %}</w:t>
-      </w:r>
-    </w:p>
-    <w:p>
-      <w:pPr>
-        <w:jc w:val="both"/>
-        <w:rPr>
-          <w:rFonts w:ascii="TimesNewRomanPSMT" w:hAnsi="TimesNewRomanPSMT" w:cs="TimesNewRomanPSMT"/>
-        </w:rPr>
-      </w:pPr>
-      <w:r>
-        <w:rPr>
-          <w:rFonts w:ascii="TimesNewRomanPSMT" w:hAnsi="TimesNewRomanPSMT" w:cs="TimesNewRomanPSMT"/>
-        </w:rPr>
-        <w:t xml:space="preserve">{{ </w:t>
-      </w:r>
-      <w:r>
-        <w:rPr>
-          <w:rFonts w:ascii="TimesNewRomanPSMT" w:hAnsi="TimesNewRomanPSMT" w:cs="TimesNewRomanPSMT"/>
-        </w:rPr>
-        <w:t>programme</w:t>
-      </w:r>
-      <w:r>
-        <w:rPr>
-          <w:rFonts w:ascii="TimesNewRomanPSMT" w:hAnsi="TimesNewRomanPSMT" w:cs="TimesNewRomanPSMT"/>
-        </w:rPr>
-        <w:t>.</w:t>
-      </w:r>
-      <w:r>
-        <w:rPr>
-          <w:rFonts w:ascii="TimesNewRomanPSMT" w:hAnsi="TimesNewRomanPSMT" w:cs="TimesNewRomanPSMT"/>
-        </w:rPr>
-        <w:t>mention_publication</w:t>
-      </w:r>
-      <w:r>
-        <w:rPr>
-          <w:rFonts w:ascii="TimesNewRomanPSMT" w:hAnsi="TimesNewRomanPSMT" w:cs="TimesNewRomanPSMT"/>
-        </w:rPr>
-        <w:t>_</w:t>
-      </w:r>
-      <w:r>
-        <w:rPr>
-          <w:rFonts w:ascii="TimesNewRomanPSMT" w:hAnsi="TimesNewRomanPSMT" w:cs="TimesNewRomanPSMT"/>
-        </w:rPr>
-        <w:t>edd_</w:t>
-      </w:r>
-      <w:r>
-        <w:rPr>
-          <w:rFonts w:ascii="TimesNewRomanPSMT" w:hAnsi="TimesNewRomanPSMT" w:cs="TimesNewRomanPSMT"/>
-        </w:rPr>
-        <w:t>volumetrique</w:t>
-      </w:r>
-      <w:r>
-        <w:rPr>
-          <w:rFonts w:ascii="TimesNewRomanPSMT" w:hAnsi="TimesNewRomanPSMT" w:cs="TimesNewRomanPSMT"/>
-        </w:rPr>
         <w:t xml:space="preserve"> </w:t>
       </w:r>
       <w:r>
@@ -5157,143 +5327,77 @@
         <w:jc w:val="both"/>
         <w:rPr>
           <w:rFonts w:ascii="TimesNewRomanPSMT" w:hAnsi="TimesNewRomanPSMT" w:cs="TimesNewRomanPSMT"/>
-        </w:rPr>
-      </w:pPr>
-      <w:r>
-        <w:rPr>
-          <w:rFonts w:ascii="TimesNewRomanPSMT" w:hAnsi="TimesNewRomanPSMT" w:cs="TimesNewRomanPSMT"/>
-        </w:rPr>
-        <w:t>{% endif %}</w:t>
-      </w:r>
-      <w:r>
-        <w:rPr>
-          <w:rFonts w:ascii="TimesNewRomanPSMT" w:hAnsi="TimesNewRomanPSMT" w:cs="TimesNewRomanPSMT"/>
-        </w:rPr>
-        <w:t xml:space="preserve">{% if </w:t>
-      </w:r>
-      <w:r>
-        <w:rPr>
-          <w:rFonts w:ascii="TimesNewRomanPSMT" w:hAnsi="TimesNewRomanPSMT" w:cs="TimesNewRomanPSMT"/>
-        </w:rPr>
-        <w:t>lot</w:t>
-      </w:r>
-      <w:r>
-        <w:rPr>
-          <w:rFonts w:ascii="TimesNewRomanPSMT" w:hAnsi="TimesNewRomanPSMT" w:cs="TimesNewRomanPSMT"/>
-        </w:rPr>
-        <w:t>.edd_</w:t>
-      </w:r>
-      <w:r>
-        <w:rPr>
-          <w:rFonts w:ascii="TimesNewRomanPSMT" w:hAnsi="TimesNewRomanPSMT" w:cs="TimesNewRomanPSMT"/>
-        </w:rPr>
-        <w:t>classique</w:t>
-      </w:r>
-      <w:r>
-        <w:rPr>
-          <w:rFonts w:ascii="TimesNewRomanPSMT" w:hAnsi="TimesNewRomanPSMT" w:cs="TimesNewRomanPSMT"/>
-        </w:rPr>
-        <w:t>_text()|len %}</w:t>
-      </w:r>
-    </w:p>
-    <w:p>
-      <w:pPr>
-        <w:jc w:val="both"/>
-        <w:rPr>
-          <w:rFonts w:ascii="TimesNewRomanPSMT" w:hAnsi="TimesNewRomanPSMT" w:cs="TimesNewRomanPSMT"/>
-        </w:rPr>
-      </w:pPr>
-      <w:r>
-        <w:rPr>
-          <w:rFonts w:ascii="TimesNewRomanPSMT" w:hAnsi="TimesNewRomanPSMT" w:cs="TimesNewRomanPSMT"/>
-        </w:rPr>
-        <w:t xml:space="preserve">{{ </w:t>
-      </w:r>
-      <w:r>
-        <w:rPr>
-          <w:rFonts w:ascii="TimesNewRomanPSMT" w:hAnsi="TimesNewRomanPSMT" w:cs="TimesNewRomanPSMT"/>
-        </w:rPr>
-        <w:t>lot</w:t>
-      </w:r>
-      <w:r>
-        <w:rPr>
-          <w:rFonts w:ascii="TimesNewRomanPSMT" w:hAnsi="TimesNewRomanPSMT" w:cs="TimesNewRomanPSMT"/>
-        </w:rPr>
-        <w:t>.edd_</w:t>
-      </w:r>
-      <w:r>
-        <w:rPr>
-          <w:rFonts w:ascii="TimesNewRomanPSMT" w:hAnsi="TimesNewRomanPSMT" w:cs="TimesNewRomanPSMT"/>
-        </w:rPr>
-        <w:t>class</w:t>
-      </w:r>
-      <w:r>
-        <w:rPr>
-          <w:rFonts w:ascii="TimesNewRomanPSMT" w:hAnsi="TimesNewRomanPSMT" w:cs="TimesNewRomanPSMT"/>
-        </w:rPr>
-        <w:t>ique</w:t>
-      </w:r>
-      <w:r>
-        <w:rPr>
-          <w:rFonts w:ascii="TimesNewRomanPSMT" w:hAnsi="TimesNewRomanPSMT" w:cs="TimesNewRomanPSMT"/>
-        </w:rPr>
-        <w:t xml:space="preserve">_text() </w:t>
-      </w:r>
-      <w:r>
-        <w:rPr>
-          <w:rFonts w:ascii="TimesNewRomanPSMT" w:hAnsi="TimesNewRomanPSMT" w:cs="TimesNewRomanPSMT"/>
-        </w:rPr>
-        <w:t>}}</w:t>
-      </w:r>
-    </w:p>
-    <w:p>
-      <w:pPr>
-        <w:jc w:val="both"/>
-        <w:rPr>
-          <w:rFonts w:ascii="TimesNewRomanPSMT" w:hAnsi="TimesNewRomanPSMT" w:cs="TimesNewRomanPSMT"/>
-        </w:rPr>
-      </w:pPr>
-      <w:r>
-        <w:rPr>
-          <w:rFonts w:ascii="TimesNewRomanPSMT" w:hAnsi="TimesNewRomanPSMT" w:cs="TimesNewRomanPSMT"/>
-        </w:rPr>
-        <w:t>{% endif %}</w:t>
-      </w:r>
-      <w:r>
-        <w:rPr>
-          <w:rFonts w:ascii="TimesNewRomanPSMT" w:hAnsi="TimesNewRomanPSMT" w:cs="TimesNewRomanPSMT"/>
-        </w:rPr>
-        <w:t xml:space="preserve">{% for image in </w:t>
-      </w:r>
-      <w:r>
-        <w:rPr>
-          <w:rFonts w:ascii="TimesNewRomanPSMT" w:hAnsi="TimesNewRomanPSMT" w:cs="TimesNewRomanPSMT"/>
-        </w:rPr>
-        <w:t>edd_</w:t>
-      </w:r>
-      <w:r>
-        <w:rPr>
-          <w:rFonts w:ascii="TimesNewRomanPSMT" w:hAnsi="TimesNewRomanPSMT" w:cs="TimesNewRomanPSMT"/>
-        </w:rPr>
-        <w:t>classique</w:t>
-      </w:r>
-      <w:r>
-        <w:rPr>
-          <w:rFonts w:ascii="TimesNewRomanPSMT" w:hAnsi="TimesNewRomanPSMT" w:cs="TimesNewRomanPSMT"/>
-        </w:rPr>
-        <w:t>_images %}</w:t>
-      </w:r>
-    </w:p>
-    <w:p>
-      <w:pPr>
-        <w:jc w:val="both"/>
-        <w:rPr>
-          <w:rFonts w:ascii="TimesNewRomanPSMT" w:hAnsi="TimesNewRomanPSMT" w:cs="TimesNewRomanPSMT"/>
-        </w:rPr>
-      </w:pPr>
-      <w:r>
-        <w:rPr>
-          <w:rFonts w:ascii="TimesNewRomanPSMT" w:hAnsi="TimesNewRomanPSMT" w:cs="TimesNewRomanPSMT"/>
+          <w:lang w:val="en-US"/>
+        </w:rPr>
+      </w:pPr>
+      <w:r>
+        <w:rPr>
+          <w:rFonts w:ascii="TimesNewRomanPSMT" w:hAnsi="TimesNewRomanPSMT" w:cs="TimesNewRomanPSMT"/>
+          <w:lang w:val="en-US"/>
+        </w:rPr>
+        <w:t xml:space="preserve">{% endif </w:t>
+      </w:r>
+      <w:proofErr w:type="gramStart"/>
+      <w:r>
+        <w:rPr>
+          <w:rFonts w:ascii="TimesNewRomanPSMT" w:hAnsi="TimesNewRomanPSMT" w:cs="TimesNewRomanPSMT"/>
+          <w:lang w:val="en-US"/>
+        </w:rPr>
+        <w:t>%}{</w:t>
+      </w:r>
+      <w:proofErr w:type="gramEnd"/>
+      <w:r>
+        <w:rPr>
+          <w:rFonts w:ascii="TimesNewRomanPSMT" w:hAnsi="TimesNewRomanPSMT" w:cs="TimesNewRomanPSMT"/>
+          <w:lang w:val="en-US"/>
+        </w:rPr>
+        <w:t>% if lot.edd_classique_text()|len %}</w:t>
+      </w:r>
+    </w:p>
+    <w:p>
+      <w:pPr>
+        <w:jc w:val="both"/>
+        <w:rPr>
+          <w:rFonts w:ascii="TimesNewRomanPSMT" w:hAnsi="TimesNewRomanPSMT" w:cs="TimesNewRomanPSMT"/>
+          <w:lang w:val="en-US"/>
+        </w:rPr>
+      </w:pPr>
+      <w:r>
+        <w:rPr>
+          <w:rFonts w:ascii="TimesNewRomanPSMT" w:hAnsi="TimesNewRomanPSMT" w:cs="TimesNewRomanPSMT"/>
+          <w:lang w:val="en-US"/>
+        </w:rPr>
+        <w:t>{{ lot.edd_classique_text() }}</w:t>
+      </w:r>
+    </w:p>
+    <w:p>
+      <w:pPr>
+        <w:jc w:val="both"/>
+        <w:rPr>
+          <w:rFonts w:ascii="TimesNewRomanPSMT" w:hAnsi="TimesNewRomanPSMT" w:cs="TimesNewRomanPSMT"/>
+          <w:lang w:val="en-US"/>
+        </w:rPr>
+      </w:pPr>
+      <w:r>
+        <w:rPr>
+          <w:rFonts w:ascii="TimesNewRomanPSMT" w:hAnsi="TimesNewRomanPSMT" w:cs="TimesNewRomanPSMT"/>
+          <w:lang w:val="en-US"/>
+        </w:rPr>
+        <w:t>{% endif %}{% for image in edd_classique_images %}</w:t>
+      </w:r>
+    </w:p>
+    <w:p>
+      <w:pPr>
+        <w:jc w:val="both"/>
+        <w:rPr>
+          <w:rFonts w:ascii="TimesNewRomanPSMT" w:hAnsi="TimesNewRomanPSMT" w:cs="TimesNewRomanPSMT"/>
+          <w:lang w:val="en-US"/>
+        </w:rPr>
+      </w:pPr>
+      <w:r>
+        <w:rPr>
+          <w:rFonts w:ascii="TimesNewRomanPSMT" w:hAnsi="TimesNewRomanPSMT" w:cs="TimesNewRomanPSMT"/>
+          <w:lang w:val="en-US"/>
         </w:rPr>
         <w:t>{{image}}</w:t>
       </w:r>
@@ -5303,155 +5407,72 @@
         <w:jc w:val="both"/>
         <w:rPr>
           <w:rFonts w:ascii="TimesNewRomanPSMT" w:hAnsi="TimesNewRomanPSMT" w:cs="TimesNewRomanPSMT"/>
-        </w:rPr>
-      </w:pPr>
-      <w:r>
-        <w:rPr>
-          <w:rFonts w:ascii="TimesNewRomanPSMT" w:hAnsi="TimesNewRomanPSMT" w:cs="TimesNewRomanPSMT"/>
-        </w:rPr>
-        <w:t>{% endfor %}</w:t>
-      </w:r>
-      <w:r>
-        <w:rPr>
-          <w:rFonts w:ascii="TimesNewRomanPSMT" w:hAnsi="TimesNewRomanPSMT" w:cs="TimesNewRomanPSMT"/>
-        </w:rPr>
-        <w:t xml:space="preserve">{% if </w:t>
-      </w:r>
-      <w:r>
-        <w:rPr>
-          <w:rFonts w:ascii="TimesNewRomanPSMT" w:hAnsi="TimesNewRomanPSMT" w:cs="TimesNewRomanPSMT"/>
-        </w:rPr>
-        <w:t>programme</w:t>
-      </w:r>
-      <w:r>
-        <w:rPr>
-          <w:rFonts w:ascii="TimesNewRomanPSMT" w:hAnsi="TimesNewRomanPSMT" w:cs="TimesNewRomanPSMT"/>
-        </w:rPr>
-        <w:t>.</w:t>
-      </w:r>
-      <w:r>
-        <w:rPr>
-          <w:rFonts w:ascii="TimesNewRomanPSMT" w:hAnsi="TimesNewRomanPSMT" w:cs="TimesNewRomanPSMT"/>
-        </w:rPr>
-        <w:t>mention_publication</w:t>
-      </w:r>
-      <w:r>
-        <w:rPr>
-          <w:rFonts w:ascii="TimesNewRomanPSMT" w:hAnsi="TimesNewRomanPSMT" w:cs="TimesNewRomanPSMT"/>
-        </w:rPr>
-        <w:t>_</w:t>
-      </w:r>
-      <w:r>
-        <w:rPr>
-          <w:rFonts w:ascii="TimesNewRomanPSMT" w:hAnsi="TimesNewRomanPSMT" w:cs="TimesNewRomanPSMT"/>
-        </w:rPr>
-        <w:t>edd_</w:t>
-      </w:r>
-      <w:r>
-        <w:rPr>
-          <w:rFonts w:ascii="TimesNewRomanPSMT" w:hAnsi="TimesNewRomanPSMT" w:cs="TimesNewRomanPSMT"/>
-        </w:rPr>
-        <w:t>classique</w:t>
-      </w:r>
-      <w:r>
-        <w:rPr>
-          <w:rFonts w:ascii="TimesNewRomanPSMT" w:hAnsi="TimesNewRomanPSMT" w:cs="TimesNewRomanPSMT"/>
-        </w:rPr>
-        <w:t xml:space="preserve"> %}</w:t>
-      </w:r>
-    </w:p>
-    <w:p>
-      <w:pPr>
-        <w:jc w:val="both"/>
-        <w:rPr>
-          <w:rFonts w:ascii="TimesNewRomanPSMT" w:hAnsi="TimesNewRomanPSMT" w:cs="TimesNewRomanPSMT"/>
-        </w:rPr>
-      </w:pPr>
-      <w:r>
-        <w:rPr>
-          <w:rFonts w:ascii="TimesNewRomanPSMT" w:hAnsi="TimesNewRomanPSMT" w:cs="TimesNewRomanPSMT"/>
-        </w:rPr>
-        <w:t xml:space="preserve">{{ </w:t>
-      </w:r>
-      <w:r>
-        <w:rPr>
-          <w:rFonts w:ascii="TimesNewRomanPSMT" w:hAnsi="TimesNewRomanPSMT" w:cs="TimesNewRomanPSMT"/>
-        </w:rPr>
-        <w:t>programme</w:t>
-      </w:r>
-      <w:r>
-        <w:rPr>
-          <w:rFonts w:ascii="TimesNewRomanPSMT" w:hAnsi="TimesNewRomanPSMT" w:cs="TimesNewRomanPSMT"/>
-        </w:rPr>
-        <w:t>.</w:t>
-      </w:r>
-      <w:r>
-        <w:rPr>
-          <w:rFonts w:ascii="TimesNewRomanPSMT" w:hAnsi="TimesNewRomanPSMT" w:cs="TimesNewRomanPSMT"/>
-        </w:rPr>
-        <w:t>mention_publication</w:t>
-      </w:r>
-      <w:r>
-        <w:rPr>
-          <w:rFonts w:ascii="TimesNewRomanPSMT" w:hAnsi="TimesNewRomanPSMT" w:cs="TimesNewRomanPSMT"/>
-        </w:rPr>
-        <w:t>_</w:t>
-      </w:r>
-      <w:r>
-        <w:rPr>
-          <w:rFonts w:ascii="TimesNewRomanPSMT" w:hAnsi="TimesNewRomanPSMT" w:cs="TimesNewRomanPSMT"/>
-        </w:rPr>
-        <w:t>edd_</w:t>
-      </w:r>
-      <w:r>
-        <w:rPr>
-          <w:rFonts w:ascii="TimesNewRomanPSMT" w:hAnsi="TimesNewRomanPSMT" w:cs="TimesNewRomanPSMT"/>
-        </w:rPr>
-        <w:t>classique</w:t>
-      </w:r>
-      <w:r>
-        <w:rPr>
-          <w:rFonts w:ascii="TimesNewRomanPSMT" w:hAnsi="TimesNewRomanPSMT" w:cs="TimesNewRomanPSMT"/>
-        </w:rPr>
-        <w:t xml:space="preserve"> </w:t>
-      </w:r>
-      <w:r>
-        <w:rPr>
-          <w:rFonts w:ascii="TimesNewRomanPSMT" w:hAnsi="TimesNewRomanPSMT" w:cs="TimesNewRomanPSMT"/>
-        </w:rPr>
-        <w:t>}}</w:t>
-      </w:r>
-    </w:p>
-    <w:p>
-      <w:pPr>
-        <w:jc w:val="both"/>
-        <w:rPr>
-          <w:rFonts w:ascii="TimesNewRomanPSMT" w:hAnsi="TimesNewRomanPSMT" w:cs="TimesNewRomanPSMT"/>
-        </w:rPr>
-      </w:pPr>
-      <w:r>
-        <w:rPr>
-          <w:rFonts w:ascii="TimesNewRomanPSMT" w:hAnsi="TimesNewRomanPSMT" w:cs="TimesNewRomanPSMT"/>
-        </w:rPr>
-        <w:t>{% endif %}</w:t>
-      </w:r>
-      <w:r>
-        <w:rPr>
-          <w:rFonts w:ascii="TimesNewRomanPSMT" w:hAnsi="TimesNewRomanPSMT" w:cs="TimesNewRomanPSMT"/>
-        </w:rPr>
-        <w:t>{% if logement_edds</w:t>
-      </w:r>
-      <w:r>
-        <w:rPr>
-          <w:rFonts w:ascii="TimesNewRomanPSMT" w:hAnsi="TimesNewRomanPSMT" w:cs="TimesNewRomanPSMT"/>
-        </w:rPr>
-        <w:t>|len</w:t>
-      </w:r>
-      <w:r>
-        <w:rPr>
-          <w:rFonts w:ascii="TimesNewRomanPSMT" w:hAnsi="TimesNewRomanPSMT" w:cs="TimesNewRomanPSMT"/>
-        </w:rPr>
-        <w:t xml:space="preserve"> %}</w:t>
+          <w:lang w:val="en-US"/>
+        </w:rPr>
+      </w:pPr>
+      <w:r>
+        <w:rPr>
+          <w:rFonts w:ascii="TimesNewRomanPSMT" w:hAnsi="TimesNewRomanPSMT" w:cs="TimesNewRomanPSMT"/>
+          <w:lang w:val="en-US"/>
+        </w:rPr>
+        <w:t>{% endfor %}{% if programme.mention_publication_edd_classique %}</w:t>
+      </w:r>
+    </w:p>
+    <w:p>
+      <w:pPr>
+        <w:jc w:val="both"/>
+        <w:rPr>
+          <w:rFonts w:ascii="TimesNewRomanPSMT" w:hAnsi="TimesNewRomanPSMT" w:cs="TimesNewRomanPSMT"/>
+          <w:lang w:val="en-US"/>
+        </w:rPr>
+      </w:pPr>
+      <w:proofErr w:type="gramStart"/>
+      <w:r>
+        <w:rPr>
+          <w:rFonts w:ascii="TimesNewRomanPSMT" w:hAnsi="TimesNewRomanPSMT" w:cs="TimesNewRomanPSMT"/>
+          <w:lang w:val="en-US"/>
+        </w:rPr>
+        <w:t>{{ programme</w:t>
+      </w:r>
+      <w:proofErr w:type="gramEnd"/>
+      <w:r>
+        <w:rPr>
+          <w:rFonts w:ascii="TimesNewRomanPSMT" w:hAnsi="TimesNewRomanPSMT" w:cs="TimesNewRomanPSMT"/>
+          <w:lang w:val="en-US"/>
+        </w:rPr>
+        <w:t>.mention_publication_edd_classique }}</w:t>
+      </w:r>
+    </w:p>
+    <w:p>
+      <w:pPr>
+        <w:jc w:val="both"/>
+        <w:rPr>
+          <w:rFonts w:ascii="TimesNewRomanPSMT" w:hAnsi="TimesNewRomanPSMT" w:cs="TimesNewRomanPSMT"/>
+          <w:lang w:val="en-US"/>
+        </w:rPr>
+      </w:pPr>
+      <w:r>
+        <w:rPr>
+          <w:rFonts w:ascii="TimesNewRomanPSMT" w:hAnsi="TimesNewRomanPSMT" w:cs="TimesNewRomanPSMT"/>
+          <w:lang w:val="en-US"/>
+        </w:rPr>
+        <w:t xml:space="preserve">{% endif </w:t>
+      </w:r>
+      <w:proofErr w:type="gramStart"/>
+      <w:r>
+        <w:rPr>
+          <w:rFonts w:ascii="TimesNewRomanPSMT" w:hAnsi="TimesNewRomanPSMT" w:cs="TimesNewRomanPSMT"/>
+          <w:lang w:val="en-US"/>
+        </w:rPr>
+        <w:t>%}{</w:t>
+      </w:r>
+      <w:proofErr w:type="gramEnd"/>
+      <w:r>
+        <w:rPr>
+          <w:rFonts w:ascii="TimesNewRomanPSMT" w:hAnsi="TimesNewRomanPSMT" w:cs="TimesNewRomanPSMT"/>
+          <w:lang w:val="en-US"/>
+        </w:rPr>
+        <w:t>% if logement_edds|len %}</w:t>
       </w:r>
     </w:p>
     <w:p>
@@ -5484,6 +5505,7 @@
           <w:b/>
         </w:rPr>
       </w:pPr>
+      <w:proofErr w:type="gramStart"/>
       <w:r>
         <w:rPr>
           <w:b/>
@@ -5491,7 +5513,17 @@
           <w:szCs w:val="22"/>
           <w:lang w:eastAsia="fr-FR"/>
         </w:rPr>
-        <w:t>division simplifié afin de désigner les parties objet du conventionnement :</w:t>
+        <w:t>division</w:t>
+      </w:r>
+      <w:proofErr w:type="gramEnd"/>
+      <w:r>
+        <w:rPr>
+          <w:b/>
+          <w:sz w:val="22"/>
+          <w:szCs w:val="22"/>
+          <w:lang w:eastAsia="fr-FR"/>
+        </w:rPr>
+        <w:t xml:space="preserve"> simplifié afin de désigner les parties objet du conventionnement :</w:t>
       </w:r>
     </w:p>
     <w:p>
@@ -5506,7 +5538,7 @@
     </w:p>
     <w:tbl>
       <w:tblPr>
-        <w:tblStyle w:val="Grilledutableau"/>
+        <w:tblStyle w:val="TableGrid"/>
         <w:tblW w:w="0" w:type="auto"/>
         <w:tblLook w:val="04A0" w:firstRow="1" w:lastRow="0" w:firstColumn="1" w:lastColumn="0" w:noHBand="0" w:noVBand="1"/>
       </w:tblPr>
@@ -5609,7 +5641,6 @@
                 <w:bCs/>
                 <w:sz w:val="16"/>
                 <w:szCs w:val="16"/>
-                <w:lang w:val="en-US"/>
               </w:rPr>
             </w:pPr>
             <w:r>
@@ -5618,19 +5649,8 @@
                 <w:bCs/>
                 <w:sz w:val="16"/>
                 <w:szCs w:val="16"/>
-                <w:lang w:val="en-US"/>
-              </w:rPr>
-              <w:t>N</w:t>
-            </w:r>
-            <w:r>
-              <w:rPr>
-                <w:b/>
-                <w:bCs/>
-                <w:sz w:val="16"/>
-                <w:szCs w:val="16"/>
-                <w:lang w:val="en-US"/>
-              </w:rPr>
-              <w:t xml:space="preserve">uméro de lot des logements </w:t>
+              </w:rPr>
+              <w:t xml:space="preserve">Numéro de lot des logements </w:t>
             </w:r>
           </w:p>
           <w:p>
@@ -5640,16 +5660,30 @@
                 <w:bCs/>
                 <w:sz w:val="16"/>
                 <w:szCs w:val="16"/>
-                <w:lang w:val="en-US"/>
               </w:rPr>
             </w:pPr>
             <w:r>
               <w:rPr>
                 <w:sz w:val="16"/>
                 <w:szCs w:val="16"/>
-                <w:lang w:val="en-US"/>
-              </w:rPr>
-              <w:t>(tel que inscrit dans les actes de vente/propriété…)</w:t>
+              </w:rPr>
+              <w:t>(</w:t>
+            </w:r>
+            <w:proofErr w:type="gramStart"/>
+            <w:r>
+              <w:rPr>
+                <w:sz w:val="16"/>
+                <w:szCs w:val="16"/>
+              </w:rPr>
+              <w:t>tel</w:t>
+            </w:r>
+            <w:proofErr w:type="gramEnd"/>
+            <w:r>
+              <w:rPr>
+                <w:sz w:val="16"/>
+                <w:szCs w:val="16"/>
+              </w:rPr>
+              <w:t xml:space="preserve"> que inscrit dans les actes de vente/propriété…)</w:t>
             </w:r>
           </w:p>
         </w:tc>
@@ -5719,13 +5753,23 @@
                 <w:lang w:val="en-US"/>
               </w:rPr>
             </w:pPr>
-            <w:r>
-              <w:rPr>
-                <w:sz w:val="16"/>
-                <w:szCs w:val="16"/>
-                <w:lang w:val="en-US"/>
-              </w:rPr>
-              <w:t>{{ i.financement }}</w:t>
+            <w:proofErr w:type="gramStart"/>
+            <w:r>
+              <w:rPr>
+                <w:sz w:val="16"/>
+                <w:szCs w:val="16"/>
+                <w:lang w:val="en-US"/>
+              </w:rPr>
+              <w:t>{{ i</w:t>
+            </w:r>
+            <w:proofErr w:type="gramEnd"/>
+            <w:r>
+              <w:rPr>
+                <w:sz w:val="16"/>
+                <w:szCs w:val="16"/>
+                <w:lang w:val="en-US"/>
+              </w:rPr>
+              <w:t>.financement }}</w:t>
             </w:r>
           </w:p>
         </w:tc>
@@ -5742,13 +5786,23 @@
                 <w:lang w:val="en-US"/>
               </w:rPr>
             </w:pPr>
-            <w:r>
-              <w:rPr>
-                <w:sz w:val="16"/>
-                <w:szCs w:val="16"/>
-                <w:lang w:val="en-US"/>
-              </w:rPr>
-              <w:t>{{ i.designation }}</w:t>
+            <w:proofErr w:type="gramStart"/>
+            <w:r>
+              <w:rPr>
+                <w:sz w:val="16"/>
+                <w:szCs w:val="16"/>
+                <w:lang w:val="en-US"/>
+              </w:rPr>
+              <w:t>{{ i</w:t>
+            </w:r>
+            <w:proofErr w:type="gramEnd"/>
+            <w:r>
+              <w:rPr>
+                <w:sz w:val="16"/>
+                <w:szCs w:val="16"/>
+                <w:lang w:val="en-US"/>
+              </w:rPr>
+              <w:t>.designation }}</w:t>
             </w:r>
           </w:p>
         </w:tc>
@@ -5766,14 +5820,25 @@
                 <w:lang w:val="en-US"/>
               </w:rPr>
             </w:pPr>
-            <w:r>
-              <w:rPr>
-                <w:rFonts w:ascii="TimesNewRomanPSMT" w:hAnsi="TimesNewRomanPSMT" w:cs="TimesNewRomanPSMT"/>
-                <w:sz w:val="16"/>
-                <w:szCs w:val="16"/>
-                <w:lang w:val="en-US"/>
-              </w:rPr>
-              <w:t>{{ i.numero_lot}}</w:t>
+            <w:proofErr w:type="gramStart"/>
+            <w:r>
+              <w:rPr>
+                <w:rFonts w:ascii="TimesNewRomanPSMT" w:hAnsi="TimesNewRomanPSMT" w:cs="TimesNewRomanPSMT"/>
+                <w:sz w:val="16"/>
+                <w:szCs w:val="16"/>
+                <w:lang w:val="en-US"/>
+              </w:rPr>
+              <w:t>{{ i</w:t>
+            </w:r>
+            <w:proofErr w:type="gramEnd"/>
+            <w:r>
+              <w:rPr>
+                <w:rFonts w:ascii="TimesNewRomanPSMT" w:hAnsi="TimesNewRomanPSMT" w:cs="TimesNewRomanPSMT"/>
+                <w:sz w:val="16"/>
+                <w:szCs w:val="16"/>
+                <w:lang w:val="en-US"/>
+              </w:rPr>
+              <w:t>.numero_lot}}</w:t>
             </w:r>
           </w:p>
         </w:tc>
@@ -5845,7 +5910,23 @@
           <w:rFonts w:ascii="TimesNewRomanPSMT" w:hAnsi="TimesNewRomanPSMT" w:cs="TimesNewRomanPSMT"/>
           <w:b/>
         </w:rPr>
-        <w:t xml:space="preserve"> {{ lot_num }}</w:t>
+        <w:t xml:space="preserve"> </w:t>
+      </w:r>
+      <w:proofErr w:type="gramStart"/>
+      <w:r>
+        <w:rPr>
+          <w:rFonts w:ascii="TimesNewRomanPSMT" w:hAnsi="TimesNewRomanPSMT" w:cs="TimesNewRomanPSMT"/>
+          <w:b/>
+        </w:rPr>
+        <w:t>{{ lot</w:t>
+      </w:r>
+      <w:proofErr w:type="gramEnd"/>
+      <w:r>
+        <w:rPr>
+          <w:rFonts w:ascii="TimesNewRomanPSMT" w:hAnsi="TimesNewRomanPSMT" w:cs="TimesNewRomanPSMT"/>
+          <w:b/>
+        </w:rPr>
+        <w:t>_num }}</w:t>
       </w:r>
     </w:p>
     <w:p>
@@ -5905,8 +5986,13 @@
       <w:bookmarkEnd w:id="35"/>
       <w:bookmarkEnd w:id="36"/>
       <w:bookmarkEnd w:id="37"/>
-      <w:r>
-        <w:t xml:space="preserve">{{ lot.nb_logements }} </w:t>
+      <w:proofErr w:type="gramStart"/>
+      <w:r>
+        <w:t>{{ lot</w:t>
+      </w:r>
+      <w:proofErr w:type="gramEnd"/>
+      <w:r>
+        <w:t xml:space="preserve">.nb_logements }} </w:t>
       </w:r>
       <w:r>
         <w:t>logement</w:t>
@@ -6049,7 +6135,7 @@
     </w:p>
     <w:tbl>
       <w:tblPr>
-        <w:tblStyle w:val="Grilledutableau"/>
+        <w:tblStyle w:val="TableGrid"/>
         <w:tblW w:w="0" w:type="auto"/>
         <w:tblLook w:val="04A0" w:firstRow="1" w:lastRow="0" w:firstColumn="1" w:lastColumn="0" w:noHBand="0" w:noVBand="1"/>
       </w:tblPr>
@@ -6132,7 +6218,25 @@
                 <w:szCs w:val="16"/>
                 <w:lang w:val="en-US"/>
               </w:rPr>
-              <w:t>{%tr for k,v in nb_logements_par_type.items() %}</w:t>
+              <w:t xml:space="preserve">{%tr for </w:t>
+            </w:r>
+            <w:proofErr w:type="gramStart"/>
+            <w:r>
+              <w:rPr>
+                <w:sz w:val="16"/>
+                <w:szCs w:val="16"/>
+                <w:lang w:val="en-US"/>
+              </w:rPr>
+              <w:t>k,v</w:t>
+            </w:r>
+            <w:proofErr w:type="gramEnd"/>
+            <w:r>
+              <w:rPr>
+                <w:sz w:val="16"/>
+                <w:szCs w:val="16"/>
+                <w:lang w:val="en-US"/>
+              </w:rPr>
+              <w:t xml:space="preserve"> in nb_logements_par_type.items() %}</w:t>
             </w:r>
           </w:p>
         </w:tc>
@@ -6263,6 +6367,7 @@
       </w:r>
       <w:bookmarkStart w:id="39" w:name="Mix30111"/>
       <w:bookmarkEnd w:id="39"/>
+      <w:proofErr w:type="gramStart"/>
       <w:r>
         <w:rPr>
           <w:rFonts w:ascii="TimesNewRomanPSMT" w:hAnsi="TimesNewRomanPSMT" w:cs="TimesNewRomanPSMT"/>
@@ -6275,7 +6380,15 @@
           <w:rFonts w:ascii="TimesNewRomanPSMT" w:hAnsi="TimesNewRomanPSMT" w:cs="TimesNewRomanPSMT"/>
           <w:b/>
         </w:rPr>
-        <w:t>mixPLUS_30pc</w:t>
+        <w:t>mixPLUS</w:t>
+      </w:r>
+      <w:proofErr w:type="gramEnd"/>
+      <w:r>
+        <w:rPr>
+          <w:rFonts w:ascii="TimesNewRomanPSMT" w:hAnsi="TimesNewRomanPSMT" w:cs="TimesNewRomanPSMT"/>
+          <w:b/>
+        </w:rPr>
+        <w:t>_30pc</w:t>
       </w:r>
       <w:r>
         <w:rPr>
@@ -6386,6 +6499,7 @@
       </w:r>
       <w:bookmarkStart w:id="41" w:name="Mix1092"/>
       <w:bookmarkEnd w:id="41"/>
+      <w:proofErr w:type="gramStart"/>
       <w:r>
         <w:rPr>
           <w:rFonts w:ascii="TimesNewRomanPSMT" w:hAnsi="TimesNewRomanPSMT" w:cs="TimesNewRomanPSMT"/>
@@ -6402,6 +6516,7 @@
         </w:rPr>
         <w:t>xPLUS</w:t>
       </w:r>
+      <w:proofErr w:type="gramEnd"/>
       <w:r>
         <w:rPr>
           <w:rFonts w:ascii="TimesNewRomanPSMT" w:hAnsi="TimesNewRomanPSMT" w:cs="TimesNewRomanPSMT"/>
@@ -6431,11 +6546,19 @@
       </w:r>
       <w:bookmarkStart w:id="42" w:name="SH"/>
       <w:bookmarkEnd w:id="42"/>
-      <w:r>
-        <w:rPr>
-          <w:rFonts w:ascii="TimesNewRomanPSMT" w:hAnsi="TimesNewRomanPSMT" w:cs="TimesNewRomanPSMT"/>
-        </w:rPr>
-        <w:t>{{ sh_totale|f }} m</w:t>
+      <w:proofErr w:type="gramStart"/>
+      <w:r>
+        <w:rPr>
+          <w:rFonts w:ascii="TimesNewRomanPSMT" w:hAnsi="TimesNewRomanPSMT" w:cs="TimesNewRomanPSMT"/>
+        </w:rPr>
+        <w:t>{{ sh</w:t>
+      </w:r>
+      <w:proofErr w:type="gramEnd"/>
+      <w:r>
+        <w:rPr>
+          <w:rFonts w:ascii="TimesNewRomanPSMT" w:hAnsi="TimesNewRomanPSMT" w:cs="TimesNewRomanPSMT"/>
+        </w:rPr>
+        <w:t>_totale|f }} m</w:t>
       </w:r>
       <w:r>
         <w:rPr>
@@ -6464,11 +6587,19 @@
       </w:r>
       <w:bookmarkStart w:id="43" w:name="SA"/>
       <w:bookmarkEnd w:id="43"/>
-      <w:r>
-        <w:rPr>
-          <w:rFonts w:ascii="TimesNewRomanPSMT" w:hAnsi="TimesNewRomanPSMT" w:cs="TimesNewRomanPSMT"/>
-        </w:rPr>
-        <w:t>{{ sar_totale|f }} m</w:t>
+      <w:proofErr w:type="gramStart"/>
+      <w:r>
+        <w:rPr>
+          <w:rFonts w:ascii="TimesNewRomanPSMT" w:hAnsi="TimesNewRomanPSMT" w:cs="TimesNewRomanPSMT"/>
+        </w:rPr>
+        <w:t>{{ sar</w:t>
+      </w:r>
+      <w:proofErr w:type="gramEnd"/>
+      <w:r>
+        <w:rPr>
+          <w:rFonts w:ascii="TimesNewRomanPSMT" w:hAnsi="TimesNewRomanPSMT" w:cs="TimesNewRomanPSMT"/>
+        </w:rPr>
+        <w:t>_totale|f }} m</w:t>
       </w:r>
       <w:r>
         <w:rPr>
@@ -6515,7 +6646,25 @@
           <w:sz w:val="16"/>
           <w:szCs w:val="16"/>
         </w:rPr>
-        <w:t>{% if lot.annexe_caves %}</w:t>
+        <w:t xml:space="preserve">{% if </w:t>
+      </w:r>
+      <w:proofErr w:type="gramStart"/>
+      <w:r>
+        <w:rPr>
+          <w:rFonts w:ascii="TimesNewRomanPSMT" w:hAnsi="TimesNewRomanPSMT" w:cs="TimesNewRomanPSMT"/>
+          <w:sz w:val="16"/>
+          <w:szCs w:val="16"/>
+        </w:rPr>
+        <w:t>lot.annexe</w:t>
+      </w:r>
+      <w:proofErr w:type="gramEnd"/>
+      <w:r>
+        <w:rPr>
+          <w:rFonts w:ascii="TimesNewRomanPSMT" w:hAnsi="TimesNewRomanPSMT" w:cs="TimesNewRomanPSMT"/>
+          <w:sz w:val="16"/>
+          <w:szCs w:val="16"/>
+        </w:rPr>
+        <w:t>_caves %}</w:t>
       </w:r>
     </w:p>
     <w:p>
@@ -6667,7 +6816,25 @@
           <w:sz w:val="16"/>
           <w:szCs w:val="16"/>
         </w:rPr>
-        <w:t xml:space="preserve"> if lot.annexe_soussols %}</w:t>
+        <w:t xml:space="preserve"> if </w:t>
+      </w:r>
+      <w:proofErr w:type="gramStart"/>
+      <w:r>
+        <w:rPr>
+          <w:rFonts w:ascii="TimesNewRomanPSMT" w:hAnsi="TimesNewRomanPSMT" w:cs="TimesNewRomanPSMT"/>
+          <w:sz w:val="16"/>
+          <w:szCs w:val="16"/>
+        </w:rPr>
+        <w:t>lot.annexe</w:t>
+      </w:r>
+      <w:proofErr w:type="gramEnd"/>
+      <w:r>
+        <w:rPr>
+          <w:rFonts w:ascii="TimesNewRomanPSMT" w:hAnsi="TimesNewRomanPSMT" w:cs="TimesNewRomanPSMT"/>
+          <w:sz w:val="16"/>
+          <w:szCs w:val="16"/>
+        </w:rPr>
+        <w:t>_soussols %}</w:t>
       </w:r>
     </w:p>
     <w:p>
@@ -6756,13 +6923,15 @@
         <w:jc w:val="both"/>
         <w:rPr>
           <w:rFonts w:ascii="TimesNewRomanPSMT" w:hAnsi="TimesNewRomanPSMT" w:cs="TimesNewRomanPSMT"/>
-        </w:rPr>
-      </w:pPr>
-      <w:r>
-        <w:rPr>
-          <w:rFonts w:ascii="TimesNewRomanPSMT" w:hAnsi="TimesNewRomanPSMT" w:cs="TimesNewRomanPSMT"/>
-          <w:sz w:val="16"/>
-          <w:szCs w:val="16"/>
+          <w:lang w:val="en-US"/>
+        </w:rPr>
+      </w:pPr>
+      <w:r>
+        <w:rPr>
+          <w:rFonts w:ascii="TimesNewRomanPSMT" w:hAnsi="TimesNewRomanPSMT" w:cs="TimesNewRomanPSMT"/>
+          <w:sz w:val="16"/>
+          <w:szCs w:val="16"/>
+          <w:lang w:val="en-US"/>
         </w:rPr>
         <w:t>{%</w:t>
       </w:r>
@@ -6780,6 +6949,7 @@
           <w:rFonts w:ascii="TimesNewRomanPSMT" w:hAnsi="TimesNewRomanPSMT" w:cs="TimesNewRomanPSMT"/>
           <w:sz w:val="16"/>
           <w:szCs w:val="16"/>
+          <w:lang w:val="en-US"/>
         </w:rPr>
         <w:t xml:space="preserve"> endif %} </w:t>
       </w:r>
@@ -6792,13 +6962,15 @@
           <w:rFonts w:ascii="TimesNewRomanPSMT" w:hAnsi="TimesNewRomanPSMT" w:cs="TimesNewRomanPSMT"/>
           <w:sz w:val="16"/>
           <w:szCs w:val="16"/>
-        </w:rPr>
-      </w:pPr>
-      <w:r>
-        <w:rPr>
-          <w:rFonts w:ascii="TimesNewRomanPSMT" w:hAnsi="TimesNewRomanPSMT" w:cs="TimesNewRomanPSMT"/>
-          <w:sz w:val="16"/>
-          <w:szCs w:val="16"/>
+          <w:lang w:val="en-US"/>
+        </w:rPr>
+      </w:pPr>
+      <w:r>
+        <w:rPr>
+          <w:rFonts w:ascii="TimesNewRomanPSMT" w:hAnsi="TimesNewRomanPSMT" w:cs="TimesNewRomanPSMT"/>
+          <w:sz w:val="16"/>
+          <w:szCs w:val="16"/>
+          <w:lang w:val="en-US"/>
         </w:rPr>
         <w:t>{%</w:t>
       </w:r>
@@ -6816,16 +6988,37 @@
           <w:rFonts w:ascii="TimesNewRomanPSMT" w:hAnsi="TimesNewRomanPSMT" w:cs="TimesNewRomanPSMT"/>
           <w:sz w:val="16"/>
           <w:szCs w:val="16"/>
-        </w:rPr>
-        <w:t xml:space="preserve"> if lot.annexe_</w:t>
-      </w:r>
-      <w:r>
-        <w:rPr>
-          <w:rFonts w:ascii="TimesNewRomanPSMT" w:hAnsi="TimesNewRomanPSMT" w:cs="TimesNewRomanPSMT"/>
-          <w:sz w:val="16"/>
-          <w:szCs w:val="16"/>
           <w:lang w:val="en-US"/>
         </w:rPr>
+        <w:t xml:space="preserve"> if </w:t>
+      </w:r>
+      <w:proofErr w:type="gramStart"/>
+      <w:r>
+        <w:rPr>
+          <w:rFonts w:ascii="TimesNewRomanPSMT" w:hAnsi="TimesNewRomanPSMT" w:cs="TimesNewRomanPSMT"/>
+          <w:sz w:val="16"/>
+          <w:szCs w:val="16"/>
+          <w:lang w:val="en-US"/>
+        </w:rPr>
+        <w:t>lot.annexe</w:t>
+      </w:r>
+      <w:proofErr w:type="gramEnd"/>
+      <w:r>
+        <w:rPr>
+          <w:rFonts w:ascii="TimesNewRomanPSMT" w:hAnsi="TimesNewRomanPSMT" w:cs="TimesNewRomanPSMT"/>
+          <w:sz w:val="16"/>
+          <w:szCs w:val="16"/>
+          <w:lang w:val="en-US"/>
+        </w:rPr>
+        <w:t>_</w:t>
+      </w:r>
+      <w:r>
+        <w:rPr>
+          <w:rFonts w:ascii="TimesNewRomanPSMT" w:hAnsi="TimesNewRomanPSMT" w:cs="TimesNewRomanPSMT"/>
+          <w:sz w:val="16"/>
+          <w:szCs w:val="16"/>
+          <w:lang w:val="en-US"/>
+        </w:rPr>
         <w:t>remises</w:t>
       </w:r>
       <w:r>
@@ -6833,6 +7026,7 @@
           <w:rFonts w:ascii="TimesNewRomanPSMT" w:hAnsi="TimesNewRomanPSMT" w:cs="TimesNewRomanPSMT"/>
           <w:sz w:val="16"/>
           <w:szCs w:val="16"/>
+          <w:lang w:val="en-US"/>
         </w:rPr>
         <w:t xml:space="preserve"> %}</w:t>
       </w:r>
@@ -6869,6 +7063,7 @@
           <w:rFonts w:ascii="TimesNewRomanPSMT" w:hAnsi="TimesNewRomanPSMT" w:cs="TimesNewRomanPSMT"/>
           <w:sz w:val="16"/>
           <w:szCs w:val="16"/>
+          <w:lang w:val="en-US"/>
         </w:rPr>
         <w:instrText xml:space="preserve"> FORMCHECKBOX </w:instrText>
       </w:r>
@@ -6900,6 +7095,7 @@
           <w:rFonts w:ascii="TimesNewRomanPSMT" w:hAnsi="TimesNewRomanPSMT" w:cs="TimesNewRomanPSMT"/>
           <w:sz w:val="16"/>
           <w:szCs w:val="16"/>
+          <w:lang w:val="en-US"/>
         </w:rPr>
         <w:t xml:space="preserve"> </w:t>
       </w:r>
@@ -6917,13 +7113,15 @@
         <w:jc w:val="both"/>
         <w:rPr>
           <w:rFonts w:ascii="TimesNewRomanPSMT" w:hAnsi="TimesNewRomanPSMT" w:cs="TimesNewRomanPSMT"/>
-        </w:rPr>
-      </w:pPr>
-      <w:r>
-        <w:rPr>
-          <w:rFonts w:ascii="TimesNewRomanPSMT" w:hAnsi="TimesNewRomanPSMT" w:cs="TimesNewRomanPSMT"/>
-          <w:sz w:val="16"/>
-          <w:szCs w:val="16"/>
+          <w:lang w:val="en-US"/>
+        </w:rPr>
+      </w:pPr>
+      <w:r>
+        <w:rPr>
+          <w:rFonts w:ascii="TimesNewRomanPSMT" w:hAnsi="TimesNewRomanPSMT" w:cs="TimesNewRomanPSMT"/>
+          <w:sz w:val="16"/>
+          <w:szCs w:val="16"/>
+          <w:lang w:val="en-US"/>
         </w:rPr>
         <w:t>{%</w:t>
       </w:r>
@@ -6941,6 +7139,7 @@
           <w:rFonts w:ascii="TimesNewRomanPSMT" w:hAnsi="TimesNewRomanPSMT" w:cs="TimesNewRomanPSMT"/>
           <w:sz w:val="16"/>
           <w:szCs w:val="16"/>
+          <w:lang w:val="en-US"/>
         </w:rPr>
         <w:t xml:space="preserve"> endif %} </w:t>
       </w:r>
@@ -6953,47 +7152,17 @@
           <w:rFonts w:ascii="TimesNewRomanPSMT" w:hAnsi="TimesNewRomanPSMT" w:cs="TimesNewRomanPSMT"/>
           <w:sz w:val="16"/>
           <w:szCs w:val="16"/>
-        </w:rPr>
-      </w:pPr>
-      <w:r>
-        <w:rPr>
-          <w:rFonts w:ascii="TimesNewRomanPSMT" w:hAnsi="TimesNewRomanPSMT" w:cs="TimesNewRomanPSMT"/>
-          <w:sz w:val="16"/>
-          <w:szCs w:val="16"/>
-        </w:rPr>
-        <w:t>{%</w:t>
-      </w:r>
-      <w:r>
-        <w:rPr>
-          <w:rFonts w:ascii="TimesNewRomanPSMT" w:hAnsi="TimesNewRomanPSMT" w:cs="TimesNewRomanPSMT"/>
-          <w:sz w:val="16"/>
-          <w:szCs w:val="16"/>
-        </w:rPr>
-        <w:t>-</w:t>
-      </w:r>
-      <w:r>
-        <w:rPr>
-          <w:rFonts w:ascii="TimesNewRomanPSMT" w:hAnsi="TimesNewRomanPSMT" w:cs="TimesNewRomanPSMT"/>
-          <w:sz w:val="16"/>
-          <w:szCs w:val="16"/>
-        </w:rPr>
-        <w:t xml:space="preserve"> if lot.annexe_</w:t>
-      </w:r>
-      <w:r>
-        <w:rPr>
-          <w:rFonts w:ascii="TimesNewRomanPSMT" w:hAnsi="TimesNewRomanPSMT" w:cs="TimesNewRomanPSMT"/>
-          <w:sz w:val="16"/>
-          <w:szCs w:val="16"/>
-        </w:rPr>
-        <w:t>ateliers</w:t>
-      </w:r>
-      <w:r>
-        <w:rPr>
-          <w:rFonts w:ascii="TimesNewRomanPSMT" w:hAnsi="TimesNewRomanPSMT" w:cs="TimesNewRomanPSMT"/>
-          <w:sz w:val="16"/>
-          <w:szCs w:val="16"/>
-        </w:rPr>
-        <w:t xml:space="preserve"> %}</w:t>
+          <w:lang w:val="en-US"/>
+        </w:rPr>
+      </w:pPr>
+      <w:r>
+        <w:rPr>
+          <w:rFonts w:ascii="TimesNewRomanPSMT" w:hAnsi="TimesNewRomanPSMT" w:cs="TimesNewRomanPSMT"/>
+          <w:sz w:val="16"/>
+          <w:szCs w:val="16"/>
+          <w:lang w:val="en-US"/>
+        </w:rPr>
+        <w:t>{%- if lot.annexe_ateliers %}</w:t>
       </w:r>
     </w:p>
     <w:p>
@@ -7133,7 +7302,25 @@
           <w:sz w:val="16"/>
           <w:szCs w:val="16"/>
         </w:rPr>
-        <w:t xml:space="preserve"> if lot.annexe_</w:t>
+        <w:t xml:space="preserve"> if </w:t>
+      </w:r>
+      <w:proofErr w:type="gramStart"/>
+      <w:r>
+        <w:rPr>
+          <w:rFonts w:ascii="TimesNewRomanPSMT" w:hAnsi="TimesNewRomanPSMT" w:cs="TimesNewRomanPSMT"/>
+          <w:sz w:val="16"/>
+          <w:szCs w:val="16"/>
+        </w:rPr>
+        <w:t>lot.annexe</w:t>
+      </w:r>
+      <w:proofErr w:type="gramEnd"/>
+      <w:r>
+        <w:rPr>
+          <w:rFonts w:ascii="TimesNewRomanPSMT" w:hAnsi="TimesNewRomanPSMT" w:cs="TimesNewRomanPSMT"/>
+          <w:sz w:val="16"/>
+          <w:szCs w:val="16"/>
+        </w:rPr>
+        <w:t>_</w:t>
       </w:r>
       <w:r>
         <w:rPr>
@@ -7230,13 +7417,36 @@
         <w:jc w:val="both"/>
         <w:rPr>
           <w:rFonts w:ascii="TimesNewRomanPSMT" w:hAnsi="TimesNewRomanPSMT" w:cs="TimesNewRomanPSMT"/>
-        </w:rPr>
-      </w:pPr>
-      <w:r>
-        <w:rPr>
-          <w:rFonts w:ascii="TimesNewRomanPSMT" w:hAnsi="TimesNewRomanPSMT" w:cs="TimesNewRomanPSMT"/>
-          <w:sz w:val="16"/>
-          <w:szCs w:val="16"/>
+          <w:lang w:val="en-US"/>
+        </w:rPr>
+      </w:pPr>
+      <w:r>
+        <w:rPr>
+          <w:rFonts w:ascii="TimesNewRomanPSMT" w:hAnsi="TimesNewRomanPSMT" w:cs="TimesNewRomanPSMT"/>
+          <w:sz w:val="16"/>
+          <w:szCs w:val="16"/>
+          <w:lang w:val="en-US"/>
+        </w:rPr>
+        <w:t xml:space="preserve">{%- endif %} </w:t>
+      </w:r>
+    </w:p>
+    <w:p>
+      <w:pPr>
+        <w:ind w:firstLine="708"/>
+        <w:jc w:val="both"/>
+        <w:rPr>
+          <w:rFonts w:ascii="TimesNewRomanPSMT" w:hAnsi="TimesNewRomanPSMT" w:cs="TimesNewRomanPSMT"/>
+          <w:sz w:val="16"/>
+          <w:szCs w:val="16"/>
+          <w:lang w:val="en-US"/>
+        </w:rPr>
+      </w:pPr>
+      <w:r>
+        <w:rPr>
+          <w:rFonts w:ascii="TimesNewRomanPSMT" w:hAnsi="TimesNewRomanPSMT" w:cs="TimesNewRomanPSMT"/>
+          <w:sz w:val="16"/>
+          <w:szCs w:val="16"/>
+          <w:lang w:val="en-US"/>
         </w:rPr>
         <w:t>{%</w:t>
       </w:r>
@@ -7245,6 +7455,7 @@
           <w:rFonts w:ascii="TimesNewRomanPSMT" w:hAnsi="TimesNewRomanPSMT" w:cs="TimesNewRomanPSMT"/>
           <w:sz w:val="16"/>
           <w:szCs w:val="16"/>
+          <w:lang w:val="en-US"/>
         </w:rPr>
         <w:t>-</w:t>
       </w:r>
@@ -7253,45 +7464,11 @@
           <w:rFonts w:ascii="TimesNewRomanPSMT" w:hAnsi="TimesNewRomanPSMT" w:cs="TimesNewRomanPSMT"/>
           <w:sz w:val="16"/>
           <w:szCs w:val="16"/>
-        </w:rPr>
-        <w:t xml:space="preserve"> endif %} </w:t>
-      </w:r>
-    </w:p>
-    <w:p>
-      <w:pPr>
-        <w:ind w:firstLine="708"/>
-        <w:jc w:val="both"/>
-        <w:rPr>
-          <w:rFonts w:ascii="TimesNewRomanPSMT" w:hAnsi="TimesNewRomanPSMT" w:cs="TimesNewRomanPSMT"/>
-          <w:sz w:val="16"/>
-          <w:szCs w:val="16"/>
-        </w:rPr>
-      </w:pPr>
-      <w:r>
-        <w:rPr>
-          <w:rFonts w:ascii="TimesNewRomanPSMT" w:hAnsi="TimesNewRomanPSMT" w:cs="TimesNewRomanPSMT"/>
-          <w:sz w:val="16"/>
-          <w:szCs w:val="16"/>
-        </w:rPr>
-        <w:t>{%</w:t>
-      </w:r>
-      <w:r>
-        <w:rPr>
-          <w:rFonts w:ascii="TimesNewRomanPSMT" w:hAnsi="TimesNewRomanPSMT" w:cs="TimesNewRomanPSMT"/>
-          <w:sz w:val="16"/>
-          <w:szCs w:val="16"/>
           <w:lang w:val="en-US"/>
         </w:rPr>
-        <w:t>-</w:t>
-      </w:r>
-      <w:r>
-        <w:rPr>
-          <w:rFonts w:ascii="TimesNewRomanPSMT" w:hAnsi="TimesNewRomanPSMT" w:cs="TimesNewRomanPSMT"/>
-          <w:sz w:val="16"/>
-          <w:szCs w:val="16"/>
-        </w:rPr>
-        <w:t xml:space="preserve"> if lot.annexe_</w:t>
-      </w:r>
+        <w:t xml:space="preserve"> if </w:t>
+      </w:r>
+      <w:proofErr w:type="gramStart"/>
       <w:r>
         <w:rPr>
           <w:rFonts w:ascii="TimesNewRomanPSMT" w:hAnsi="TimesNewRomanPSMT" w:cs="TimesNewRomanPSMT"/>
@@ -7299,6 +7476,25 @@
           <w:szCs w:val="16"/>
           <w:lang w:val="en-US"/>
         </w:rPr>
+        <w:t>lot.annexe</w:t>
+      </w:r>
+      <w:proofErr w:type="gramEnd"/>
+      <w:r>
+        <w:rPr>
+          <w:rFonts w:ascii="TimesNewRomanPSMT" w:hAnsi="TimesNewRomanPSMT" w:cs="TimesNewRomanPSMT"/>
+          <w:sz w:val="16"/>
+          <w:szCs w:val="16"/>
+          <w:lang w:val="en-US"/>
+        </w:rPr>
+        <w:t>_</w:t>
+      </w:r>
+      <w:r>
+        <w:rPr>
+          <w:rFonts w:ascii="TimesNewRomanPSMT" w:hAnsi="TimesNewRomanPSMT" w:cs="TimesNewRomanPSMT"/>
+          <w:sz w:val="16"/>
+          <w:szCs w:val="16"/>
+          <w:lang w:val="en-US"/>
+        </w:rPr>
         <w:t>celliers</w:t>
       </w:r>
       <w:r>
@@ -7306,6 +7502,7 @@
           <w:rFonts w:ascii="TimesNewRomanPSMT" w:hAnsi="TimesNewRomanPSMT" w:cs="TimesNewRomanPSMT"/>
           <w:sz w:val="16"/>
           <w:szCs w:val="16"/>
+          <w:lang w:val="en-US"/>
         </w:rPr>
         <w:t xml:space="preserve"> %}</w:t>
       </w:r>
@@ -7423,13 +7620,15 @@
           <w:rFonts w:ascii="TimesNewRomanPSMT" w:hAnsi="TimesNewRomanPSMT" w:cs="TimesNewRomanPSMT"/>
           <w:sz w:val="16"/>
           <w:szCs w:val="16"/>
-        </w:rPr>
-      </w:pPr>
-      <w:r>
-        <w:rPr>
-          <w:rFonts w:ascii="TimesNewRomanPSMT" w:hAnsi="TimesNewRomanPSMT" w:cs="TimesNewRomanPSMT"/>
-          <w:sz w:val="16"/>
-          <w:szCs w:val="16"/>
+          <w:lang w:val="en-US"/>
+        </w:rPr>
+      </w:pPr>
+      <w:r>
+        <w:rPr>
+          <w:rFonts w:ascii="TimesNewRomanPSMT" w:hAnsi="TimesNewRomanPSMT" w:cs="TimesNewRomanPSMT"/>
+          <w:sz w:val="16"/>
+          <w:szCs w:val="16"/>
+          <w:lang w:val="en-US"/>
         </w:rPr>
         <w:t>{%</w:t>
       </w:r>
@@ -7447,6 +7646,7 @@
           <w:rFonts w:ascii="TimesNewRomanPSMT" w:hAnsi="TimesNewRomanPSMT" w:cs="TimesNewRomanPSMT"/>
           <w:sz w:val="16"/>
           <w:szCs w:val="16"/>
+          <w:lang w:val="en-US"/>
         </w:rPr>
         <w:t xml:space="preserve"> if lot.annexe_</w:t>
       </w:r>
@@ -7473,6 +7673,7 @@
           <w:rFonts w:ascii="TimesNewRomanPSMT" w:hAnsi="TimesNewRomanPSMT" w:cs="TimesNewRomanPSMT"/>
           <w:sz w:val="16"/>
           <w:szCs w:val="16"/>
+          <w:lang w:val="en-US"/>
         </w:rPr>
         <w:t xml:space="preserve"> %}</w:t>
       </w:r>
@@ -7510,6 +7711,7 @@
           <w:rFonts w:ascii="TimesNewRomanPSMT" w:hAnsi="TimesNewRomanPSMT" w:cs="TimesNewRomanPSMT"/>
           <w:sz w:val="16"/>
           <w:szCs w:val="16"/>
+          <w:lang w:val="en-US"/>
         </w:rPr>
         <w:instrText xml:space="preserve"> FORMCHECKBOX </w:instrText>
       </w:r>
@@ -7541,6 +7743,7 @@
           <w:rFonts w:ascii="TimesNewRomanPSMT" w:hAnsi="TimesNewRomanPSMT" w:cs="TimesNewRomanPSMT"/>
           <w:sz w:val="16"/>
           <w:szCs w:val="16"/>
+          <w:lang w:val="en-US"/>
         </w:rPr>
         <w:t xml:space="preserve"> </w:t>
       </w:r>
@@ -7558,13 +7761,15 @@
         <w:jc w:val="both"/>
         <w:rPr>
           <w:rFonts w:ascii="TimesNewRomanPSMT" w:hAnsi="TimesNewRomanPSMT" w:cs="TimesNewRomanPSMT"/>
-        </w:rPr>
-      </w:pPr>
-      <w:r>
-        <w:rPr>
-          <w:rFonts w:ascii="TimesNewRomanPSMT" w:hAnsi="TimesNewRomanPSMT" w:cs="TimesNewRomanPSMT"/>
-          <w:sz w:val="16"/>
-          <w:szCs w:val="16"/>
+          <w:lang w:val="en-US"/>
+        </w:rPr>
+      </w:pPr>
+      <w:r>
+        <w:rPr>
+          <w:rFonts w:ascii="TimesNewRomanPSMT" w:hAnsi="TimesNewRomanPSMT" w:cs="TimesNewRomanPSMT"/>
+          <w:sz w:val="16"/>
+          <w:szCs w:val="16"/>
+          <w:lang w:val="en-US"/>
         </w:rPr>
         <w:t>{%</w:t>
       </w:r>
@@ -7582,6 +7787,7 @@
           <w:rFonts w:ascii="TimesNewRomanPSMT" w:hAnsi="TimesNewRomanPSMT" w:cs="TimesNewRomanPSMT"/>
           <w:sz w:val="16"/>
           <w:szCs w:val="16"/>
+          <w:lang w:val="en-US"/>
         </w:rPr>
         <w:t xml:space="preserve"> endif %} </w:t>
       </w:r>
@@ -7594,13 +7800,15 @@
           <w:rFonts w:ascii="TimesNewRomanPSMT" w:hAnsi="TimesNewRomanPSMT" w:cs="TimesNewRomanPSMT"/>
           <w:sz w:val="16"/>
           <w:szCs w:val="16"/>
-        </w:rPr>
-      </w:pPr>
-      <w:r>
-        <w:rPr>
-          <w:rFonts w:ascii="TimesNewRomanPSMT" w:hAnsi="TimesNewRomanPSMT" w:cs="TimesNewRomanPSMT"/>
-          <w:sz w:val="16"/>
-          <w:szCs w:val="16"/>
+          <w:lang w:val="en-US"/>
+        </w:rPr>
+      </w:pPr>
+      <w:r>
+        <w:rPr>
+          <w:rFonts w:ascii="TimesNewRomanPSMT" w:hAnsi="TimesNewRomanPSMT" w:cs="TimesNewRomanPSMT"/>
+          <w:sz w:val="16"/>
+          <w:szCs w:val="16"/>
+          <w:lang w:val="en-US"/>
         </w:rPr>
         <w:t>{%</w:t>
       </w:r>
@@ -7618,16 +7826,28 @@
           <w:rFonts w:ascii="TimesNewRomanPSMT" w:hAnsi="TimesNewRomanPSMT" w:cs="TimesNewRomanPSMT"/>
           <w:sz w:val="16"/>
           <w:szCs w:val="16"/>
-        </w:rPr>
-        <w:t xml:space="preserve"> if lot.annexe</w:t>
-      </w:r>
-      <w:r>
-        <w:rPr>
-          <w:rFonts w:ascii="TimesNewRomanPSMT" w:hAnsi="TimesNewRomanPSMT" w:cs="TimesNewRomanPSMT"/>
-          <w:sz w:val="16"/>
-          <w:szCs w:val="16"/>
           <w:lang w:val="en-US"/>
         </w:rPr>
+        <w:t xml:space="preserve"> if </w:t>
+      </w:r>
+      <w:proofErr w:type="gramStart"/>
+      <w:r>
+        <w:rPr>
+          <w:rFonts w:ascii="TimesNewRomanPSMT" w:hAnsi="TimesNewRomanPSMT" w:cs="TimesNewRomanPSMT"/>
+          <w:sz w:val="16"/>
+          <w:szCs w:val="16"/>
+          <w:lang w:val="en-US"/>
+        </w:rPr>
+        <w:t>lot.annexe</w:t>
+      </w:r>
+      <w:proofErr w:type="gramEnd"/>
+      <w:r>
+        <w:rPr>
+          <w:rFonts w:ascii="TimesNewRomanPSMT" w:hAnsi="TimesNewRomanPSMT" w:cs="TimesNewRomanPSMT"/>
+          <w:sz w:val="16"/>
+          <w:szCs w:val="16"/>
+          <w:lang w:val="en-US"/>
+        </w:rPr>
         <w:t>_combles</w:t>
       </w:r>
       <w:r>
@@ -7635,6 +7855,7 @@
           <w:rFonts w:ascii="TimesNewRomanPSMT" w:hAnsi="TimesNewRomanPSMT" w:cs="TimesNewRomanPSMT"/>
           <w:sz w:val="16"/>
           <w:szCs w:val="16"/>
+          <w:lang w:val="en-US"/>
         </w:rPr>
         <w:t xml:space="preserve"> %}</w:t>
       </w:r>
@@ -7752,13 +7973,15 @@
           <w:rFonts w:ascii="TimesNewRomanPSMT" w:hAnsi="TimesNewRomanPSMT" w:cs="TimesNewRomanPSMT"/>
           <w:sz w:val="16"/>
           <w:szCs w:val="16"/>
-        </w:rPr>
-      </w:pPr>
-      <w:r>
-        <w:rPr>
-          <w:rFonts w:ascii="TimesNewRomanPSMT" w:hAnsi="TimesNewRomanPSMT" w:cs="TimesNewRomanPSMT"/>
-          <w:sz w:val="16"/>
-          <w:szCs w:val="16"/>
+          <w:lang w:val="en-US"/>
+        </w:rPr>
+      </w:pPr>
+      <w:r>
+        <w:rPr>
+          <w:rFonts w:ascii="TimesNewRomanPSMT" w:hAnsi="TimesNewRomanPSMT" w:cs="TimesNewRomanPSMT"/>
+          <w:sz w:val="16"/>
+          <w:szCs w:val="16"/>
+          <w:lang w:val="en-US"/>
         </w:rPr>
         <w:t>{%</w:t>
       </w:r>
@@ -7776,6 +7999,7 @@
           <w:rFonts w:ascii="TimesNewRomanPSMT" w:hAnsi="TimesNewRomanPSMT" w:cs="TimesNewRomanPSMT"/>
           <w:sz w:val="16"/>
           <w:szCs w:val="16"/>
+          <w:lang w:val="en-US"/>
         </w:rPr>
         <w:t xml:space="preserve"> if lot.annexe_</w:t>
       </w:r>
@@ -7793,6 +8017,7 @@
           <w:rFonts w:ascii="TimesNewRomanPSMT" w:hAnsi="TimesNewRomanPSMT" w:cs="TimesNewRomanPSMT"/>
           <w:sz w:val="16"/>
           <w:szCs w:val="16"/>
+          <w:lang w:val="en-US"/>
         </w:rPr>
         <w:t xml:space="preserve"> %}</w:t>
       </w:r>
@@ -7803,6 +8028,7 @@
         <w:jc w:val="both"/>
         <w:rPr>
           <w:rFonts w:ascii="TimesNewRomanPSMT" w:hAnsi="TimesNewRomanPSMT" w:cs="TimesNewRomanPSMT"/>
+          <w:lang w:val="en-US"/>
         </w:rPr>
       </w:pPr>
       <w:r>
@@ -7828,6 +8054,7 @@
           <w:rFonts w:ascii="TimesNewRomanPSMT" w:hAnsi="TimesNewRomanPSMT" w:cs="TimesNewRomanPSMT"/>
           <w:sz w:val="16"/>
           <w:szCs w:val="16"/>
+          <w:lang w:val="en-US"/>
         </w:rPr>
         <w:instrText xml:space="preserve"> FORMCHECKBOX </w:instrText>
       </w:r>
@@ -7859,12 +8086,14 @@
           <w:rFonts w:ascii="TimesNewRomanPSMT" w:hAnsi="TimesNewRomanPSMT" w:cs="TimesNewRomanPSMT"/>
           <w:sz w:val="16"/>
           <w:szCs w:val="16"/>
+          <w:lang w:val="en-US"/>
         </w:rPr>
         <w:t xml:space="preserve"> </w:t>
       </w:r>
       <w:r>
         <w:rPr>
           <w:rFonts w:ascii="TimesNewRomanPSMT" w:hAnsi="TimesNewRomanPSMT" w:cs="TimesNewRomanPSMT"/>
+          <w:lang w:val="en-US"/>
         </w:rPr>
         <w:t>Balcons</w:t>
       </w:r>
@@ -7875,6 +8104,27 @@
         <w:jc w:val="both"/>
         <w:rPr>
           <w:rFonts w:ascii="TimesNewRomanPSMT" w:hAnsi="TimesNewRomanPSMT" w:cs="TimesNewRomanPSMT"/>
+          <w:lang w:val="en-US"/>
+        </w:rPr>
+      </w:pPr>
+      <w:r>
+        <w:rPr>
+          <w:rFonts w:ascii="TimesNewRomanPSMT" w:hAnsi="TimesNewRomanPSMT" w:cs="TimesNewRomanPSMT"/>
+          <w:sz w:val="16"/>
+          <w:szCs w:val="16"/>
+          <w:lang w:val="en-US"/>
+        </w:rPr>
+        <w:t xml:space="preserve">{%- endif %} </w:t>
+      </w:r>
+    </w:p>
+    <w:p>
+      <w:pPr>
+        <w:ind w:firstLine="708"/>
+        <w:jc w:val="both"/>
+        <w:rPr>
+          <w:rFonts w:ascii="TimesNewRomanPSMT" w:hAnsi="TimesNewRomanPSMT" w:cs="TimesNewRomanPSMT"/>
+          <w:sz w:val="16"/>
+          <w:szCs w:val="16"/>
         </w:rPr>
       </w:pPr>
       <w:r>
@@ -7899,42 +8149,25 @@
           <w:sz w:val="16"/>
           <w:szCs w:val="16"/>
         </w:rPr>
-        <w:t xml:space="preserve"> endif %} </w:t>
-      </w:r>
-    </w:p>
-    <w:p>
-      <w:pPr>
-        <w:ind w:firstLine="708"/>
-        <w:jc w:val="both"/>
-        <w:rPr>
-          <w:rFonts w:ascii="TimesNewRomanPSMT" w:hAnsi="TimesNewRomanPSMT" w:cs="TimesNewRomanPSMT"/>
-          <w:sz w:val="16"/>
-          <w:szCs w:val="16"/>
-        </w:rPr>
-      </w:pPr>
-      <w:r>
-        <w:rPr>
-          <w:rFonts w:ascii="TimesNewRomanPSMT" w:hAnsi="TimesNewRomanPSMT" w:cs="TimesNewRomanPSMT"/>
-          <w:sz w:val="16"/>
-          <w:szCs w:val="16"/>
-        </w:rPr>
-        <w:t>{%</w:t>
-      </w:r>
-      <w:r>
-        <w:rPr>
-          <w:rFonts w:ascii="TimesNewRomanPSMT" w:hAnsi="TimesNewRomanPSMT" w:cs="TimesNewRomanPSMT"/>
-          <w:sz w:val="16"/>
-          <w:szCs w:val="16"/>
-        </w:rPr>
-        <w:t>-</w:t>
-      </w:r>
-      <w:r>
-        <w:rPr>
-          <w:rFonts w:ascii="TimesNewRomanPSMT" w:hAnsi="TimesNewRomanPSMT" w:cs="TimesNewRomanPSMT"/>
-          <w:sz w:val="16"/>
-          <w:szCs w:val="16"/>
-        </w:rPr>
-        <w:t xml:space="preserve"> if lot.annexe_</w:t>
+        <w:t xml:space="preserve"> if </w:t>
+      </w:r>
+      <w:proofErr w:type="gramStart"/>
+      <w:r>
+        <w:rPr>
+          <w:rFonts w:ascii="TimesNewRomanPSMT" w:hAnsi="TimesNewRomanPSMT" w:cs="TimesNewRomanPSMT"/>
+          <w:sz w:val="16"/>
+          <w:szCs w:val="16"/>
+        </w:rPr>
+        <w:t>lot.annexe</w:t>
+      </w:r>
+      <w:proofErr w:type="gramEnd"/>
+      <w:r>
+        <w:rPr>
+          <w:rFonts w:ascii="TimesNewRomanPSMT" w:hAnsi="TimesNewRomanPSMT" w:cs="TimesNewRomanPSMT"/>
+          <w:sz w:val="16"/>
+          <w:szCs w:val="16"/>
+        </w:rPr>
+        <w:t>_</w:t>
       </w:r>
       <w:r>
         <w:rPr>
@@ -8090,7 +8323,25 @@
           <w:sz w:val="16"/>
           <w:szCs w:val="16"/>
         </w:rPr>
-        <w:t xml:space="preserve"> if lot.annexe_</w:t>
+        <w:t xml:space="preserve"> if </w:t>
+      </w:r>
+      <w:proofErr w:type="gramStart"/>
+      <w:r>
+        <w:rPr>
+          <w:rFonts w:ascii="TimesNewRomanPSMT" w:hAnsi="TimesNewRomanPSMT" w:cs="TimesNewRomanPSMT"/>
+          <w:sz w:val="16"/>
+          <w:szCs w:val="16"/>
+        </w:rPr>
+        <w:t>lot.annexe</w:t>
+      </w:r>
+      <w:proofErr w:type="gramEnd"/>
+      <w:r>
+        <w:rPr>
+          <w:rFonts w:ascii="TimesNewRomanPSMT" w:hAnsi="TimesNewRomanPSMT" w:cs="TimesNewRomanPSMT"/>
+          <w:sz w:val="16"/>
+          <w:szCs w:val="16"/>
+        </w:rPr>
+        <w:t>_</w:t>
       </w:r>
       <w:r>
         <w:rPr>
@@ -8262,11 +8513,19 @@
       </w:r>
       <w:bookmarkStart w:id="45" w:name="SU"/>
       <w:bookmarkEnd w:id="45"/>
-      <w:r>
-        <w:rPr>
-          <w:rFonts w:ascii="TimesNewRomanPSMT" w:hAnsi="TimesNewRomanPSMT" w:cs="TimesNewRomanPSMT"/>
-        </w:rPr>
-        <w:t>{{ su_totale|f }} m</w:t>
+      <w:proofErr w:type="gramStart"/>
+      <w:r>
+        <w:rPr>
+          <w:rFonts w:ascii="TimesNewRomanPSMT" w:hAnsi="TimesNewRomanPSMT" w:cs="TimesNewRomanPSMT"/>
+        </w:rPr>
+        <w:t>{{ su</w:t>
+      </w:r>
+      <w:proofErr w:type="gramEnd"/>
+      <w:r>
+        <w:rPr>
+          <w:rFonts w:ascii="TimesNewRomanPSMT" w:hAnsi="TimesNewRomanPSMT" w:cs="TimesNewRomanPSMT"/>
+        </w:rPr>
+        <w:t>_totale|f }} m</w:t>
       </w:r>
       <w:r>
         <w:rPr>
@@ -8311,22 +8570,40 @@
           <w:sz w:val="20"/>
           <w:lang w:val="en-US"/>
         </w:rPr>
-        <w:t>{% if logements.count() %}</w:t>
-      </w:r>
-    </w:p>
-    <w:p>
-      <w:pPr>
-        <w:jc w:val="both"/>
+        <w:t xml:space="preserve">{% if </w:t>
+      </w:r>
+      <w:proofErr w:type="gramStart"/>
+      <w:r>
         <w:rPr>
           <w:rFonts w:ascii="TimesNewRomanPSMT" w:hAnsi="TimesNewRomanPSMT" w:cs="TimesNewRomanPSMT"/>
           <w:sz w:val="20"/>
           <w:lang w:val="en-US"/>
         </w:rPr>
+        <w:t>logements.count</w:t>
+      </w:r>
+      <w:proofErr w:type="gramEnd"/>
+      <w:r>
+        <w:rPr>
+          <w:rFonts w:ascii="TimesNewRomanPSMT" w:hAnsi="TimesNewRomanPSMT" w:cs="TimesNewRomanPSMT"/>
+          <w:sz w:val="20"/>
+          <w:lang w:val="en-US"/>
+        </w:rPr>
+        <w:t>() %}</w:t>
+      </w:r>
+    </w:p>
+    <w:p>
+      <w:pPr>
+        <w:jc w:val="both"/>
+        <w:rPr>
+          <w:rFonts w:ascii="TimesNewRomanPSMT" w:hAnsi="TimesNewRomanPSMT" w:cs="TimesNewRomanPSMT"/>
+          <w:sz w:val="20"/>
+          <w:lang w:val="en-US"/>
+        </w:rPr>
       </w:pPr>
     </w:p>
     <w:tbl>
       <w:tblPr>
-        <w:tblStyle w:val="Grilledutableau"/>
+        <w:tblStyle w:val="TableGrid"/>
         <w:tblW w:w="0" w:type="auto"/>
         <w:tblLayout w:type="fixed"/>
         <w:tblLook w:val="04A0" w:firstRow="1" w:lastRow="0" w:firstColumn="1" w:lastColumn="0" w:noHBand="0" w:noVBand="1"/>
@@ -8404,6 +8681,7 @@
                 <w:szCs w:val="14"/>
               </w:rPr>
             </w:pPr>
+            <w:proofErr w:type="gramStart"/>
             <w:r>
               <w:rPr>
                 <w:rFonts w:ascii="TimesNewRomanPSMT" w:hAnsi="TimesNewRomanPSMT" w:cs="TimesNewRomanPSMT"/>
@@ -8412,6 +8690,7 @@
               </w:rPr>
               <w:t>habitable</w:t>
             </w:r>
+            <w:proofErr w:type="gramEnd"/>
           </w:p>
           <w:p>
             <w:pPr>
@@ -8428,7 +8707,25 @@
                 <w:sz w:val="14"/>
                 <w:szCs w:val="14"/>
               </w:rPr>
-              <w:t>(art. R. 111-2)</w:t>
+              <w:t>(</w:t>
+            </w:r>
+            <w:proofErr w:type="gramStart"/>
+            <w:r>
+              <w:rPr>
+                <w:rFonts w:ascii="TimesNewRomanPSMT" w:hAnsi="TimesNewRomanPSMT" w:cs="TimesNewRomanPSMT"/>
+                <w:sz w:val="14"/>
+                <w:szCs w:val="14"/>
+              </w:rPr>
+              <w:t>art.</w:t>
+            </w:r>
+            <w:proofErr w:type="gramEnd"/>
+            <w:r>
+              <w:rPr>
+                <w:rFonts w:ascii="TimesNewRomanPSMT" w:hAnsi="TimesNewRomanPSMT" w:cs="TimesNewRomanPSMT"/>
+                <w:sz w:val="14"/>
+                <w:szCs w:val="14"/>
+              </w:rPr>
+              <w:t xml:space="preserve"> R. 111-2)</w:t>
             </w:r>
           </w:p>
         </w:tc>
@@ -8463,13 +8760,23 @@
                 <w:lang w:val="en-US"/>
               </w:rPr>
             </w:pPr>
+            <w:proofErr w:type="gramStart"/>
             <w:r>
               <w:rPr>
                 <w:rFonts w:ascii="TimesNewRomanPSMT" w:hAnsi="TimesNewRomanPSMT" w:cs="TimesNewRomanPSMT"/>
                 <w:sz w:val="14"/>
                 <w:szCs w:val="14"/>
               </w:rPr>
-              <w:t>réelle des annexes</w:t>
+              <w:t>réelle</w:t>
+            </w:r>
+            <w:proofErr w:type="gramEnd"/>
+            <w:r>
+              <w:rPr>
+                <w:rFonts w:ascii="TimesNewRomanPSMT" w:hAnsi="TimesNewRomanPSMT" w:cs="TimesNewRomanPSMT"/>
+                <w:sz w:val="14"/>
+                <w:szCs w:val="14"/>
+              </w:rPr>
+              <w:t xml:space="preserve"> des annexes</w:t>
             </w:r>
           </w:p>
         </w:tc>
@@ -8509,7 +8816,25 @@
                 <w:sz w:val="14"/>
                 <w:szCs w:val="14"/>
               </w:rPr>
-              <w:t>(surface habitable augmentée de 50% de la surface des annexes)</w:t>
+              <w:t>(</w:t>
+            </w:r>
+            <w:proofErr w:type="gramStart"/>
+            <w:r>
+              <w:rPr>
+                <w:rFonts w:ascii="TimesNewRomanPSMT" w:hAnsi="TimesNewRomanPSMT" w:cs="TimesNewRomanPSMT"/>
+                <w:sz w:val="14"/>
+                <w:szCs w:val="14"/>
+              </w:rPr>
+              <w:t>surface</w:t>
+            </w:r>
+            <w:proofErr w:type="gramEnd"/>
+            <w:r>
+              <w:rPr>
+                <w:rFonts w:ascii="TimesNewRomanPSMT" w:hAnsi="TimesNewRomanPSMT" w:cs="TimesNewRomanPSMT"/>
+                <w:sz w:val="14"/>
+                <w:szCs w:val="14"/>
+              </w:rPr>
+              <w:t xml:space="preserve"> habitable augmentée de 50% de la surface des annexes)</w:t>
             </w:r>
           </w:p>
         </w:tc>
@@ -8589,13 +8914,23 @@
                 <w:szCs w:val="14"/>
               </w:rPr>
             </w:pPr>
+            <w:proofErr w:type="gramStart"/>
             <w:r>
               <w:rPr>
                 <w:rFonts w:ascii="TimesNewRomanPSMT" w:hAnsi="TimesNewRomanPSMT" w:cs="TimesNewRomanPSMT"/>
                 <w:sz w:val="14"/>
                 <w:szCs w:val="14"/>
               </w:rPr>
-              <w:t>du logement</w:t>
+              <w:t>du</w:t>
+            </w:r>
+            <w:proofErr w:type="gramEnd"/>
+            <w:r>
+              <w:rPr>
+                <w:rFonts w:ascii="TimesNewRomanPSMT" w:hAnsi="TimesNewRomanPSMT" w:cs="TimesNewRomanPSMT"/>
+                <w:sz w:val="14"/>
+                <w:szCs w:val="14"/>
+              </w:rPr>
+              <w:t xml:space="preserve"> logement</w:t>
             </w:r>
           </w:p>
           <w:p>
@@ -8612,7 +8947,25 @@
                 <w:sz w:val="14"/>
                 <w:szCs w:val="14"/>
               </w:rPr>
-              <w:t xml:space="preserve">(col 4 </w:t>
+              <w:t>(</w:t>
+            </w:r>
+            <w:proofErr w:type="gramStart"/>
+            <w:r>
+              <w:rPr>
+                <w:rFonts w:ascii="TimesNewRomanPSMT" w:hAnsi="TimesNewRomanPSMT" w:cs="TimesNewRomanPSMT"/>
+                <w:sz w:val="14"/>
+                <w:szCs w:val="14"/>
+              </w:rPr>
+              <w:t>col</w:t>
+            </w:r>
+            <w:proofErr w:type="gramEnd"/>
+            <w:r>
+              <w:rPr>
+                <w:rFonts w:ascii="TimesNewRomanPSMT" w:hAnsi="TimesNewRomanPSMT" w:cs="TimesNewRomanPSMT"/>
+                <w:sz w:val="14"/>
+                <w:szCs w:val="14"/>
+              </w:rPr>
+              <w:t xml:space="preserve"> 4 </w:t>
             </w:r>
             <w:r>
               <w:rPr>
@@ -8654,16 +9007,26 @@
                 <w:sz w:val="14"/>
                 <w:szCs w:val="14"/>
               </w:rPr>
-              <w:t xml:space="preserve"> col 6)</w:t>
-            </w:r>
+              <w:t xml:space="preserve"> col </w:t>
+            </w:r>
+            <w:proofErr w:type="gramStart"/>
             <w:r>
               <w:rPr>
                 <w:rFonts w:ascii="TimesNewRomanPSMT" w:hAnsi="TimesNewRomanPSMT" w:cs="TimesNewRomanPSMT"/>
                 <w:sz w:val="14"/>
                 <w:szCs w:val="14"/>
               </w:rPr>
+              <w:t>6)</w:t>
+            </w:r>
+            <w:r>
+              <w:rPr>
+                <w:rFonts w:ascii="TimesNewRomanPSMT" w:hAnsi="TimesNewRomanPSMT" w:cs="TimesNewRomanPSMT"/>
+                <w:sz w:val="14"/>
+                <w:szCs w:val="14"/>
+              </w:rPr>
               <w:t>*</w:t>
             </w:r>
+            <w:proofErr w:type="gramEnd"/>
           </w:p>
         </w:tc>
       </w:tr>
@@ -9120,7 +9483,27 @@
                 <w:szCs w:val="16"/>
                 <w:lang w:val="en-US"/>
               </w:rPr>
-              <w:t>{{l.lpmc|f }}</w:t>
+              <w:t>{{</w:t>
+            </w:r>
+            <w:proofErr w:type="gramStart"/>
+            <w:r>
+              <w:rPr>
+                <w:rFonts w:ascii="TimesNewRomanPSMT" w:hAnsi="TimesNewRomanPSMT" w:cs="TimesNewRomanPSMT"/>
+                <w:sz w:val="16"/>
+                <w:szCs w:val="16"/>
+                <w:lang w:val="en-US"/>
+              </w:rPr>
+              <w:t>l.lpmc</w:t>
+            </w:r>
+            <w:proofErr w:type="gramEnd"/>
+            <w:r>
+              <w:rPr>
+                <w:rFonts w:ascii="TimesNewRomanPSMT" w:hAnsi="TimesNewRomanPSMT" w:cs="TimesNewRomanPSMT"/>
+                <w:sz w:val="16"/>
+                <w:szCs w:val="16"/>
+                <w:lang w:val="en-US"/>
+              </w:rPr>
+              <w:t>|f }}</w:t>
             </w:r>
           </w:p>
         </w:tc>
@@ -9170,7 +9553,27 @@
                 <w:szCs w:val="16"/>
                 <w:lang w:val="en-US"/>
               </w:rPr>
-              <w:t>{{l.l|f}}</w:t>
+              <w:t>{{</w:t>
+            </w:r>
+            <w:proofErr w:type="gramStart"/>
+            <w:r>
+              <w:rPr>
+                <w:rFonts w:ascii="TimesNewRomanPSMT" w:hAnsi="TimesNewRomanPSMT" w:cs="TimesNewRomanPSMT"/>
+                <w:sz w:val="16"/>
+                <w:szCs w:val="16"/>
+                <w:lang w:val="en-US"/>
+              </w:rPr>
+              <w:t>l.l</w:t>
+            </w:r>
+            <w:proofErr w:type="gramEnd"/>
+            <w:r>
+              <w:rPr>
+                <w:rFonts w:ascii="TimesNewRomanPSMT" w:hAnsi="TimesNewRomanPSMT" w:cs="TimesNewRomanPSMT"/>
+                <w:sz w:val="16"/>
+                <w:szCs w:val="16"/>
+                <w:lang w:val="en-US"/>
+              </w:rPr>
+              <w:t>|f}}</w:t>
             </w:r>
           </w:p>
         </w:tc>
@@ -9595,7 +9998,21 @@
         <w:rPr>
           <w:rFonts w:ascii="TimesNewRomanPSMT" w:hAnsi="TimesNewRomanPSMT" w:cs="TimesNewRomanPSMT"/>
         </w:rPr>
-        <w:t>6. Nombre et liste des annexes susceptibles de donner lieu à perception d'un loyer accessoire : {{ liste_des_annexes }}</w:t>
+        <w:t xml:space="preserve">6. Nombre et liste des annexes susceptibles de donner lieu à perception d'un loyer accessoire : </w:t>
+      </w:r>
+      <w:proofErr w:type="gramStart"/>
+      <w:r>
+        <w:rPr>
+          <w:rFonts w:ascii="TimesNewRomanPSMT" w:hAnsi="TimesNewRomanPSMT" w:cs="TimesNewRomanPSMT"/>
+        </w:rPr>
+        <w:t>{{ liste</w:t>
+      </w:r>
+      <w:proofErr w:type="gramEnd"/>
+      <w:r>
+        <w:rPr>
+          <w:rFonts w:ascii="TimesNewRomanPSMT" w:hAnsi="TimesNewRomanPSMT" w:cs="TimesNewRomanPSMT"/>
+        </w:rPr>
+        <w:t>_des_annexes }}</w:t>
       </w:r>
     </w:p>
     <w:p>
@@ -9641,12 +10058,28 @@
           <w:rFonts w:ascii="TimesNewRomanPSMT" w:hAnsi="TimesNewRomanPSMT" w:cs="TimesNewRomanPSMT"/>
           <w:sz w:val="20"/>
         </w:rPr>
-        <w:t>{% if stationnements.count() %}</w:t>
+        <w:t xml:space="preserve">{% if </w:t>
+      </w:r>
+      <w:proofErr w:type="gramStart"/>
+      <w:r>
+        <w:rPr>
+          <w:rFonts w:ascii="TimesNewRomanPSMT" w:hAnsi="TimesNewRomanPSMT" w:cs="TimesNewRomanPSMT"/>
+          <w:sz w:val="20"/>
+        </w:rPr>
+        <w:t>stationnements.count</w:t>
+      </w:r>
+      <w:proofErr w:type="gramEnd"/>
+      <w:r>
+        <w:rPr>
+          <w:rFonts w:ascii="TimesNewRomanPSMT" w:hAnsi="TimesNewRomanPSMT" w:cs="TimesNewRomanPSMT"/>
+          <w:sz w:val="20"/>
+        </w:rPr>
+        <w:t>() %}</w:t>
       </w:r>
     </w:p>
     <w:tbl>
       <w:tblPr>
-        <w:tblStyle w:val="Grilledutableau"/>
+        <w:tblStyle w:val="TableGrid"/>
         <w:tblW w:w="0" w:type="auto"/>
         <w:tblLook w:val="04A0" w:firstRow="1" w:lastRow="0" w:firstColumn="1" w:lastColumn="0" w:noHBand="0" w:noVBand="1"/>
       </w:tblPr>
@@ -9828,47 +10261,28 @@
               <w:rPr>
                 <w:rFonts w:ascii="TimesNewRomanPSMT" w:hAnsi="TimesNewRomanPSMT" w:cs="TimesNewRomanPSMT"/>
                 <w:sz w:val="20"/>
+                <w:lang w:val="en-US"/>
               </w:rPr>
             </w:pPr>
-            <w:r>
-              <w:rPr>
-                <w:rFonts w:ascii="TimesNewRomanPSMT" w:hAnsi="TimesNewRomanPSMT" w:cs="TimesNewRomanPSMT"/>
-                <w:sz w:val="16"/>
-                <w:szCs w:val="16"/>
-              </w:rPr>
-              <w:t xml:space="preserve">{{ s.nb }} </w:t>
-            </w:r>
-            <w:r>
-              <w:rPr>
-                <w:rFonts w:ascii="TimesNewRomanPSMT" w:hAnsi="TimesNewRomanPSMT" w:cs="TimesNewRomanPSMT"/>
-                <w:sz w:val="16"/>
-                <w:szCs w:val="16"/>
-              </w:rPr>
-              <w:t xml:space="preserve">stationnement{{s.nb|pl}} </w:t>
-            </w:r>
-            <w:r>
-              <w:rPr>
-                <w:rFonts w:ascii="TimesNewRomanPSMT" w:hAnsi="TimesNewRomanPSMT" w:cs="TimesNewRomanPSMT"/>
-                <w:sz w:val="16"/>
-                <w:szCs w:val="16"/>
-              </w:rPr>
-              <w:t>de type {{ s.</w:t>
-            </w:r>
-            <w:r>
-              <w:rPr>
-                <w:rFonts w:ascii="TimesNewRomanPSMT" w:hAnsi="TimesNewRomanPSMT" w:cs="TimesNewRomanPSMT"/>
-                <w:sz w:val="16"/>
-                <w:szCs w:val="16"/>
-              </w:rPr>
-              <w:t>t</w:t>
-            </w:r>
-            <w:r>
-              <w:rPr>
-                <w:rFonts w:ascii="TimesNewRomanPSMT" w:hAnsi="TimesNewRomanPSMT" w:cs="TimesNewRomanPSMT"/>
-                <w:sz w:val="16"/>
-                <w:szCs w:val="16"/>
-              </w:rPr>
-              <w:t xml:space="preserve"> }}</w:t>
+            <w:proofErr w:type="gramStart"/>
+            <w:r>
+              <w:rPr>
+                <w:rFonts w:ascii="TimesNewRomanPSMT" w:hAnsi="TimesNewRomanPSMT" w:cs="TimesNewRomanPSMT"/>
+                <w:sz w:val="16"/>
+                <w:szCs w:val="16"/>
+                <w:lang w:val="en-US"/>
+              </w:rPr>
+              <w:t>{{ s</w:t>
+            </w:r>
+            <w:proofErr w:type="gramEnd"/>
+            <w:r>
+              <w:rPr>
+                <w:rFonts w:ascii="TimesNewRomanPSMT" w:hAnsi="TimesNewRomanPSMT" w:cs="TimesNewRomanPSMT"/>
+                <w:sz w:val="16"/>
+                <w:szCs w:val="16"/>
+                <w:lang w:val="en-US"/>
+              </w:rPr>
+              <w:t>.nb }} stationnement{{s.nb|pl}} de type {{ s.t }}</w:t>
             </w:r>
           </w:p>
         </w:tc>
@@ -9891,8 +10305,18 @@
                 <w:sz w:val="16"/>
                 <w:szCs w:val="16"/>
               </w:rPr>
-              <w:t>{{s.l</w:t>
-            </w:r>
+              <w:t>{{</w:t>
+            </w:r>
+            <w:proofErr w:type="gramStart"/>
+            <w:r>
+              <w:rPr>
+                <w:rFonts w:ascii="TimesNewRomanPSMT" w:hAnsi="TimesNewRomanPSMT" w:cs="TimesNewRomanPSMT"/>
+                <w:sz w:val="16"/>
+                <w:szCs w:val="16"/>
+              </w:rPr>
+              <w:t>s.l</w:t>
+            </w:r>
+            <w:proofErr w:type="gramEnd"/>
             <w:r>
               <w:rPr>
                 <w:rFonts w:ascii="TimesNewRomanPSMT" w:hAnsi="TimesNewRomanPSMT" w:cs="TimesNewRomanPSMT"/>
@@ -9983,6 +10407,7 @@
         </w:rPr>
         <w:t xml:space="preserve">{% if </w:t>
       </w:r>
+      <w:proofErr w:type="gramStart"/>
       <w:r>
         <w:rPr>
           <w:rFonts w:ascii="TimesNewRomanPSMT" w:hAnsi="TimesNewRomanPSMT" w:cs="TimesNewRomanPSMT"/>
@@ -9997,12 +10422,21 @@
           <w:sz w:val="20"/>
           <w:lang w:val="en-US"/>
         </w:rPr>
-        <w:t>.count() %}</w:t>
+        <w:t>.count</w:t>
+      </w:r>
+      <w:proofErr w:type="gramEnd"/>
+      <w:r>
+        <w:rPr>
+          <w:rFonts w:ascii="TimesNewRomanPSMT" w:hAnsi="TimesNewRomanPSMT" w:cs="TimesNewRomanPSMT"/>
+          <w:sz w:val="20"/>
+          <w:lang w:val="en-US"/>
+        </w:rPr>
+        <w:t>() %}</w:t>
       </w:r>
     </w:p>
     <w:tbl>
       <w:tblPr>
-        <w:tblStyle w:val="Grilledutableau"/>
+        <w:tblStyle w:val="TableGrid"/>
         <w:tblW w:w="0" w:type="auto"/>
         <w:tblLook w:val="04A0" w:firstRow="1" w:lastRow="0" w:firstColumn="1" w:lastColumn="0" w:noHBand="0" w:noVBand="1"/>
       </w:tblPr>
@@ -10265,7 +10699,27 @@
                 <w:szCs w:val="16"/>
                 <w:lang w:val="en-US"/>
               </w:rPr>
-              <w:t>{{a.lgt.d}}</w:t>
+              <w:t>{{</w:t>
+            </w:r>
+            <w:proofErr w:type="gramStart"/>
+            <w:r>
+              <w:rPr>
+                <w:rFonts w:ascii="TimesNewRomanPSMT" w:hAnsi="TimesNewRomanPSMT" w:cs="TimesNewRomanPSMT"/>
+                <w:sz w:val="16"/>
+                <w:szCs w:val="16"/>
+                <w:lang w:val="en-US"/>
+              </w:rPr>
+              <w:t>a.lgt.d</w:t>
+            </w:r>
+            <w:proofErr w:type="gramEnd"/>
+            <w:r>
+              <w:rPr>
+                <w:rFonts w:ascii="TimesNewRomanPSMT" w:hAnsi="TimesNewRomanPSMT" w:cs="TimesNewRomanPSMT"/>
+                <w:sz w:val="16"/>
+                <w:szCs w:val="16"/>
+                <w:lang w:val="en-US"/>
+              </w:rPr>
+              <w:t>}}</w:t>
             </w:r>
           </w:p>
         </w:tc>
@@ -10333,8 +10787,19 @@
                 <w:szCs w:val="16"/>
                 <w:lang w:val="en-US"/>
               </w:rPr>
-              <w:t>{{a.shsr</w:t>
-            </w:r>
+              <w:t>{{</w:t>
+            </w:r>
+            <w:proofErr w:type="gramStart"/>
+            <w:r>
+              <w:rPr>
+                <w:rFonts w:ascii="TimesNewRomanPSMT" w:hAnsi="TimesNewRomanPSMT" w:cs="TimesNewRomanPSMT"/>
+                <w:sz w:val="16"/>
+                <w:szCs w:val="16"/>
+                <w:lang w:val="en-US"/>
+              </w:rPr>
+              <w:t>a.shsr</w:t>
+            </w:r>
+            <w:proofErr w:type="gramEnd"/>
             <w:r>
               <w:rPr>
                 <w:rFonts w:ascii="TimesNewRomanPSMT" w:hAnsi="TimesNewRomanPSMT" w:cs="TimesNewRomanPSMT"/>
@@ -10376,8 +10841,19 @@
                 <w:szCs w:val="16"/>
                 <w:lang w:val="en-US"/>
               </w:rPr>
-              <w:t>{{a.lpmc</w:t>
-            </w:r>
+              <w:t>{{</w:t>
+            </w:r>
+            <w:proofErr w:type="gramStart"/>
+            <w:r>
+              <w:rPr>
+                <w:rFonts w:ascii="TimesNewRomanPSMT" w:hAnsi="TimesNewRomanPSMT" w:cs="TimesNewRomanPSMT"/>
+                <w:sz w:val="16"/>
+                <w:szCs w:val="16"/>
+                <w:lang w:val="en-US"/>
+              </w:rPr>
+              <w:t>a.lpmc</w:t>
+            </w:r>
+            <w:proofErr w:type="gramEnd"/>
             <w:r>
               <w:rPr>
                 <w:rFonts w:ascii="TimesNewRomanPSMT" w:hAnsi="TimesNewRomanPSMT" w:cs="TimesNewRomanPSMT"/>
@@ -10419,8 +10895,19 @@
                 <w:szCs w:val="16"/>
                 <w:lang w:val="en-US"/>
               </w:rPr>
-              <w:t>{{a.l</w:t>
-            </w:r>
+              <w:t>{{</w:t>
+            </w:r>
+            <w:proofErr w:type="gramStart"/>
+            <w:r>
+              <w:rPr>
+                <w:rFonts w:ascii="TimesNewRomanPSMT" w:hAnsi="TimesNewRomanPSMT" w:cs="TimesNewRomanPSMT"/>
+                <w:sz w:val="16"/>
+                <w:szCs w:val="16"/>
+                <w:lang w:val="en-US"/>
+              </w:rPr>
+              <w:t>a.l</w:t>
+            </w:r>
+            <w:proofErr w:type="gramEnd"/>
             <w:r>
               <w:rPr>
                 <w:rFonts w:ascii="TimesNewRomanPSMT" w:hAnsi="TimesNewRomanPSMT" w:cs="TimesNewRomanPSMT"/>
@@ -10561,7 +11048,14 @@
         <w:rPr>
           <w:rFonts w:ascii="TimesNewRomanPSMT" w:hAnsi="TimesNewRomanPSMT" w:cs="TimesNewRomanPSMT"/>
         </w:rPr>
-        <w:t xml:space="preserve">Locaux commerciaux (nombre) :  </w:t>
+        <w:t xml:space="preserve">Locaux commerciaux (nombre) </w:t>
+      </w:r>
+      <w:proofErr w:type="gramStart"/>
+      <w:r>
+        <w:rPr>
+          <w:rFonts w:ascii="TimesNewRomanPSMT" w:hAnsi="TimesNewRomanPSMT" w:cs="TimesNewRomanPSMT"/>
+        </w:rPr>
+        <w:t xml:space="preserve">:  </w:t>
       </w:r>
       <w:bookmarkStart w:id="51" w:name="Commerce"/>
       <w:bookmarkEnd w:id="51"/>
@@ -10569,7 +11063,14 @@
         <w:rPr>
           <w:rFonts w:ascii="TimesNewRomanPSMT" w:hAnsi="TimesNewRomanPSMT" w:cs="TimesNewRomanPSMT"/>
         </w:rPr>
-        <w:t>{{ programme.nb_locaux_commerciaux or 0 }}</w:t>
+        <w:t>{</w:t>
+      </w:r>
+      <w:proofErr w:type="gramEnd"/>
+      <w:r>
+        <w:rPr>
+          <w:rFonts w:ascii="TimesNewRomanPSMT" w:hAnsi="TimesNewRomanPSMT" w:cs="TimesNewRomanPSMT"/>
+        </w:rPr>
+        <w:t>{ programme.nb_locaux_commerciaux or 0 }}</w:t>
       </w:r>
     </w:p>
     <w:p>
@@ -10592,11 +11093,19 @@
       </w:r>
       <w:bookmarkStart w:id="52" w:name="Bureau"/>
       <w:bookmarkEnd w:id="52"/>
-      <w:r>
-        <w:rPr>
-          <w:rFonts w:ascii="TimesNewRomanPSMT" w:hAnsi="TimesNewRomanPSMT" w:cs="TimesNewRomanPSMT"/>
-        </w:rPr>
-        <w:t>{{ programme.nb_bureaux or 0 }}</w:t>
+      <w:proofErr w:type="gramStart"/>
+      <w:r>
+        <w:rPr>
+          <w:rFonts w:ascii="TimesNewRomanPSMT" w:hAnsi="TimesNewRomanPSMT" w:cs="TimesNewRomanPSMT"/>
+        </w:rPr>
+        <w:t>{{ programme</w:t>
+      </w:r>
+      <w:proofErr w:type="gramEnd"/>
+      <w:r>
+        <w:rPr>
+          <w:rFonts w:ascii="TimesNewRomanPSMT" w:hAnsi="TimesNewRomanPSMT" w:cs="TimesNewRomanPSMT"/>
+        </w:rPr>
+        <w:t>.nb_bureaux or 0 }}</w:t>
       </w:r>
     </w:p>
     <w:p>
@@ -10622,11 +11131,19 @@
       </w:r>
       <w:bookmarkStart w:id="53" w:name="Autre"/>
       <w:bookmarkEnd w:id="53"/>
-      <w:r>
-        <w:rPr>
-          <w:rFonts w:ascii="TimesNewRomanPSMT" w:hAnsi="TimesNewRomanPSMT" w:cs="TimesNewRomanPSMT"/>
-        </w:rPr>
-        <w:t>{{ programme.autre</w:t>
+      <w:proofErr w:type="gramStart"/>
+      <w:r>
+        <w:rPr>
+          <w:rFonts w:ascii="TimesNewRomanPSMT" w:hAnsi="TimesNewRomanPSMT" w:cs="TimesNewRomanPSMT"/>
+        </w:rPr>
+        <w:t>{{ programme</w:t>
+      </w:r>
+      <w:proofErr w:type="gramEnd"/>
+      <w:r>
+        <w:rPr>
+          <w:rFonts w:ascii="TimesNewRomanPSMT" w:hAnsi="TimesNewRomanPSMT" w:cs="TimesNewRomanPSMT"/>
+        </w:rPr>
+        <w:t>.autre</w:t>
       </w:r>
       <w:r>
         <w:rPr>
@@ -10698,11 +11215,19 @@
       </w:r>
       <w:bookmarkStart w:id="54" w:name="Vendeur"/>
       <w:bookmarkEnd w:id="54"/>
-      <w:r>
-        <w:rPr>
-          <w:rFonts w:ascii="TimesNewRomanPSMT" w:hAnsi="TimesNewRomanPSMT" w:cs="TimesNewRomanPSMT"/>
-        </w:rPr>
-        <w:t>{{ programme.vendeur_text()  }}</w:t>
+      <w:proofErr w:type="gramStart"/>
+      <w:r>
+        <w:rPr>
+          <w:rFonts w:ascii="TimesNewRomanPSMT" w:hAnsi="TimesNewRomanPSMT" w:cs="TimesNewRomanPSMT"/>
+        </w:rPr>
+        <w:t>{{ programme</w:t>
+      </w:r>
+      <w:proofErr w:type="gramEnd"/>
+      <w:r>
+        <w:rPr>
+          <w:rFonts w:ascii="TimesNewRomanPSMT" w:hAnsi="TimesNewRomanPSMT" w:cs="TimesNewRomanPSMT"/>
+        </w:rPr>
+        <w:t>.vendeur_text()  }}</w:t>
       </w:r>
     </w:p>
     <w:p>
@@ -10782,11 +11307,19 @@
       </w:r>
       <w:bookmarkStart w:id="55" w:name="Acquereur"/>
       <w:bookmarkEnd w:id="55"/>
-      <w:r>
-        <w:rPr>
-          <w:rFonts w:ascii="TimesNewRomanPSMT" w:hAnsi="TimesNewRomanPSMT" w:cs="TimesNewRomanPSMT"/>
-        </w:rPr>
-        <w:t>{{ programme.acquereur_text() }}</w:t>
+      <w:proofErr w:type="gramStart"/>
+      <w:r>
+        <w:rPr>
+          <w:rFonts w:ascii="TimesNewRomanPSMT" w:hAnsi="TimesNewRomanPSMT" w:cs="TimesNewRomanPSMT"/>
+        </w:rPr>
+        <w:t>{{ programme</w:t>
+      </w:r>
+      <w:proofErr w:type="gramEnd"/>
+      <w:r>
+        <w:rPr>
+          <w:rFonts w:ascii="TimesNewRomanPSMT" w:hAnsi="TimesNewRomanPSMT" w:cs="TimesNewRomanPSMT"/>
+        </w:rPr>
+        <w:t>.acquereur_text() }}</w:t>
       </w:r>
     </w:p>
     <w:p>
@@ -10848,11 +11381,19 @@
       </w:r>
       <w:bookmarkStart w:id="56" w:name="ActeNotaire"/>
       <w:bookmarkEnd w:id="56"/>
-      <w:r>
-        <w:rPr>
-          <w:rFonts w:ascii="TimesNewRomanPSMT" w:hAnsi="TimesNewRomanPSMT" w:cs="TimesNewRomanPSMT"/>
-        </w:rPr>
-        <w:t>{{ programme.date_acte_notarie|d }}</w:t>
+      <w:proofErr w:type="gramStart"/>
+      <w:r>
+        <w:rPr>
+          <w:rFonts w:ascii="TimesNewRomanPSMT" w:hAnsi="TimesNewRomanPSMT" w:cs="TimesNewRomanPSMT"/>
+        </w:rPr>
+        <w:t>{{ programme</w:t>
+      </w:r>
+      <w:proofErr w:type="gramEnd"/>
+      <w:r>
+        <w:rPr>
+          <w:rFonts w:ascii="TimesNewRomanPSMT" w:hAnsi="TimesNewRomanPSMT" w:cs="TimesNewRomanPSMT"/>
+        </w:rPr>
+        <w:t>.date_acte_notarie|d }}</w:t>
       </w:r>
     </w:p>
     <w:p>
@@ -10869,11 +11410,19 @@
       </w:r>
       <w:bookmarkStart w:id="57" w:name="Notaire"/>
       <w:bookmarkEnd w:id="57"/>
-      <w:r>
-        <w:rPr>
-          <w:rFonts w:ascii="TimesNewRomanPSMT" w:hAnsi="TimesNewRomanPSMT" w:cs="TimesNewRomanPSMT"/>
-        </w:rPr>
-        <w:t>{{ programme.reference_notaire</w:t>
+      <w:proofErr w:type="gramStart"/>
+      <w:r>
+        <w:rPr>
+          <w:rFonts w:ascii="TimesNewRomanPSMT" w:hAnsi="TimesNewRomanPSMT" w:cs="TimesNewRomanPSMT"/>
+        </w:rPr>
+        <w:t>{{ programme</w:t>
+      </w:r>
+      <w:proofErr w:type="gramEnd"/>
+      <w:r>
+        <w:rPr>
+          <w:rFonts w:ascii="TimesNewRomanPSMT" w:hAnsi="TimesNewRomanPSMT" w:cs="TimesNewRomanPSMT"/>
+        </w:rPr>
+        <w:t>.reference_notaire</w:t>
       </w:r>
       <w:r>
         <w:rPr>
@@ -10959,11 +11508,19 @@
       </w:r>
       <w:bookmarkStart w:id="58" w:name="Refpublic"/>
       <w:bookmarkEnd w:id="58"/>
-      <w:r>
-        <w:rPr>
-          <w:rFonts w:ascii="TimesNewRomanPSMT" w:hAnsi="TimesNewRomanPSMT" w:cs="TimesNewRomanPSMT"/>
-        </w:rPr>
-        <w:t>{{ programme.reference_publication_acte</w:t>
+      <w:proofErr w:type="gramStart"/>
+      <w:r>
+        <w:rPr>
+          <w:rFonts w:ascii="TimesNewRomanPSMT" w:hAnsi="TimesNewRomanPSMT" w:cs="TimesNewRomanPSMT"/>
+        </w:rPr>
+        <w:t>{{ programme</w:t>
+      </w:r>
+      <w:proofErr w:type="gramEnd"/>
+      <w:r>
+        <w:rPr>
+          <w:rFonts w:ascii="TimesNewRomanPSMT" w:hAnsi="TimesNewRomanPSMT" w:cs="TimesNewRomanPSMT"/>
+        </w:rPr>
+        <w:t>.reference_publication_acte</w:t>
       </w:r>
       <w:r>
         <w:rPr>
@@ -10983,30 +11540,27 @@
         <w:jc w:val="both"/>
         <w:rPr>
           <w:rFonts w:ascii="TimesNewRomanPSMT" w:hAnsi="TimesNewRomanPSMT" w:cs="TimesNewRomanPSMT"/>
-        </w:rPr>
-      </w:pPr>
-      <w:r>
-        <w:rPr>
-          <w:rFonts w:ascii="TimesNewRomanPSMT" w:hAnsi="TimesNewRomanPSMT" w:cs="TimesNewRomanPSMT"/>
-        </w:rPr>
-        <w:t xml:space="preserve">{% for image in </w:t>
-      </w:r>
-      <w:r>
-        <w:rPr>
-          <w:rFonts w:ascii="TimesNewRomanPSMT" w:hAnsi="TimesNewRomanPSMT" w:cs="TimesNewRomanPSMT"/>
-        </w:rPr>
-        <w:t>reference_publication</w:t>
-      </w:r>
-      <w:r>
-        <w:rPr>
-          <w:rFonts w:ascii="TimesNewRomanPSMT" w:hAnsi="TimesNewRomanPSMT" w:cs="TimesNewRomanPSMT"/>
           <w:lang w:val="en-US"/>
         </w:rPr>
+      </w:pPr>
+      <w:r>
+        <w:rPr>
+          <w:rFonts w:ascii="TimesNewRomanPSMT" w:hAnsi="TimesNewRomanPSMT" w:cs="TimesNewRomanPSMT"/>
+          <w:lang w:val="en-US"/>
+        </w:rPr>
+        <w:t>{% for image in reference_publication</w:t>
+      </w:r>
+      <w:r>
+        <w:rPr>
+          <w:rFonts w:ascii="TimesNewRomanPSMT" w:hAnsi="TimesNewRomanPSMT" w:cs="TimesNewRomanPSMT"/>
+          <w:lang w:val="en-US"/>
+        </w:rPr>
         <w:t>_acte</w:t>
       </w:r>
       <w:r>
         <w:rPr>
           <w:rFonts w:ascii="TimesNewRomanPSMT" w:hAnsi="TimesNewRomanPSMT" w:cs="TimesNewRomanPSMT"/>
+          <w:lang w:val="en-US"/>
         </w:rPr>
         <w:t>_images %}</w:t>
       </w:r>
@@ -11081,30 +11635,52 @@
       </w:r>
       <w:bookmarkStart w:id="59" w:name="PC"/>
       <w:bookmarkEnd w:id="59"/>
-      <w:r>
-        <w:rPr>
-          <w:rFonts w:ascii="TimesNewRomanPSMT" w:hAnsi="TimesNewRomanPSMT" w:cs="TimesNewRomanPSMT"/>
-        </w:rPr>
-        <w:t>{{ programme.permis_construire or ‘’ }}</w:t>
-      </w:r>
-    </w:p>
-    <w:p>
-      <w:pPr>
-        <w:jc w:val="both"/>
-        <w:rPr>
-          <w:rFonts w:ascii="TimesNewRomanPSMT" w:hAnsi="TimesNewRomanPSMT" w:cs="TimesNewRomanPSMT"/>
-        </w:rPr>
-      </w:pPr>
-    </w:p>
-    <w:p>
-      <w:pPr>
-        <w:jc w:val="both"/>
-      </w:pPr>
-      <w:r>
-        <w:rPr>
-          <w:rFonts w:ascii="TimesNewRomanPSMT" w:hAnsi="TimesNewRomanPSMT" w:cs="TimesNewRomanPSMT"/>
-        </w:rPr>
-        <w:t>5.2. Date prévisible ou effective d'achèvement des travaux de construction ou d'amélioration : {{ programme.date_achevement_compile|d }}</w:t>
+      <w:proofErr w:type="gramStart"/>
+      <w:r>
+        <w:rPr>
+          <w:rFonts w:ascii="TimesNewRomanPSMT" w:hAnsi="TimesNewRomanPSMT" w:cs="TimesNewRomanPSMT"/>
+        </w:rPr>
+        <w:t>{{ programme</w:t>
+      </w:r>
+      <w:proofErr w:type="gramEnd"/>
+      <w:r>
+        <w:rPr>
+          <w:rFonts w:ascii="TimesNewRomanPSMT" w:hAnsi="TimesNewRomanPSMT" w:cs="TimesNewRomanPSMT"/>
+        </w:rPr>
+        <w:t>.permis_construire or ‘’ }}</w:t>
+      </w:r>
+    </w:p>
+    <w:p>
+      <w:pPr>
+        <w:jc w:val="both"/>
+        <w:rPr>
+          <w:rFonts w:ascii="TimesNewRomanPSMT" w:hAnsi="TimesNewRomanPSMT" w:cs="TimesNewRomanPSMT"/>
+        </w:rPr>
+      </w:pPr>
+    </w:p>
+    <w:p>
+      <w:pPr>
+        <w:jc w:val="both"/>
+      </w:pPr>
+      <w:r>
+        <w:rPr>
+          <w:rFonts w:ascii="TimesNewRomanPSMT" w:hAnsi="TimesNewRomanPSMT" w:cs="TimesNewRomanPSMT"/>
+        </w:rPr>
+        <w:t xml:space="preserve">5.2. Date prévisible ou effective d'achèvement des travaux de construction ou d'amélioration : </w:t>
+      </w:r>
+      <w:proofErr w:type="gramStart"/>
+      <w:r>
+        <w:rPr>
+          <w:rFonts w:ascii="TimesNewRomanPSMT" w:hAnsi="TimesNewRomanPSMT" w:cs="TimesNewRomanPSMT"/>
+        </w:rPr>
+        <w:t>{{ programme</w:t>
+      </w:r>
+      <w:proofErr w:type="gramEnd"/>
+      <w:r>
+        <w:rPr>
+          <w:rFonts w:ascii="TimesNewRomanPSMT" w:hAnsi="TimesNewRomanPSMT" w:cs="TimesNewRomanPSMT"/>
+        </w:rPr>
+        <w:t>.date_achevement_compile|d }}</w:t>
       </w:r>
     </w:p>
     <w:p>
@@ -11127,31 +11703,41 @@
       </w:r>
       <w:bookmarkStart w:id="60" w:name="Achat"/>
       <w:bookmarkEnd w:id="60"/>
-      <w:r>
-        <w:rPr>
-          <w:rFonts w:ascii="TimesNewRomanPSMT" w:hAnsi="TimesNewRomanPSMT" w:cs="TimesNewRomanPSMT"/>
-        </w:rPr>
-        <w:t>{{ programme.date_achat|d }}</w:t>
-      </w:r>
-    </w:p>
-    <w:p>
-      <w:pPr>
-        <w:jc w:val="both"/>
-        <w:rPr>
-          <w:rFonts w:ascii="TimesNewRomanPSMT" w:hAnsi="TimesNewRomanPSMT" w:cs="TimesNewRomanPSMT"/>
-        </w:rPr>
-      </w:pPr>
-    </w:p>
-    <w:p>
-      <w:pPr>
-        <w:jc w:val="both"/>
-        <w:rPr>
-          <w:rFonts w:ascii="TimesNewRomanPSMT" w:hAnsi="TimesNewRomanPSMT" w:cs="TimesNewRomanPSMT"/>
-        </w:rPr>
-      </w:pPr>
-      <w:r>
-        <w:rPr>
-          <w:rFonts w:ascii="TimesNewRomanPSMT" w:hAnsi="TimesNewRomanPSMT" w:cs="TimesNewRomanPSMT"/>
+      <w:proofErr w:type="gramStart"/>
+      <w:r>
+        <w:rPr>
+          <w:rFonts w:ascii="TimesNewRomanPSMT" w:hAnsi="TimesNewRomanPSMT" w:cs="TimesNewRomanPSMT"/>
+        </w:rPr>
+        <w:t>{{ programme</w:t>
+      </w:r>
+      <w:proofErr w:type="gramEnd"/>
+      <w:r>
+        <w:rPr>
+          <w:rFonts w:ascii="TimesNewRomanPSMT" w:hAnsi="TimesNewRomanPSMT" w:cs="TimesNewRomanPSMT"/>
+        </w:rPr>
+        <w:t>.date_achat|d }}</w:t>
+      </w:r>
+    </w:p>
+    <w:p>
+      <w:pPr>
+        <w:jc w:val="both"/>
+        <w:rPr>
+          <w:rFonts w:ascii="TimesNewRomanPSMT" w:hAnsi="TimesNewRomanPSMT" w:cs="TimesNewRomanPSMT"/>
+        </w:rPr>
+      </w:pPr>
+    </w:p>
+    <w:p>
+      <w:pPr>
+        <w:jc w:val="both"/>
+        <w:rPr>
+          <w:rFonts w:ascii="TimesNewRomanPSMT" w:hAnsi="TimesNewRomanPSMT" w:cs="TimesNewRomanPSMT"/>
+          <w:lang w:val="en-US"/>
+        </w:rPr>
+      </w:pPr>
+      <w:r>
+        <w:rPr>
+          <w:rFonts w:ascii="TimesNewRomanPSMT" w:hAnsi="TimesNewRomanPSMT" w:cs="TimesNewRomanPSMT"/>
+          <w:lang w:val="en-US"/>
         </w:rPr>
         <w:t>5.4. Modalités de financement.</w:t>
       </w:r>
@@ -11161,24 +11747,20 @@
         <w:jc w:val="both"/>
         <w:rPr>
           <w:rFonts w:ascii="TimesNewRomanPSMT" w:hAnsi="TimesNewRomanPSMT" w:cs="TimesNewRomanPSMT"/>
-        </w:rPr>
-      </w:pPr>
-      <w:r>
-        <w:rPr>
-          <w:rFonts w:ascii="TimesNewRomanPSMT" w:hAnsi="TimesNewRomanPSMT" w:cs="TimesNewRomanPSMT"/>
-        </w:rPr>
-        <w:t>{% if prets_cdc.count() %}</w:t>
-      </w:r>
-      <w:r>
-        <w:rPr>
-          <w:rFonts w:ascii="TimesNewRomanPSMT" w:hAnsi="TimesNewRomanPSMT" w:cs="TimesNewRomanPSMT"/>
-        </w:rPr>
-        <w:t>{% for p in prets_cdc %}</w:t>
-      </w:r>
-    </w:p>
-    <w:p>
-      <w:pPr>
-        <w:pStyle w:val="Paragraphedeliste"/>
+          <w:lang w:val="en-US"/>
+        </w:rPr>
+      </w:pPr>
+      <w:r>
+        <w:rPr>
+          <w:rFonts w:ascii="TimesNewRomanPSMT" w:hAnsi="TimesNewRomanPSMT" w:cs="TimesNewRomanPSMT"/>
+          <w:lang w:val="en-US"/>
+        </w:rPr>
+        <w:t>{% if prets_cdc.count() %}{% for p in prets_cdc %}</w:t>
+      </w:r>
+    </w:p>
+    <w:p>
+      <w:pPr>
+        <w:pStyle w:val="ListParagraph"/>
         <w:numPr>
           <w:ilvl w:val="0"/>
           <w:numId w:val="3"/>
@@ -11193,12 +11775,26 @@
           <w:rFonts w:ascii="TimesNewRomanPSMT" w:hAnsi="TimesNewRomanPSMT" w:cs="TimesNewRomanPSMT"/>
         </w:rPr>
         <w:lastRenderedPageBreak/>
-        <w:t>Numéro : {{ p.n }}</w:t>
-      </w:r>
-    </w:p>
-    <w:p>
-      <w:pPr>
-        <w:pStyle w:val="Paragraphedeliste"/>
+        <w:t xml:space="preserve">Numéro : </w:t>
+      </w:r>
+      <w:proofErr w:type="gramStart"/>
+      <w:r>
+        <w:rPr>
+          <w:rFonts w:ascii="TimesNewRomanPSMT" w:hAnsi="TimesNewRomanPSMT" w:cs="TimesNewRomanPSMT"/>
+        </w:rPr>
+        <w:t>{{ p.n</w:t>
+      </w:r>
+      <w:proofErr w:type="gramEnd"/>
+      <w:r>
+        <w:rPr>
+          <w:rFonts w:ascii="TimesNewRomanPSMT" w:hAnsi="TimesNewRomanPSMT" w:cs="TimesNewRomanPSMT"/>
+        </w:rPr>
+        <w:t xml:space="preserve"> }}</w:t>
+      </w:r>
+    </w:p>
+    <w:p>
+      <w:pPr>
+        <w:pStyle w:val="ListParagraph"/>
         <w:numPr>
           <w:ilvl w:val="0"/>
           <w:numId w:val="3"/>
@@ -11212,12 +11808,26 @@
         <w:rPr>
           <w:rFonts w:ascii="TimesNewRomanPSMT" w:hAnsi="TimesNewRomanPSMT" w:cs="TimesNewRomanPSMT"/>
         </w:rPr>
-        <w:t>Date d’octroi : {{ p.do|sd }}</w:t>
-      </w:r>
-    </w:p>
-    <w:p>
-      <w:pPr>
-        <w:pStyle w:val="Paragraphedeliste"/>
+        <w:t xml:space="preserve">Date d’octroi : </w:t>
+      </w:r>
+      <w:proofErr w:type="gramStart"/>
+      <w:r>
+        <w:rPr>
+          <w:rFonts w:ascii="TimesNewRomanPSMT" w:hAnsi="TimesNewRomanPSMT" w:cs="TimesNewRomanPSMT"/>
+        </w:rPr>
+        <w:t>{{ p</w:t>
+      </w:r>
+      <w:proofErr w:type="gramEnd"/>
+      <w:r>
+        <w:rPr>
+          <w:rFonts w:ascii="TimesNewRomanPSMT" w:hAnsi="TimesNewRomanPSMT" w:cs="TimesNewRomanPSMT"/>
+        </w:rPr>
+        <w:t>.do|sd }}</w:t>
+      </w:r>
+    </w:p>
+    <w:p>
+      <w:pPr>
+        <w:pStyle w:val="ListParagraph"/>
         <w:numPr>
           <w:ilvl w:val="0"/>
           <w:numId w:val="3"/>
@@ -11227,16 +11837,24 @@
           <w:rFonts w:ascii="TimesNewRomanPSMT" w:hAnsi="TimesNewRomanPSMT" w:cs="TimesNewRomanPSMT"/>
         </w:rPr>
       </w:pPr>
-      <w:r>
-        <w:rPr>
-          <w:rFonts w:ascii="TimesNewRomanPSMT" w:hAnsi="TimesNewRomanPSMT" w:cs="TimesNewRomanPSMT"/>
-        </w:rPr>
-        <w:t>Durée: {{ p.d }} an{{ p.d|pl }}</w:t>
-      </w:r>
-    </w:p>
-    <w:p>
-      <w:pPr>
-        <w:pStyle w:val="Paragraphedeliste"/>
+      <w:proofErr w:type="gramStart"/>
+      <w:r>
+        <w:rPr>
+          <w:rFonts w:ascii="TimesNewRomanPSMT" w:hAnsi="TimesNewRomanPSMT" w:cs="TimesNewRomanPSMT"/>
+        </w:rPr>
+        <w:t>Durée:</w:t>
+      </w:r>
+      <w:proofErr w:type="gramEnd"/>
+      <w:r>
+        <w:rPr>
+          <w:rFonts w:ascii="TimesNewRomanPSMT" w:hAnsi="TimesNewRomanPSMT" w:cs="TimesNewRomanPSMT"/>
+        </w:rPr>
+        <w:t xml:space="preserve"> {{ p.d }} an{{ p.d|pl }}</w:t>
+      </w:r>
+    </w:p>
+    <w:p>
+      <w:pPr>
+        <w:pStyle w:val="ListParagraph"/>
         <w:numPr>
           <w:ilvl w:val="0"/>
           <w:numId w:val="3"/>
@@ -11250,12 +11868,26 @@
         <w:rPr>
           <w:rFonts w:ascii="TimesNewRomanPSMT" w:hAnsi="TimesNewRomanPSMT" w:cs="TimesNewRomanPSMT"/>
         </w:rPr>
-        <w:t>Montant : {{ p.m|f }} €</w:t>
-      </w:r>
-    </w:p>
-    <w:p>
-      <w:pPr>
-        <w:pStyle w:val="Paragraphedeliste"/>
+        <w:t xml:space="preserve">Montant : </w:t>
+      </w:r>
+      <w:proofErr w:type="gramStart"/>
+      <w:r>
+        <w:rPr>
+          <w:rFonts w:ascii="TimesNewRomanPSMT" w:hAnsi="TimesNewRomanPSMT" w:cs="TimesNewRomanPSMT"/>
+        </w:rPr>
+        <w:t>{{ p</w:t>
+      </w:r>
+      <w:proofErr w:type="gramEnd"/>
+      <w:r>
+        <w:rPr>
+          <w:rFonts w:ascii="TimesNewRomanPSMT" w:hAnsi="TimesNewRomanPSMT" w:cs="TimesNewRomanPSMT"/>
+        </w:rPr>
+        <w:t>.m|f }} €</w:t>
+      </w:r>
+    </w:p>
+    <w:p>
+      <w:pPr>
+        <w:pStyle w:val="ListParagraph"/>
         <w:numPr>
           <w:ilvl w:val="0"/>
           <w:numId w:val="3"/>
@@ -11269,7 +11901,21 @@
         <w:rPr>
           <w:rFonts w:ascii="TimesNewRomanPSMT" w:hAnsi="TimesNewRomanPSMT" w:cs="TimesNewRomanPSMT"/>
         </w:rPr>
-        <w:t>Prêteur : {{ p.p_full() }}</w:t>
+        <w:t xml:space="preserve">Prêteur : </w:t>
+      </w:r>
+      <w:proofErr w:type="gramStart"/>
+      <w:r>
+        <w:rPr>
+          <w:rFonts w:ascii="TimesNewRomanPSMT" w:hAnsi="TimesNewRomanPSMT" w:cs="TimesNewRomanPSMT"/>
+        </w:rPr>
+        <w:t>{{ p.p</w:t>
+      </w:r>
+      <w:proofErr w:type="gramEnd"/>
+      <w:r>
+        <w:rPr>
+          <w:rFonts w:ascii="TimesNewRomanPSMT" w:hAnsi="TimesNewRomanPSMT" w:cs="TimesNewRomanPSMT"/>
+        </w:rPr>
+        <w:t>_full() }}</w:t>
       </w:r>
     </w:p>
     <w:p>
@@ -11285,10 +11931,22 @@
           <w:rFonts w:ascii="TimesNewRomanPSMT" w:hAnsi="TimesNewRomanPSMT" w:cs="TimesNewRomanPSMT"/>
           <w:lang w:val="en-US"/>
         </w:rPr>
-        <w:t>{% endfor %}</w:t>
-      </w:r>
-      <w:r>
-        <w:t>{% endif %}</w:t>
+        <w:t xml:space="preserve">{% endfor </w:t>
+      </w:r>
+      <w:proofErr w:type="gramStart"/>
+      <w:r>
+        <w:rPr>
+          <w:rFonts w:ascii="TimesNewRomanPSMT" w:hAnsi="TimesNewRomanPSMT" w:cs="TimesNewRomanPSMT"/>
+          <w:lang w:val="en-US"/>
+        </w:rPr>
+        <w:t>%}</w:t>
+      </w:r>
+      <w:r>
+        <w:t>{</w:t>
+      </w:r>
+      <w:proofErr w:type="gramEnd"/>
+      <w:r>
+        <w:t>% endif %}</w:t>
       </w:r>
     </w:p>
     <w:p>
@@ -11301,7 +11959,21 @@
         <w:rPr>
           <w:rFonts w:ascii="TimesNewRomanPSMT" w:hAnsi="TimesNewRomanPSMT" w:cs="TimesNewRomanPSMT"/>
         </w:rPr>
-        <w:t>{% if autres_prets.count() %}</w:t>
+        <w:t>{% if autres_</w:t>
+      </w:r>
+      <w:proofErr w:type="gramStart"/>
+      <w:r>
+        <w:rPr>
+          <w:rFonts w:ascii="TimesNewRomanPSMT" w:hAnsi="TimesNewRomanPSMT" w:cs="TimesNewRomanPSMT"/>
+        </w:rPr>
+        <w:t>prets.count</w:t>
+      </w:r>
+      <w:proofErr w:type="gramEnd"/>
+      <w:r>
+        <w:rPr>
+          <w:rFonts w:ascii="TimesNewRomanPSMT" w:hAnsi="TimesNewRomanPSMT" w:cs="TimesNewRomanPSMT"/>
+        </w:rPr>
+        <w:t>() %}</w:t>
       </w:r>
       <w:r>
         <w:rPr>
@@ -11327,6 +11999,7 @@
       <w:r>
         <w:rPr>
           <w:rFonts w:ascii="TimesNewRomanPSMT" w:hAnsi="TimesNewRomanPSMT" w:cs="TimesNewRomanPSMT"/>
+          <w:lang w:val="en-US"/>
         </w:rPr>
         <w:t xml:space="preserve">{% for p in </w:t>
       </w:r>
@@ -11347,20 +12020,37 @@
       <w:r>
         <w:rPr>
           <w:rFonts w:ascii="TimesNewRomanPSMT" w:hAnsi="TimesNewRomanPSMT" w:cs="TimesNewRomanPSMT"/>
-        </w:rPr>
-        <w:t>prets %}</w:t>
-      </w:r>
-      <w:r>
-        <w:rPr>
-          <w:rFonts w:ascii="TimesNewRomanPSMT" w:hAnsi="TimesNewRomanPSMT" w:cs="TimesNewRomanPSMT"/>
           <w:lang w:val="en-US"/>
         </w:rPr>
-        <w:t>{% if p.n %}</w:t>
-      </w:r>
-    </w:p>
-    <w:p>
-      <w:pPr>
-        <w:pStyle w:val="Paragraphedeliste"/>
+        <w:t xml:space="preserve">prets </w:t>
+      </w:r>
+      <w:proofErr w:type="gramStart"/>
+      <w:r>
+        <w:rPr>
+          <w:rFonts w:ascii="TimesNewRomanPSMT" w:hAnsi="TimesNewRomanPSMT" w:cs="TimesNewRomanPSMT"/>
+          <w:lang w:val="en-US"/>
+        </w:rPr>
+        <w:t>%}</w:t>
+      </w:r>
+      <w:r>
+        <w:rPr>
+          <w:rFonts w:ascii="TimesNewRomanPSMT" w:hAnsi="TimesNewRomanPSMT" w:cs="TimesNewRomanPSMT"/>
+          <w:lang w:val="en-US"/>
+        </w:rPr>
+        <w:t>{</w:t>
+      </w:r>
+      <w:proofErr w:type="gramEnd"/>
+      <w:r>
+        <w:rPr>
+          <w:rFonts w:ascii="TimesNewRomanPSMT" w:hAnsi="TimesNewRomanPSMT" w:cs="TimesNewRomanPSMT"/>
+          <w:lang w:val="en-US"/>
+        </w:rPr>
+        <w:t>% if p.n %}</w:t>
+      </w:r>
+    </w:p>
+    <w:p>
+      <w:pPr>
+        <w:pStyle w:val="ListParagraph"/>
         <w:numPr>
           <w:ilvl w:val="0"/>
           <w:numId w:val="3"/>
@@ -11371,14 +12061,26 @@
           <w:lang w:val="en-US"/>
         </w:rPr>
       </w:pPr>
+      <w:proofErr w:type="gramStart"/>
       <w:r>
         <w:rPr>
           <w:rFonts w:ascii="TimesNewRomanPSMT" w:hAnsi="TimesNewRomanPSMT" w:cs="TimesNewRomanPSMT"/>
           <w:lang w:val="en-US"/>
         </w:rPr>
-        <w:t>Numéro : {{ p.n }}</w:t>
-      </w:r>
-      <w:r>
+        <w:t>Numéro :</w:t>
+      </w:r>
+      <w:proofErr w:type="gramEnd"/>
+      <w:r>
+        <w:rPr>
+          <w:rFonts w:ascii="TimesNewRomanPSMT" w:hAnsi="TimesNewRomanPSMT" w:cs="TimesNewRomanPSMT"/>
+          <w:lang w:val="en-US"/>
+        </w:rPr>
+        <w:t xml:space="preserve"> {{ p.n }}</w:t>
+      </w:r>
+      <w:r>
+        <w:rPr>
+          <w:lang w:val="en-US"/>
+        </w:rPr>
         <w:t>{% endif %}</w:t>
       </w:r>
       <w:r>
@@ -11405,7 +12107,7 @@
     </w:p>
     <w:p>
       <w:pPr>
-        <w:pStyle w:val="Paragraphedeliste"/>
+        <w:pStyle w:val="ListParagraph"/>
         <w:numPr>
           <w:ilvl w:val="0"/>
           <w:numId w:val="3"/>
@@ -11421,9 +12123,28 @@
           <w:rFonts w:ascii="TimesNewRomanPSMT" w:hAnsi="TimesNewRomanPSMT" w:cs="TimesNewRomanPSMT"/>
           <w:lang w:val="en-US"/>
         </w:rPr>
-        <w:t>Date d’octroi : {{ p.do|sd }}</w:t>
-      </w:r>
-      <w:r>
+        <w:t xml:space="preserve">Date </w:t>
+      </w:r>
+      <w:proofErr w:type="gramStart"/>
+      <w:r>
+        <w:rPr>
+          <w:rFonts w:ascii="TimesNewRomanPSMT" w:hAnsi="TimesNewRomanPSMT" w:cs="TimesNewRomanPSMT"/>
+          <w:lang w:val="en-US"/>
+        </w:rPr>
+        <w:t>d’octroi :</w:t>
+      </w:r>
+      <w:proofErr w:type="gramEnd"/>
+      <w:r>
+        <w:rPr>
+          <w:rFonts w:ascii="TimesNewRomanPSMT" w:hAnsi="TimesNewRomanPSMT" w:cs="TimesNewRomanPSMT"/>
+          <w:lang w:val="en-US"/>
+        </w:rPr>
+        <w:t xml:space="preserve"> {{ p.do|sd }}</w:t>
+      </w:r>
+      <w:r>
+        <w:rPr>
+          <w:lang w:val="en-US"/>
+        </w:rPr>
         <w:t>{% endif %}</w:t>
       </w:r>
       <w:r>
@@ -11450,7 +12171,7 @@
     </w:p>
     <w:p>
       <w:pPr>
-        <w:pStyle w:val="Paragraphedeliste"/>
+        <w:pStyle w:val="ListParagraph"/>
         <w:numPr>
           <w:ilvl w:val="0"/>
           <w:numId w:val="3"/>
@@ -11461,18 +12182,27 @@
           <w:lang w:val="en-US"/>
         </w:rPr>
       </w:pPr>
+      <w:proofErr w:type="gramStart"/>
       <w:r>
         <w:rPr>
           <w:rFonts w:ascii="TimesNewRomanPSMT" w:hAnsi="TimesNewRomanPSMT" w:cs="TimesNewRomanPSMT"/>
           <w:lang w:val="en-US"/>
         </w:rPr>
-        <w:t xml:space="preserve">Durée : {{ p.d }} </w:t>
-      </w:r>
+        <w:t>Durée :</w:t>
+      </w:r>
+      <w:proofErr w:type="gramEnd"/>
       <w:r>
         <w:rPr>
           <w:rFonts w:ascii="TimesNewRomanPSMT" w:hAnsi="TimesNewRomanPSMT" w:cs="TimesNewRomanPSMT"/>
           <w:lang w:val="en-US"/>
         </w:rPr>
+        <w:t xml:space="preserve"> {{ p.d }} </w:t>
+      </w:r>
+      <w:r>
+        <w:rPr>
+          <w:rFonts w:ascii="TimesNewRomanPSMT" w:hAnsi="TimesNewRomanPSMT" w:cs="TimesNewRomanPSMT"/>
+          <w:lang w:val="en-US"/>
+        </w:rPr>
         <w:t>an</w:t>
       </w:r>
       <w:r>
@@ -11483,6 +12213,9 @@
         <w:t>{{ p.d|pl }}</w:t>
       </w:r>
       <w:r>
+        <w:rPr>
+          <w:lang w:val="en-US"/>
+        </w:rPr>
         <w:t>{% endif %}</w:t>
       </w:r>
       <w:r>
@@ -11495,7 +12228,7 @@
     </w:p>
     <w:p>
       <w:pPr>
-        <w:pStyle w:val="Paragraphedeliste"/>
+        <w:pStyle w:val="ListParagraph"/>
         <w:numPr>
           <w:ilvl w:val="0"/>
           <w:numId w:val="3"/>
@@ -11506,21 +12239,33 @@
           <w:lang w:val="en-US"/>
         </w:rPr>
       </w:pPr>
+      <w:proofErr w:type="gramStart"/>
       <w:r>
         <w:rPr>
           <w:rFonts w:ascii="TimesNewRomanPSMT" w:hAnsi="TimesNewRomanPSMT" w:cs="TimesNewRomanPSMT"/>
           <w:lang w:val="en-US"/>
         </w:rPr>
-        <w:t>Montant : {{ p.m|f }}</w:t>
-      </w:r>
+        <w:t>Montant :</w:t>
+      </w:r>
+      <w:proofErr w:type="gramEnd"/>
       <w:r>
         <w:rPr>
           <w:rFonts w:ascii="TimesNewRomanPSMT" w:hAnsi="TimesNewRomanPSMT" w:cs="TimesNewRomanPSMT"/>
           <w:lang w:val="en-US"/>
         </w:rPr>
+        <w:t xml:space="preserve"> {{ p.m|f }}</w:t>
+      </w:r>
+      <w:r>
+        <w:rPr>
+          <w:rFonts w:ascii="TimesNewRomanPSMT" w:hAnsi="TimesNewRomanPSMT" w:cs="TimesNewRomanPSMT"/>
+          <w:lang w:val="en-US"/>
+        </w:rPr>
         <w:t xml:space="preserve"> €</w:t>
       </w:r>
       <w:r>
+        <w:rPr>
+          <w:lang w:val="en-US"/>
+        </w:rPr>
         <w:t>{% endif %}</w:t>
       </w:r>
       <w:r>
@@ -11547,7 +12292,7 @@
     </w:p>
     <w:p>
       <w:pPr>
-        <w:pStyle w:val="Paragraphedeliste"/>
+        <w:pStyle w:val="ListParagraph"/>
         <w:numPr>
           <w:ilvl w:val="0"/>
           <w:numId w:val="3"/>
@@ -11561,7 +12306,21 @@
         <w:rPr>
           <w:rFonts w:ascii="TimesNewRomanPSMT" w:hAnsi="TimesNewRomanPSMT" w:cs="TimesNewRomanPSMT"/>
         </w:rPr>
-        <w:t>Prêteur : {{ p.preteur_display() }}</w:t>
+        <w:t xml:space="preserve">Prêteur : </w:t>
+      </w:r>
+      <w:proofErr w:type="gramStart"/>
+      <w:r>
+        <w:rPr>
+          <w:rFonts w:ascii="TimesNewRomanPSMT" w:hAnsi="TimesNewRomanPSMT" w:cs="TimesNewRomanPSMT"/>
+        </w:rPr>
+        <w:t>{{ p</w:t>
+      </w:r>
+      <w:proofErr w:type="gramEnd"/>
+      <w:r>
+        <w:rPr>
+          <w:rFonts w:ascii="TimesNewRomanPSMT" w:hAnsi="TimesNewRomanPSMT" w:cs="TimesNewRomanPSMT"/>
+        </w:rPr>
+        <w:t>.preteur_display() }}</w:t>
       </w:r>
       <w:r>
         <w:t>{% endif %}</w:t>
@@ -11578,10 +12337,21 @@
         <w:rPr>
           <w:rFonts w:ascii="TimesNewRomanPSMT" w:hAnsi="TimesNewRomanPSMT" w:cs="TimesNewRomanPSMT"/>
         </w:rPr>
-        <w:t>{% endfor %}</w:t>
-      </w:r>
-      <w:r>
-        <w:t>{% endif %}</w:t>
+        <w:t xml:space="preserve">{% endfor </w:t>
+      </w:r>
+      <w:proofErr w:type="gramStart"/>
+      <w:r>
+        <w:rPr>
+          <w:rFonts w:ascii="TimesNewRomanPSMT" w:hAnsi="TimesNewRomanPSMT" w:cs="TimesNewRomanPSMT"/>
+        </w:rPr>
+        <w:t>%}</w:t>
+      </w:r>
+      <w:r>
+        <w:t>{</w:t>
+      </w:r>
+      <w:proofErr w:type="gramEnd"/>
+      <w:r>
+        <w:t>% endif %}</w:t>
       </w:r>
     </w:p>
     <w:p>
@@ -11597,32 +12367,60 @@
         <w:rPr>
           <w:rFonts w:ascii="TimesNewRomanPSMT" w:hAnsi="TimesNewRomanPSMT" w:cs="TimesNewRomanPSMT"/>
         </w:rPr>
-        <w:t>{% if convention.fond_propre %}Fond propre : {{ convention.fond_propre|f }} €</w:t>
-      </w:r>
-    </w:p>
-    <w:p>
-      <w:pPr>
-        <w:jc w:val="both"/>
-        <w:rPr>
-          <w:rFonts w:ascii="TimesNewRomanPSMT" w:hAnsi="TimesNewRomanPSMT" w:cs="TimesNewRomanPSMT"/>
-        </w:rPr>
-      </w:pPr>
-    </w:p>
-    <w:p>
-      <w:pPr>
-        <w:jc w:val="both"/>
-      </w:pPr>
-      <w:r>
-        <w:rPr>
-          <w:rFonts w:ascii="TimesNewRomanPSMT" w:hAnsi="TimesNewRomanPSMT" w:cs="TimesNewRomanPSMT"/>
-        </w:rPr>
-        <w:t>{% endif %}</w:t>
-      </w:r>
-      <w:r>
-        <w:rPr>
-          <w:rFonts w:ascii="TimesNewRomanPSMT" w:hAnsi="TimesNewRomanPSMT" w:cs="TimesNewRomanPSMT"/>
-        </w:rPr>
-        <w:t xml:space="preserve">Date d'achèvement de la construction ou certificat de conformité : </w:t>
+        <w:t xml:space="preserve">{% if </w:t>
+      </w:r>
+      <w:proofErr w:type="gramStart"/>
+      <w:r>
+        <w:rPr>
+          <w:rFonts w:ascii="TimesNewRomanPSMT" w:hAnsi="TimesNewRomanPSMT" w:cs="TimesNewRomanPSMT"/>
+        </w:rPr>
+        <w:t>convention.fond</w:t>
+      </w:r>
+      <w:proofErr w:type="gramEnd"/>
+      <w:r>
+        <w:rPr>
+          <w:rFonts w:ascii="TimesNewRomanPSMT" w:hAnsi="TimesNewRomanPSMT" w:cs="TimesNewRomanPSMT"/>
+        </w:rPr>
+        <w:t>_propre %}Fond propre : {{ convention.fond_propre|f }} €</w:t>
+      </w:r>
+    </w:p>
+    <w:p>
+      <w:pPr>
+        <w:jc w:val="both"/>
+        <w:rPr>
+          <w:rFonts w:ascii="TimesNewRomanPSMT" w:hAnsi="TimesNewRomanPSMT" w:cs="TimesNewRomanPSMT"/>
+        </w:rPr>
+      </w:pPr>
+    </w:p>
+    <w:p>
+      <w:pPr>
+        <w:jc w:val="both"/>
+      </w:pPr>
+      <w:r>
+        <w:rPr>
+          <w:rFonts w:ascii="TimesNewRomanPSMT" w:hAnsi="TimesNewRomanPSMT" w:cs="TimesNewRomanPSMT"/>
+        </w:rPr>
+        <w:t xml:space="preserve">{% endif </w:t>
+      </w:r>
+      <w:proofErr w:type="gramStart"/>
+      <w:r>
+        <w:rPr>
+          <w:rFonts w:ascii="TimesNewRomanPSMT" w:hAnsi="TimesNewRomanPSMT" w:cs="TimesNewRomanPSMT"/>
+        </w:rPr>
+        <w:t>%}</w:t>
+      </w:r>
+      <w:r>
+        <w:rPr>
+          <w:rFonts w:ascii="TimesNewRomanPSMT" w:hAnsi="TimesNewRomanPSMT" w:cs="TimesNewRomanPSMT"/>
+        </w:rPr>
+        <w:t>Date</w:t>
+      </w:r>
+      <w:proofErr w:type="gramEnd"/>
+      <w:r>
+        <w:rPr>
+          <w:rFonts w:ascii="TimesNewRomanPSMT" w:hAnsi="TimesNewRomanPSMT" w:cs="TimesNewRomanPSMT"/>
+        </w:rPr>
+        <w:t xml:space="preserve"> d'achèvement de la construction ou certificat de conformité : </w:t>
       </w:r>
       <w:bookmarkStart w:id="63" w:name="Construc"/>
       <w:bookmarkEnd w:id="63"/>
@@ -11692,7 +12490,25 @@
                               <w:rPr>
                                 <w:rFonts w:ascii="TimesNewRomanPSMT" w:hAnsi="TimesNewRomanPSMT" w:cs="TimesNewRomanPSMT"/>
                               </w:rPr>
-                              <w:t>Fait en trois originaux à {{administration.get_ville_signature_or_empty() }}, le</w:t>
+                              <w:t xml:space="preserve">Fait en </w:t>
+                            </w:r>
+                            <w:r>
+                              <w:rPr>
+                                <w:rFonts w:ascii="TimesNewRomanPSMT" w:hAnsi="TimesNewRomanPSMT" w:cs="TimesNewRomanPSMT"/>
+                              </w:rPr>
+                              <w:t>{{ administration.nb_convention_exemplaires }}</w:t>
+                            </w:r>
+                            <w:r>
+                              <w:rPr>
+                                <w:rFonts w:ascii="TimesNewRomanPSMT" w:hAnsi="TimesNewRomanPSMT" w:cs="TimesNewRomanPSMT"/>
+                              </w:rPr>
+                              <w:t xml:space="preserve"> </w:t>
+                            </w:r>
+                            <w:r>
+                              <w:rPr>
+                                <w:rFonts w:ascii="TimesNewRomanPSMT" w:hAnsi="TimesNewRomanPSMT" w:cs="TimesNewRomanPSMT"/>
+                              </w:rPr>
+                              <w:t>originaux à {{administration.get_ville_signature_or_empty() }}, le</w:t>
                             </w:r>
                           </w:p>
                           <w:p>
@@ -11785,7 +12601,7 @@
           </mc:Choice>
           <mc:Fallback>
             <w:pict>
-              <v:shape w14:anchorId="6A4E3B60" id="Text Box 6" o:spid="_x0000_s1027" type="#_x0000_t202" style="width:411.95pt;height:213.85pt;visibility:visible;mso-wrap-style:square;mso-left-percent:-10001;mso-top-percent:-10001;mso-position-horizontal:absolute;mso-position-horizontal-relative:char;mso-position-vertical:absolute;mso-position-vertical-relative:line;mso-left-percent:-10001;mso-top-percent:-10001;v-text-anchor:top" o:gfxdata="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" fillcolor="white [3201]" stroked="f" strokeweight=".5pt">
+              <v:shape w14:anchorId="6A4E3B60" id="Text Box 6" o:spid="_x0000_s1027" type="#_x0000_t202" style="width:411.95pt;height:213.85pt;visibility:visible;mso-wrap-style:square;mso-left-percent:-10001;mso-top-percent:-10001;mso-position-horizontal:absolute;mso-position-horizontal-relative:char;mso-position-vertical:absolute;mso-position-vertical-relative:line;mso-left-percent:-10001;mso-top-percent:-10001;v-text-anchor:top" o:gfxdata="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" fillcolor="white [3201]" stroked="f" strokeweight=".5pt">
                 <v:textbox inset="0,0,0,0">
                   <w:txbxContent>
                     <w:p>
@@ -11796,7 +12612,25 @@
                         <w:rPr>
                           <w:rFonts w:ascii="TimesNewRomanPSMT" w:hAnsi="TimesNewRomanPSMT" w:cs="TimesNewRomanPSMT"/>
                         </w:rPr>
-                        <w:t>Fait en trois originaux à {{administration.get_ville_signature_or_empty() }}, le</w:t>
+                        <w:t xml:space="preserve">Fait en </w:t>
+                      </w:r>
+                      <w:r>
+                        <w:rPr>
+                          <w:rFonts w:ascii="TimesNewRomanPSMT" w:hAnsi="TimesNewRomanPSMT" w:cs="TimesNewRomanPSMT"/>
+                        </w:rPr>
+                        <w:t>{{ administration.nb_convention_exemplaires }}</w:t>
+                      </w:r>
+                      <w:r>
+                        <w:rPr>
+                          <w:rFonts w:ascii="TimesNewRomanPSMT" w:hAnsi="TimesNewRomanPSMT" w:cs="TimesNewRomanPSMT"/>
+                        </w:rPr>
+                        <w:t xml:space="preserve"> </w:t>
+                      </w:r>
+                      <w:r>
+                        <w:rPr>
+                          <w:rFonts w:ascii="TimesNewRomanPSMT" w:hAnsi="TimesNewRomanPSMT" w:cs="TimesNewRomanPSMT"/>
+                        </w:rPr>
+                        <w:t>originaux à {{administration.get_ville_signature_or_empty() }}, le</w:t>
                       </w:r>
                     </w:p>
                     <w:p>
@@ -12089,7 +12923,23 @@
           <w:szCs w:val="22"/>
         </w:rPr>
         <w:lastRenderedPageBreak/>
-        <w:t xml:space="preserve">Le Préfet, ou lorsqu'un établissement public de coopération intercommunale ou un département a signé une convention mentionnée aux articles L.301-5-1 et L.301-5-2, le président de l'établissement public de coopération intercommunale ou du conseil général, soussigné certifie la présente copie, établie </w:t>
+        <w:t xml:space="preserve">Le </w:t>
+      </w:r>
+      <w:proofErr w:type="gramStart"/>
+      <w:r>
+        <w:rPr>
+          <w:rFonts w:ascii="TimesNewRomanPSMT" w:hAnsi="TimesNewRomanPSMT" w:cs="TimesNewRomanPSMT"/>
+          <w:szCs w:val="22"/>
+        </w:rPr>
+        <w:t>Préfet</w:t>
+      </w:r>
+      <w:proofErr w:type="gramEnd"/>
+      <w:r>
+        <w:rPr>
+          <w:rFonts w:ascii="TimesNewRomanPSMT" w:hAnsi="TimesNewRomanPSMT" w:cs="TimesNewRomanPSMT"/>
+          <w:szCs w:val="22"/>
+        </w:rPr>
+        <w:t xml:space="preserve">, ou lorsqu'un établissement public de coopération intercommunale ou un département a signé une convention mentionnée aux articles L.301-5-1 et L.301-5-2, le président de l'établissement public de coopération intercommunale ou du conseil général, soussigné certifie la présente copie, établie </w:t>
       </w:r>
       <w:r>
         <w:rPr>
@@ -12188,6 +13038,7 @@
       </w:r>
       <w:bookmarkStart w:id="64" w:name="Siret2"/>
       <w:bookmarkEnd w:id="64"/>
+      <w:proofErr w:type="gramStart"/>
       <w:r>
         <w:rPr>
           <w:rFonts w:ascii="TimesNewRomanPSMT" w:hAnsi="TimesNewRomanPSMT" w:cs="TimesNewRomanPSMT"/>
@@ -12195,7 +13046,17 @@
           <w:szCs w:val="22"/>
           <w:lang w:eastAsia="fr-FR"/>
         </w:rPr>
-        <w:t>{{ bailleur.siret }}</w:t>
+        <w:t>{{ bailleur</w:t>
+      </w:r>
+      <w:proofErr w:type="gramEnd"/>
+      <w:r>
+        <w:rPr>
+          <w:rFonts w:ascii="TimesNewRomanPSMT" w:hAnsi="TimesNewRomanPSMT" w:cs="TimesNewRomanPSMT"/>
+          <w:color w:val="000000"/>
+          <w:szCs w:val="22"/>
+          <w:lang w:eastAsia="fr-FR"/>
+        </w:rPr>
+        <w:t>.siret }}</w:t>
       </w:r>
     </w:p>
     <w:p>
@@ -12262,11 +13123,19 @@
         </w:rPr>
         <w:t xml:space="preserve">A </w:t>
       </w:r>
-      <w:r>
-        <w:rPr>
-          <w:rFonts w:ascii="TimesNewRomanPSMT" w:hAnsi="TimesNewRomanPSMT" w:cs="TimesNewRomanPSMT"/>
-        </w:rPr>
-        <w:t>{{ administration.get_ville_signature_or_empty() }}</w:t>
+      <w:proofErr w:type="gramStart"/>
+      <w:r>
+        <w:rPr>
+          <w:rFonts w:ascii="TimesNewRomanPSMT" w:hAnsi="TimesNewRomanPSMT" w:cs="TimesNewRomanPSMT"/>
+        </w:rPr>
+        <w:t>{{ administration.get</w:t>
+      </w:r>
+      <w:proofErr w:type="gramEnd"/>
+      <w:r>
+        <w:rPr>
+          <w:rFonts w:ascii="TimesNewRomanPSMT" w:hAnsi="TimesNewRomanPSMT" w:cs="TimesNewRomanPSMT"/>
+        </w:rPr>
+        <w:t>_ville_signature_or_empty() }}</w:t>
       </w:r>
       <w:r>
         <w:rPr>
@@ -12324,7 +13193,7 @@
 <w:ftr xmlns:wpc="http://schemas.microsoft.com/office/word/2010/wordprocessingCanvas" xmlns:cx="http://schemas.microsoft.com/office/drawing/2014/chartex" xmlns:cx1="http://schemas.microsoft.com/office/drawing/2015/9/8/chartex" xmlns:cx2="http://schemas.microsoft.com/office/drawing/2015/10/21/chartex" xmlns:cx3="http://schemas.microsoft.com/office/drawing/2016/5/9/chartex" xmlns:cx4="http://schemas.microsoft.com/office/drawing/2016/5/10/chartex" xmlns:cx5="http://schemas.microsoft.com/office/drawing/2016/5/11/chartex" xmlns:cx6="http://schemas.microsoft.com/office/drawing/2016/5/12/chartex" xmlns:cx7="http://schemas.microsoft.com/office/drawing/2016/5/13/chartex" xmlns:cx8="http://schemas.microsoft.com/office/drawing/2016/5/14/chartex" xmlns:mc="http://schemas.openxmlformats.org/markup-compatibility/2006" xmlns:aink="http://schemas.microsoft.com/office/drawing/2016/ink" xmlns:am3d="http://schemas.microsoft.com/office/drawing/2017/model3d" xmlns:o="urn:schemas-microsoft-com:office:office" xmlns:oel="http://schemas.microsoft.com/office/2019/extlst" xmlns:r="http://schemas.openxmlformats.org/officeDocument/2006/relationships" xmlns:m="http://schemas.openxmlformats.org/officeDocument/2006/math" xmlns:v="urn:schemas-microsoft-com:vml" xmlns:wp14="http://schemas.microsoft.com/office/word/2010/wordprocessingDrawing" xmlns:wp="http://schemas.openxmlformats.org/drawingml/2006/wordprocessingDrawing" xmlns:w10="urn:schemas-microsoft-com:office:word" xmlns:w="http://schemas.openxmlformats.org/wordprocessingml/2006/main" xmlns:w14="http://schemas.microsoft.com/office/word/2010/wordml" xmlns:w15="http://schemas.microsoft.com/office/word/2012/wordml" xmlns:w16cex="http://schemas.microsoft.com/office/word/2018/wordml/cex" xmlns:w16cid="http://schemas.microsoft.com/office/word/2016/wordml/cid" xmlns:w16="http://schemas.microsoft.com/office/word/2018/wordml" xmlns:w16sdtdh="http://schemas.microsoft.com/office/word/2020/wordml/sdtdatahash" xmlns:w16se="http://schemas.microsoft.com/office/word/2015/wordml/symex" xmlns:wpg="http://schemas.microsoft.com/office/word/2010/wordprocessingGroup" xmlns:wpi="http://schemas.microsoft.com/office/word/2010/wordprocessingInk" xmlns:wne="http://schemas.microsoft.com/office/word/2006/wordml" xmlns:wps="http://schemas.microsoft.com/office/word/2010/wordprocessingShape" mc:Ignorable="w14 w15 w16se w16cid w16 w16cex w16sdtdh wp14">
   <w:p>
     <w:pPr>
-      <w:pStyle w:val="Pieddepage"/>
+      <w:pStyle w:val="Footer"/>
     </w:pPr>
     <w:r>
       <w:t xml:space="preserve"> </w:t>
@@ -12337,7 +13206,7 @@
 <w:ftr xmlns:wpc="http://schemas.microsoft.com/office/word/2010/wordprocessingCanvas" xmlns:cx="http://schemas.microsoft.com/office/drawing/2014/chartex" xmlns:cx1="http://schemas.microsoft.com/office/drawing/2015/9/8/chartex" xmlns:cx2="http://schemas.microsoft.com/office/drawing/2015/10/21/chartex" xmlns:cx3="http://schemas.microsoft.com/office/drawing/2016/5/9/chartex" xmlns:cx4="http://schemas.microsoft.com/office/drawing/2016/5/10/chartex" xmlns:cx5="http://schemas.microsoft.com/office/drawing/2016/5/11/chartex" xmlns:cx6="http://schemas.microsoft.com/office/drawing/2016/5/12/chartex" xmlns:cx7="http://schemas.microsoft.com/office/drawing/2016/5/13/chartex" xmlns:cx8="http://schemas.microsoft.com/office/drawing/2016/5/14/chartex" xmlns:mc="http://schemas.openxmlformats.org/markup-compatibility/2006" xmlns:aink="http://schemas.microsoft.com/office/drawing/2016/ink" xmlns:am3d="http://schemas.microsoft.com/office/drawing/2017/model3d" xmlns:o="urn:schemas-microsoft-com:office:office" xmlns:oel="http://schemas.microsoft.com/office/2019/extlst" xmlns:r="http://schemas.openxmlformats.org/officeDocument/2006/relationships" xmlns:m="http://schemas.openxmlformats.org/officeDocument/2006/math" xmlns:v="urn:schemas-microsoft-com:vml" xmlns:wp14="http://schemas.microsoft.com/office/word/2010/wordprocessingDrawing" xmlns:wp="http://schemas.openxmlformats.org/drawingml/2006/wordprocessingDrawing" xmlns:w10="urn:schemas-microsoft-com:office:word" xmlns:w="http://schemas.openxmlformats.org/wordprocessingml/2006/main" xmlns:w14="http://schemas.microsoft.com/office/word/2010/wordml" xmlns:w15="http://schemas.microsoft.com/office/word/2012/wordml" xmlns:w16cex="http://schemas.microsoft.com/office/word/2018/wordml/cex" xmlns:w16cid="http://schemas.microsoft.com/office/word/2016/wordml/cid" xmlns:w16="http://schemas.microsoft.com/office/word/2018/wordml" xmlns:w16sdtdh="http://schemas.microsoft.com/office/word/2020/wordml/sdtdatahash" xmlns:w16se="http://schemas.microsoft.com/office/word/2015/wordml/symex" xmlns:wpg="http://schemas.microsoft.com/office/word/2010/wordprocessingGroup" xmlns:wpi="http://schemas.microsoft.com/office/word/2010/wordprocessingInk" xmlns:wne="http://schemas.microsoft.com/office/word/2006/wordml" xmlns:wps="http://schemas.microsoft.com/office/word/2010/wordprocessingShape" mc:Ignorable="w14 w15 w16se w16cid w16 w16cex w16sdtdh wp14">
   <w:p>
     <w:pPr>
-      <w:pStyle w:val="Pieddepage"/>
+      <w:pStyle w:val="Footer"/>
     </w:pPr>
     <w:r>
       <w:t xml:space="preserve"> </w:t>
@@ -12350,7 +13219,7 @@
 <w:ftr xmlns:wpc="http://schemas.microsoft.com/office/word/2010/wordprocessingCanvas" xmlns:cx="http://schemas.microsoft.com/office/drawing/2014/chartex" xmlns:cx1="http://schemas.microsoft.com/office/drawing/2015/9/8/chartex" xmlns:cx2="http://schemas.microsoft.com/office/drawing/2015/10/21/chartex" xmlns:cx3="http://schemas.microsoft.com/office/drawing/2016/5/9/chartex" xmlns:cx4="http://schemas.microsoft.com/office/drawing/2016/5/10/chartex" xmlns:cx5="http://schemas.microsoft.com/office/drawing/2016/5/11/chartex" xmlns:cx6="http://schemas.microsoft.com/office/drawing/2016/5/12/chartex" xmlns:cx7="http://schemas.microsoft.com/office/drawing/2016/5/13/chartex" xmlns:cx8="http://schemas.microsoft.com/office/drawing/2016/5/14/chartex" xmlns:mc="http://schemas.openxmlformats.org/markup-compatibility/2006" xmlns:aink="http://schemas.microsoft.com/office/drawing/2016/ink" xmlns:am3d="http://schemas.microsoft.com/office/drawing/2017/model3d" xmlns:o="urn:schemas-microsoft-com:office:office" xmlns:oel="http://schemas.microsoft.com/office/2019/extlst" xmlns:r="http://schemas.openxmlformats.org/officeDocument/2006/relationships" xmlns:m="http://schemas.openxmlformats.org/officeDocument/2006/math" xmlns:v="urn:schemas-microsoft-com:vml" xmlns:wp14="http://schemas.microsoft.com/office/word/2010/wordprocessingDrawing" xmlns:wp="http://schemas.openxmlformats.org/drawingml/2006/wordprocessingDrawing" xmlns:w10="urn:schemas-microsoft-com:office:word" xmlns:w="http://schemas.openxmlformats.org/wordprocessingml/2006/main" xmlns:w14="http://schemas.microsoft.com/office/word/2010/wordml" xmlns:w15="http://schemas.microsoft.com/office/word/2012/wordml" xmlns:w16cex="http://schemas.microsoft.com/office/word/2018/wordml/cex" xmlns:w16cid="http://schemas.microsoft.com/office/word/2016/wordml/cid" xmlns:w16="http://schemas.microsoft.com/office/word/2018/wordml" xmlns:w16sdtdh="http://schemas.microsoft.com/office/word/2020/wordml/sdtdatahash" xmlns:w16se="http://schemas.microsoft.com/office/word/2015/wordml/symex" xmlns:wpg="http://schemas.microsoft.com/office/word/2010/wordprocessingGroup" xmlns:wpi="http://schemas.microsoft.com/office/word/2010/wordprocessingInk" xmlns:wne="http://schemas.microsoft.com/office/word/2006/wordml" xmlns:wps="http://schemas.microsoft.com/office/word/2010/wordprocessingShape" mc:Ignorable="w14 w15 w16se w16cid w16 w16cex w16sdtdh wp14">
   <w:p>
     <w:pPr>
-      <w:pStyle w:val="Pieddepage"/>
+      <w:pStyle w:val="Footer"/>
     </w:pPr>
     <w:r>
       <w:t xml:space="preserve"> </w:t>
@@ -12382,7 +13251,7 @@
 <w:hdr xmlns:wpc="http://schemas.microsoft.com/office/word/2010/wordprocessingCanvas" xmlns:cx="http://schemas.microsoft.com/office/drawing/2014/chartex" xmlns:cx1="http://schemas.microsoft.com/office/drawing/2015/9/8/chartex" xmlns:cx2="http://schemas.microsoft.com/office/drawing/2015/10/21/chartex" xmlns:cx3="http://schemas.microsoft.com/office/drawing/2016/5/9/chartex" xmlns:cx4="http://schemas.microsoft.com/office/drawing/2016/5/10/chartex" xmlns:cx5="http://schemas.microsoft.com/office/drawing/2016/5/11/chartex" xmlns:cx6="http://schemas.microsoft.com/office/drawing/2016/5/12/chartex" xmlns:cx7="http://schemas.microsoft.com/office/drawing/2016/5/13/chartex" xmlns:cx8="http://schemas.microsoft.com/office/drawing/2016/5/14/chartex" xmlns:mc="http://schemas.openxmlformats.org/markup-compatibility/2006" xmlns:aink="http://schemas.microsoft.com/office/drawing/2016/ink" xmlns:am3d="http://schemas.microsoft.com/office/drawing/2017/model3d" xmlns:o="urn:schemas-microsoft-com:office:office" xmlns:oel="http://schemas.microsoft.com/office/2019/extlst" xmlns:r="http://schemas.openxmlformats.org/officeDocument/2006/relationships" xmlns:m="http://schemas.openxmlformats.org/officeDocument/2006/math" xmlns:v="urn:schemas-microsoft-com:vml" xmlns:wp14="http://schemas.microsoft.com/office/word/2010/wordprocessingDrawing" xmlns:wp="http://schemas.openxmlformats.org/drawingml/2006/wordprocessingDrawing" xmlns:w10="urn:schemas-microsoft-com:office:word" xmlns:w="http://schemas.openxmlformats.org/wordprocessingml/2006/main" xmlns:w14="http://schemas.microsoft.com/office/word/2010/wordml" xmlns:w15="http://schemas.microsoft.com/office/word/2012/wordml" xmlns:w16cex="http://schemas.microsoft.com/office/word/2018/wordml/cex" xmlns:w16cid="http://schemas.microsoft.com/office/word/2016/wordml/cid" xmlns:w16="http://schemas.microsoft.com/office/word/2018/wordml" xmlns:w16sdtdh="http://schemas.microsoft.com/office/word/2020/wordml/sdtdatahash" xmlns:w16se="http://schemas.microsoft.com/office/word/2015/wordml/symex" xmlns:wpg="http://schemas.microsoft.com/office/word/2010/wordprocessingGroup" xmlns:wpi="http://schemas.microsoft.com/office/word/2010/wordprocessingInk" xmlns:wne="http://schemas.microsoft.com/office/word/2006/wordml" xmlns:wps="http://schemas.microsoft.com/office/word/2010/wordprocessingShape" mc:Ignorable="w14 w15 w16se w16cid w16 w16cex w16sdtdh wp14">
   <w:p>
     <w:pPr>
-      <w:pStyle w:val="En-tte"/>
+      <w:pStyle w:val="Header"/>
     </w:pPr>
     <w:r>
       <w:rPr>
@@ -12446,7 +13315,7 @@
                         <w:p>
                           <w:r>
                             <w:rPr>
-                              <w:rStyle w:val="Numrodepage"/>
+                              <w:rStyle w:val="PageNumber"/>
                               <w:sz w:val="22"/>
                               <w:szCs w:val="22"/>
                             </w:rPr>
@@ -12454,7 +13323,7 @@
                           </w:r>
                           <w:r>
                             <w:rPr>
-                              <w:rStyle w:val="Numrodepage"/>
+                              <w:rStyle w:val="PageNumber"/>
                               <w:sz w:val="22"/>
                               <w:szCs w:val="22"/>
                             </w:rPr>
@@ -12462,7 +13331,7 @@
                           </w:r>
                           <w:r>
                             <w:rPr>
-                              <w:rStyle w:val="Numrodepage"/>
+                              <w:rStyle w:val="PageNumber"/>
                               <w:sz w:val="22"/>
                               <w:szCs w:val="22"/>
                             </w:rPr>
@@ -12470,7 +13339,7 @@
                           </w:r>
                           <w:r>
                             <w:rPr>
-                              <w:rStyle w:val="Numrodepage"/>
+                              <w:rStyle w:val="PageNumber"/>
                               <w:sz w:val="22"/>
                               <w:szCs w:val="22"/>
                             </w:rPr>
@@ -12478,7 +13347,7 @@
                           </w:r>
                           <w:r>
                             <w:rPr>
-                              <w:rStyle w:val="Numrodepage"/>
+                              <w:rStyle w:val="PageNumber"/>
                               <w:noProof/>
                               <w:sz w:val="22"/>
                               <w:szCs w:val="22"/>
@@ -12487,7 +13356,7 @@
                           </w:r>
                           <w:r>
                             <w:rPr>
-                              <w:rStyle w:val="Numrodepage"/>
+                              <w:rStyle w:val="PageNumber"/>
                               <w:sz w:val="22"/>
                               <w:szCs w:val="22"/>
                             </w:rPr>
@@ -12495,45 +13364,45 @@
                           </w:r>
                           <w:r>
                             <w:rPr>
-                              <w:rStyle w:val="Numrodepage"/>
+                              <w:rStyle w:val="PageNumber"/>
                             </w:rPr>
                             <w:tab/>
                             <w:t xml:space="preserve">- </w:t>
                           </w:r>
                           <w:r>
                             <w:rPr>
-                              <w:rStyle w:val="Numrodepage"/>
+                              <w:rStyle w:val="PageNumber"/>
                             </w:rPr>
                             <w:fldChar w:fldCharType="begin"/>
                           </w:r>
                           <w:r>
                             <w:rPr>
-                              <w:rStyle w:val="Numrodepage"/>
+                              <w:rStyle w:val="PageNumber"/>
                             </w:rPr>
                             <w:instrText xml:space="preserve"> PAGE </w:instrText>
                           </w:r>
                           <w:r>
                             <w:rPr>
-                              <w:rStyle w:val="Numrodepage"/>
+                              <w:rStyle w:val="PageNumber"/>
                             </w:rPr>
                             <w:fldChar w:fldCharType="separate"/>
                           </w:r>
                           <w:r>
                             <w:rPr>
-                              <w:rStyle w:val="Numrodepage"/>
+                              <w:rStyle w:val="PageNumber"/>
                               <w:noProof/>
                             </w:rPr>
                             <w:t>16</w:t>
                           </w:r>
                           <w:r>
                             <w:rPr>
-                              <w:rStyle w:val="Numrodepage"/>
+                              <w:rStyle w:val="PageNumber"/>
                             </w:rPr>
                             <w:fldChar w:fldCharType="end"/>
                           </w:r>
                           <w:r>
                             <w:rPr>
-                              <w:rStyle w:val="Numrodepage"/>
+                              <w:rStyle w:val="PageNumber"/>
                             </w:rPr>
                             <w:t xml:space="preserve"> -101010 878</w:t>
                           </w:r>
@@ -12698,7 +13567,7 @@
           </v:handles>
           <o:lock v:ext="edit" text="t" shapetype="t"/>
         </v:shapetype>
-        <v:shape id="PowerPlusWaterMarkObject1360048844" o:spid="_x0000_s1027" type="#_x0000_t136" alt="" style="position:absolute;left:0;text-align:left;margin-left:0;margin-top:0;width:559.4pt;height:23.8pt;rotation:315;z-index:-251634688;mso-wrap-edited:f;mso-position-horizontal:center;mso-position-horizontal-relative:margin;mso-position-vertical:center;mso-position-vertical-relative:margin" o:allowincell="f" fillcolor="#7f7f7f [1612]" stroked="f">
+        <v:shape id="PowerPlusWaterMarkObject1360048844" o:spid="_x0000_s1027" type="#_x0000_t136" alt="" style="position:absolute;left:0;text-align:left;margin-left:0;margin-top:0;width:559.4pt;height:23.8pt;rotation:315;z-index:-251634688;mso-wrap-edited:f;mso-width-percent:0;mso-height-percent:0;mso-position-horizontal:center;mso-position-horizontal-relative:margin;mso-position-vertical:center;mso-position-vertical-relative:margin;mso-width-percent:0;mso-height-percent:0" o:allowincell="f" fillcolor="#7f7f7f [1612]" stroked="f">
           <v:textpath style="font-family:&quot;Times New Roman&quot;;font-size:1pt" string="{{ convention.display_not_validated_status() }}"/>
           <w10:wrap anchorx="margin" anchory="margin"/>
         </v:shape>
@@ -12712,7 +13581,7 @@
 <w:hdr xmlns:wpc="http://schemas.microsoft.com/office/word/2010/wordprocessingCanvas" xmlns:cx="http://schemas.microsoft.com/office/drawing/2014/chartex" xmlns:cx1="http://schemas.microsoft.com/office/drawing/2015/9/8/chartex" xmlns:cx2="http://schemas.microsoft.com/office/drawing/2015/10/21/chartex" xmlns:cx3="http://schemas.microsoft.com/office/drawing/2016/5/9/chartex" xmlns:cx4="http://schemas.microsoft.com/office/drawing/2016/5/10/chartex" xmlns:cx5="http://schemas.microsoft.com/office/drawing/2016/5/11/chartex" xmlns:cx6="http://schemas.microsoft.com/office/drawing/2016/5/12/chartex" xmlns:cx7="http://schemas.microsoft.com/office/drawing/2016/5/13/chartex" xmlns:cx8="http://schemas.microsoft.com/office/drawing/2016/5/14/chartex" xmlns:mc="http://schemas.openxmlformats.org/markup-compatibility/2006" xmlns:aink="http://schemas.microsoft.com/office/drawing/2016/ink" xmlns:am3d="http://schemas.microsoft.com/office/drawing/2017/model3d" xmlns:o="urn:schemas-microsoft-com:office:office" xmlns:oel="http://schemas.microsoft.com/office/2019/extlst" xmlns:r="http://schemas.openxmlformats.org/officeDocument/2006/relationships" xmlns:m="http://schemas.openxmlformats.org/officeDocument/2006/math" xmlns:v="urn:schemas-microsoft-com:vml" xmlns:wp14="http://schemas.microsoft.com/office/word/2010/wordprocessingDrawing" xmlns:wp="http://schemas.openxmlformats.org/drawingml/2006/wordprocessingDrawing" xmlns:w10="urn:schemas-microsoft-com:office:word" xmlns:w="http://schemas.openxmlformats.org/wordprocessingml/2006/main" xmlns:w14="http://schemas.microsoft.com/office/word/2010/wordml" xmlns:w15="http://schemas.microsoft.com/office/word/2012/wordml" xmlns:w16cex="http://schemas.microsoft.com/office/word/2018/wordml/cex" xmlns:w16cid="http://schemas.microsoft.com/office/word/2016/wordml/cid" xmlns:w16="http://schemas.microsoft.com/office/word/2018/wordml" xmlns:w16sdtdh="http://schemas.microsoft.com/office/word/2020/wordml/sdtdatahash" xmlns:w16se="http://schemas.microsoft.com/office/word/2015/wordml/symex" xmlns:wpg="http://schemas.microsoft.com/office/word/2010/wordprocessingGroup" xmlns:wpi="http://schemas.microsoft.com/office/word/2010/wordprocessingInk" xmlns:wne="http://schemas.microsoft.com/office/word/2006/wordml" xmlns:wps="http://schemas.microsoft.com/office/word/2010/wordprocessingShape" mc:Ignorable="w14 w15 w16se w16cid w16 w16cex w16sdtdh wp14">
   <w:p>
     <w:pPr>
-      <w:pStyle w:val="En-tte"/>
+      <w:pStyle w:val="Header"/>
       <w:ind w:right="360"/>
     </w:pPr>
     <w:r>
@@ -12744,7 +13613,7 @@
           </v:handles>
           <o:lock v:ext="edit" text="t" shapetype="t"/>
         </v:shapetype>
-        <v:shape id="PowerPlusWaterMarkObject1360048845" o:spid="_x0000_s1026" type="#_x0000_t136" alt="" style="position:absolute;left:0;text-align:left;margin-left:0;margin-top:0;width:559.4pt;height:23.8pt;rotation:315;z-index:-251632640;mso-wrap-edited:f;mso-position-horizontal:center;mso-position-horizontal-relative:margin;mso-position-vertical:center;mso-position-vertical-relative:margin" o:allowincell="f" fillcolor="#7f7f7f [1612]" stroked="f">
+        <v:shape id="PowerPlusWaterMarkObject1360048845" o:spid="_x0000_s1026" type="#_x0000_t136" alt="" style="position:absolute;left:0;text-align:left;margin-left:0;margin-top:0;width:559.4pt;height:23.8pt;rotation:315;z-index:-251632640;mso-wrap-edited:f;mso-width-percent:0;mso-height-percent:0;mso-position-horizontal:center;mso-position-horizontal-relative:margin;mso-position-vertical:center;mso-position-vertical-relative:margin;mso-width-percent:0;mso-height-percent:0" o:allowincell="f" fillcolor="#7f7f7f [1612]" stroked="f">
           <v:textpath style="font-family:&quot;Times New Roman&quot;;font-size:1pt" string="{{ convention.display_not_validated_status() }}"/>
           <w10:wrap anchorx="margin" anchory="margin"/>
         </v:shape>
@@ -12812,7 +13681,7 @@
                         <w:p>
                           <w:r>
                             <w:rPr>
-                              <w:rStyle w:val="Numrodepage"/>
+                              <w:rStyle w:val="PageNumber"/>
                               <w:sz w:val="22"/>
                               <w:szCs w:val="22"/>
                             </w:rPr>
@@ -12820,7 +13689,7 @@
                           </w:r>
                           <w:r>
                             <w:rPr>
-                              <w:rStyle w:val="Numrodepage"/>
+                              <w:rStyle w:val="PageNumber"/>
                               <w:sz w:val="22"/>
                               <w:szCs w:val="22"/>
                             </w:rPr>
@@ -12828,7 +13697,7 @@
                           </w:r>
                           <w:r>
                             <w:rPr>
-                              <w:rStyle w:val="Numrodepage"/>
+                              <w:rStyle w:val="PageNumber"/>
                               <w:sz w:val="22"/>
                               <w:szCs w:val="22"/>
                             </w:rPr>
@@ -12836,7 +13705,7 @@
                           </w:r>
                           <w:r>
                             <w:rPr>
-                              <w:rStyle w:val="Numrodepage"/>
+                              <w:rStyle w:val="PageNumber"/>
                               <w:sz w:val="22"/>
                               <w:szCs w:val="22"/>
                             </w:rPr>
@@ -12844,7 +13713,7 @@
                           </w:r>
                           <w:r>
                             <w:rPr>
-                              <w:rStyle w:val="Numrodepage"/>
+                              <w:rStyle w:val="PageNumber"/>
                               <w:noProof/>
                               <w:sz w:val="22"/>
                               <w:szCs w:val="22"/>
@@ -12853,7 +13722,7 @@
                           </w:r>
                           <w:r>
                             <w:rPr>
-                              <w:rStyle w:val="Numrodepage"/>
+                              <w:rStyle w:val="PageNumber"/>
                               <w:sz w:val="22"/>
                               <w:szCs w:val="22"/>
                             </w:rPr>
@@ -12861,45 +13730,45 @@
                           </w:r>
                           <w:r>
                             <w:rPr>
-                              <w:rStyle w:val="Numrodepage"/>
+                              <w:rStyle w:val="PageNumber"/>
                             </w:rPr>
                             <w:tab/>
                             <w:t xml:space="preserve">- </w:t>
                           </w:r>
                           <w:r>
                             <w:rPr>
-                              <w:rStyle w:val="Numrodepage"/>
+                              <w:rStyle w:val="PageNumber"/>
                             </w:rPr>
                             <w:fldChar w:fldCharType="begin"/>
                           </w:r>
                           <w:r>
                             <w:rPr>
-                              <w:rStyle w:val="Numrodepage"/>
+                              <w:rStyle w:val="PageNumber"/>
                             </w:rPr>
                             <w:instrText xml:space="preserve"> PAGE </w:instrText>
                           </w:r>
                           <w:r>
                             <w:rPr>
-                              <w:rStyle w:val="Numrodepage"/>
+                              <w:rStyle w:val="PageNumber"/>
                             </w:rPr>
                             <w:fldChar w:fldCharType="separate"/>
                           </w:r>
                           <w:r>
                             <w:rPr>
-                              <w:rStyle w:val="Numrodepage"/>
+                              <w:rStyle w:val="PageNumber"/>
                               <w:noProof/>
                             </w:rPr>
                             <w:t>16</w:t>
                           </w:r>
                           <w:r>
                             <w:rPr>
-                              <w:rStyle w:val="Numrodepage"/>
+                              <w:rStyle w:val="PageNumber"/>
                             </w:rPr>
                             <w:fldChar w:fldCharType="end"/>
                           </w:r>
                           <w:r>
                             <w:rPr>
-                              <w:rStyle w:val="Numrodepage"/>
+                              <w:rStyle w:val="PageNumber"/>
                             </w:rPr>
                             <w:t xml:space="preserve"> -101010 878</w:t>
                           </w:r>
@@ -13037,25 +13906,25 @@
     </w:r>
     <w:r>
       <w:rPr>
-        <w:rStyle w:val="Numrodepage"/>
+        <w:rStyle w:val="PageNumber"/>
       </w:rPr>
       <w:t xml:space="preserve"> </w:t>
     </w:r>
     <w:r>
       <w:rPr>
-        <w:rStyle w:val="Numrodepage"/>
+        <w:rStyle w:val="PageNumber"/>
       </w:rPr>
       <w:tab/>
     </w:r>
     <w:r>
       <w:rPr>
-        <w:rStyle w:val="Numrodepage"/>
+        <w:rStyle w:val="PageNumber"/>
       </w:rPr>
       <w:tab/>
     </w:r>
     <w:r>
       <w:rPr>
-        <w:rStyle w:val="Numrodepage"/>
+        <w:rStyle w:val="PageNumber"/>
       </w:rPr>
       <w:tab/>
     </w:r>
@@ -13067,7 +13936,7 @@
 <w:hdr xmlns:wpc="http://schemas.microsoft.com/office/word/2010/wordprocessingCanvas" xmlns:cx="http://schemas.microsoft.com/office/drawing/2014/chartex" xmlns:cx1="http://schemas.microsoft.com/office/drawing/2015/9/8/chartex" xmlns:cx2="http://schemas.microsoft.com/office/drawing/2015/10/21/chartex" xmlns:cx3="http://schemas.microsoft.com/office/drawing/2016/5/9/chartex" xmlns:cx4="http://schemas.microsoft.com/office/drawing/2016/5/10/chartex" xmlns:cx5="http://schemas.microsoft.com/office/drawing/2016/5/11/chartex" xmlns:cx6="http://schemas.microsoft.com/office/drawing/2016/5/12/chartex" xmlns:cx7="http://schemas.microsoft.com/office/drawing/2016/5/13/chartex" xmlns:cx8="http://schemas.microsoft.com/office/drawing/2016/5/14/chartex" xmlns:mc="http://schemas.openxmlformats.org/markup-compatibility/2006" xmlns:aink="http://schemas.microsoft.com/office/drawing/2016/ink" xmlns:am3d="http://schemas.microsoft.com/office/drawing/2017/model3d" xmlns:o="urn:schemas-microsoft-com:office:office" xmlns:oel="http://schemas.microsoft.com/office/2019/extlst" xmlns:r="http://schemas.openxmlformats.org/officeDocument/2006/relationships" xmlns:m="http://schemas.openxmlformats.org/officeDocument/2006/math" xmlns:v="urn:schemas-microsoft-com:vml" xmlns:wp14="http://schemas.microsoft.com/office/word/2010/wordprocessingDrawing" xmlns:wp="http://schemas.openxmlformats.org/drawingml/2006/wordprocessingDrawing" xmlns:w10="urn:schemas-microsoft-com:office:word" xmlns:w="http://schemas.openxmlformats.org/wordprocessingml/2006/main" xmlns:w14="http://schemas.microsoft.com/office/word/2010/wordml" xmlns:w15="http://schemas.microsoft.com/office/word/2012/wordml" xmlns:w16cex="http://schemas.microsoft.com/office/word/2018/wordml/cex" xmlns:w16cid="http://schemas.microsoft.com/office/word/2016/wordml/cid" xmlns:w16="http://schemas.microsoft.com/office/word/2018/wordml" xmlns:w16sdtdh="http://schemas.microsoft.com/office/word/2020/wordml/sdtdatahash" xmlns:w16se="http://schemas.microsoft.com/office/word/2015/wordml/symex" xmlns:wpg="http://schemas.microsoft.com/office/word/2010/wordprocessingGroup" xmlns:wpi="http://schemas.microsoft.com/office/word/2010/wordprocessingInk" xmlns:wne="http://schemas.microsoft.com/office/word/2006/wordml" xmlns:wps="http://schemas.microsoft.com/office/word/2010/wordprocessingShape" mc:Ignorable="w14 w15 w16se w16cid w16 w16cex w16sdtdh wp14">
   <w:tbl>
     <w:tblPr>
-      <w:tblStyle w:val="Grilledutableau"/>
+      <w:tblStyle w:val="TableGrid"/>
       <w:tblW w:w="8460" w:type="dxa"/>
       <w:jc w:val="center"/>
       <w:tblBorders>
@@ -13307,7 +14176,15 @@
             <w:pStyle w:val="Form9"/>
           </w:pPr>
           <w:r>
-            <w:t>(pour l'établissement d'expéditions, copies, extraits d'actes ou décisions judiciaires à publier)</w:t>
+            <w:t>(</w:t>
+          </w:r>
+          <w:proofErr w:type="gramStart"/>
+          <w:r>
+            <w:t>pour</w:t>
+          </w:r>
+          <w:proofErr w:type="gramEnd"/>
+          <w:r>
+            <w:t xml:space="preserve"> l'établissement d'expéditions, copies, extraits d'actes ou décisions judiciaires à publier)</w:t>
           </w:r>
         </w:p>
         <w:p/>
@@ -13489,9 +14366,11 @@
             </w:rPr>
             <w:t xml:space="preserve"> </w:t>
           </w:r>
+          <w:proofErr w:type="gramStart"/>
           <w:r>
             <w:t>TAXES:</w:t>
           </w:r>
+          <w:proofErr w:type="gramEnd"/>
         </w:p>
         <w:p>
           <w:pPr>
@@ -13510,9 +14389,11 @@
           <w:pPr>
             <w:pStyle w:val="Form10J"/>
           </w:pPr>
+          <w:proofErr w:type="gramStart"/>
           <w:r>
             <w:t>CSI:</w:t>
           </w:r>
+          <w:proofErr w:type="gramEnd"/>
         </w:p>
         <w:p>
           <w:pPr>
@@ -13572,7 +14453,7 @@
   </w:tbl>
   <w:p>
     <w:pPr>
-      <w:pStyle w:val="En-tte"/>
+      <w:pStyle w:val="Header"/>
       <w:tabs>
         <w:tab w:val="clear" w:pos="4536"/>
         <w:tab w:val="clear" w:pos="9072"/>
@@ -13607,7 +14488,7 @@
           </v:handles>
           <o:lock v:ext="edit" text="t" shapetype="t"/>
         </v:shapetype>
-        <v:shape id="PowerPlusWaterMarkObject1360048843" o:spid="_x0000_s1025" type="#_x0000_t136" alt="" style="position:absolute;left:0;text-align:left;margin-left:0;margin-top:0;width:559.4pt;height:23.8pt;rotation:315;z-index:-251636736;mso-wrap-edited:f;mso-position-horizontal:center;mso-position-horizontal-relative:margin;mso-position-vertical:center;mso-position-vertical-relative:margin" o:allowincell="f" fillcolor="#7f7f7f [1612]" stroked="f">
+        <v:shape id="PowerPlusWaterMarkObject1360048843" o:spid="_x0000_s1025" type="#_x0000_t136" alt="" style="position:absolute;left:0;text-align:left;margin-left:0;margin-top:0;width:559.4pt;height:23.8pt;rotation:315;z-index:-251636736;mso-wrap-edited:f;mso-width-percent:0;mso-height-percent:0;mso-position-horizontal:center;mso-position-horizontal-relative:margin;mso-position-vertical:center;mso-position-vertical-relative:margin;mso-width-percent:0;mso-height-percent:0" o:allowincell="f" fillcolor="#7f7f7f [1612]" stroked="f">
           <v:textpath style="font-family:&quot;Times New Roman&quot;;font-size:1pt" string="{{ convention.display_not_validated_status() }}"/>
           <w10:wrap anchorx="margin" anchory="margin"/>
         </v:shape>
@@ -13712,11 +14593,11 @@
                                 <v:path o:extrusionok="f" gradientshapeok="t" o:connecttype="rect"/>
                                 <o:lock v:ext="edit" aspectratio="t"/>
                               </v:shapetype>
-                              <v:shape id="_x0000_i1026" type="#_x0000_t75" alt="" style="width:43.5pt;height:28.5pt;mso-width-percent:0;mso-height-percent:0;mso-width-percent:0;mso-height-percent:0" filled="t">
+                              <v:shape id="_x0000_i1025" type="#_x0000_t75" alt="" style="width:43.5pt;height:28.5pt;mso-width-percent:0;mso-height-percent:0;mso-width-percent:0;mso-height-percent:0" filled="t">
                                 <v:fill color2="black"/>
                                 <v:imagedata r:id="rId2" o:title="" croptop="-22f" cropbottom="-22f" cropleft="-25f" cropright="-25f"/>
                               </v:shape>
-                              <o:OLEObject Type="Embed" ProgID="Word.Picture.8" ShapeID="_x0000_i1026" DrawAspect="Content" ObjectID="_1718454082" r:id="rId3"/>
+                              <o:OLEObject Type="Embed" ProgID="Word.Picture.8" ShapeID="_x0000_i1025" DrawAspect="Content" ObjectID="_1719995967" r:id="rId3"/>
                             </w:object>
                           </w:r>
                         </w:p>
@@ -13762,7 +14643,11 @@
         </mc:Choice>
         <mc:Fallback>
           <w:pict>
-            <v:shape w14:anchorId="20DB70F0" id="Text Box 17" o:spid="_x0000_s1031" type="#_x0000_t202" style="position:absolute;left:0;text-align:left;margin-left:37.35pt;margin-top:21.2pt;width:78.5pt;height:49.7pt;z-index:251663360;visibility:visible;mso-wrap-style:square;mso-width-percent:0;mso-height-percent:0;mso-wrap-distance-left:9.05pt;mso-wrap-distance-top:0;mso-wrap-distance-right:9.05pt;mso-wrap-distance-bottom:0;mso-position-horizontal:absolute;mso-position-horizontal-relative:page;mso-position-vertical:absolute;mso-position-vertical-relative:page;mso-width-percent:0;mso-height-percent:0;mso-width-relative:page;mso-height-relative:page;v-text-anchor:top" o:gfxdata="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" stroked="f">
+            <v:shapetype w14:anchorId="20DB70F0" id="_x0000_t202" coordsize="21600,21600" o:spt="202" path="m,l,21600r21600,l21600,xe">
+              <v:stroke joinstyle="miter"/>
+              <v:path gradientshapeok="t" o:connecttype="rect"/>
+            </v:shapetype>
+            <v:shape id="Text Box 17" o:spid="_x0000_s1031" type="#_x0000_t202" style="position:absolute;left:0;text-align:left;margin-left:37.35pt;margin-top:21.2pt;width:78.5pt;height:49.7pt;z-index:251663360;visibility:visible;mso-wrap-style:square;mso-width-percent:0;mso-height-percent:0;mso-wrap-distance-left:9.05pt;mso-wrap-distance-top:0;mso-wrap-distance-right:9.05pt;mso-wrap-distance-bottom:0;mso-position-horizontal:absolute;mso-position-horizontal-relative:page;mso-position-vertical:absolute;mso-position-vertical-relative:page;mso-width-percent:0;mso-height-percent:0;mso-width-relative:page;mso-height-relative:page;v-text-anchor:top" o:gfxdata="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" stroked="f">
               <v:fill opacity="0"/>
               <v:path arrowok="t"/>
               <v:textbox inset=".45pt,.45pt,.45pt,.45pt">
@@ -13787,12 +14672,12 @@
                       <w:rPr>
                         <w:noProof/>
                       </w:rPr>
-                      <w:object w:dxaOrig="864" w:dyaOrig="576" w14:anchorId="2CBFC420">
-                        <v:shape id="_x0000_i1026" type="#_x0000_t75" alt="" style="width:43.5pt;height:28.5pt;mso-width-percent:0;mso-height-percent:0;mso-width-percent:0;mso-height-percent:0" filled="t">
+                      <w:object w:dxaOrig="870" w:dyaOrig="570" w14:anchorId="2CBFC420">
+                        <v:shape id="_x0000_i1025" type="#_x0000_t75" alt="" style="width:43.5pt;height:28.5pt;mso-width-percent:0;mso-height-percent:0;mso-width-percent:0;mso-height-percent:0" filled="t">
                           <v:fill color2="black"/>
-                          <v:imagedata r:id="rId4" o:title="" croptop="-22f" cropbottom="-22f" cropleft="-25f" cropright="-25f"/>
+                          <v:imagedata r:id="rId2" o:title="" croptop="-22f" cropbottom="-22f" cropleft="-25f" cropright="-25f"/>
                         </v:shape>
-                        <o:OLEObject Type="Embed" ProgID="Word.Picture.8" ShapeID="_x0000_i1026" DrawAspect="Content" ObjectID="_1716190589" r:id="rId5"/>
+                        <o:OLEObject Type="Embed" ProgID="Word.Picture.8" ShapeID="_x0000_i1025" DrawAspect="Content" ObjectID="_1719995967" r:id="rId4"/>
                       </w:object>
                     </w:r>
                   </w:p>
@@ -14141,7 +15026,7 @@
     <w:lvl w:ilvl="0">
       <w:start w:val="1"/>
       <w:numFmt w:val="none"/>
-      <w:pStyle w:val="Titre1"/>
+      <w:pStyle w:val="Heading1"/>
       <w:suff w:val="nothing"/>
       <w:lvlText w:val=""/>
       <w:lvlJc w:val="left"/>
@@ -14155,7 +15040,7 @@
     <w:lvl w:ilvl="1">
       <w:start w:val="1"/>
       <w:numFmt w:val="none"/>
-      <w:pStyle w:val="Titre2"/>
+      <w:pStyle w:val="Heading2"/>
       <w:suff w:val="nothing"/>
       <w:lvlText w:val=""/>
       <w:lvlJc w:val="left"/>
@@ -14169,7 +15054,7 @@
     <w:lvl w:ilvl="2">
       <w:start w:val="1"/>
       <w:numFmt w:val="none"/>
-      <w:pStyle w:val="Titre3"/>
+      <w:pStyle w:val="Heading3"/>
       <w:suff w:val="nothing"/>
       <w:lvlText w:val=""/>
       <w:lvlJc w:val="left"/>
@@ -14183,7 +15068,7 @@
     <w:lvl w:ilvl="3">
       <w:start w:val="1"/>
       <w:numFmt w:val="none"/>
-      <w:pStyle w:val="Titre4"/>
+      <w:pStyle w:val="Heading4"/>
       <w:suff w:val="nothing"/>
       <w:lvlText w:val=""/>
       <w:lvlJc w:val="left"/>
@@ -14197,7 +15082,7 @@
     <w:lvl w:ilvl="4">
       <w:start w:val="1"/>
       <w:numFmt w:val="none"/>
-      <w:pStyle w:val="Titre5"/>
+      <w:pStyle w:val="Heading5"/>
       <w:suff w:val="nothing"/>
       <w:lvlText w:val=""/>
       <w:lvlJc w:val="left"/>
@@ -14211,7 +15096,7 @@
     <w:lvl w:ilvl="5">
       <w:start w:val="1"/>
       <w:numFmt w:val="none"/>
-      <w:pStyle w:val="Titre6"/>
+      <w:pStyle w:val="Heading6"/>
       <w:suff w:val="nothing"/>
       <w:lvlText w:val=""/>
       <w:lvlJc w:val="left"/>
@@ -14225,7 +15110,7 @@
     <w:lvl w:ilvl="6">
       <w:start w:val="1"/>
       <w:numFmt w:val="none"/>
-      <w:pStyle w:val="Titre7"/>
+      <w:pStyle w:val="Heading7"/>
       <w:suff w:val="nothing"/>
       <w:lvlText w:val=""/>
       <w:lvlJc w:val="left"/>
@@ -14904,7 +15789,7 @@
       <w:szCs w:val="24"/>
     </w:rPr>
   </w:style>
-  <w:style w:type="paragraph" w:styleId="Titre1">
+  <w:style w:type="paragraph" w:styleId="Heading1">
     <w:name w:val="heading 1"/>
     <w:basedOn w:val="Normal"/>
     <w:next w:val="Normal"/>
@@ -14937,7 +15822,7 @@
       <w:lang w:eastAsia="zh-CN"/>
     </w:rPr>
   </w:style>
-  <w:style w:type="paragraph" w:styleId="Titre2">
+  <w:style w:type="paragraph" w:styleId="Heading2">
     <w:name w:val="heading 2"/>
     <w:basedOn w:val="Normal"/>
     <w:next w:val="Normal"/>
@@ -14964,9 +15849,9 @@
       <w:lang w:eastAsia="zh-CN"/>
     </w:rPr>
   </w:style>
-  <w:style w:type="paragraph" w:styleId="Titre3">
+  <w:style w:type="paragraph" w:styleId="Heading3">
     <w:name w:val="heading 3"/>
-    <w:basedOn w:val="Titre2"/>
+    <w:basedOn w:val="Heading2"/>
     <w:next w:val="Normal"/>
     <w:qFormat/>
     <w:pPr>
@@ -14979,7 +15864,7 @@
       <w:color w:val="800080"/>
     </w:rPr>
   </w:style>
-  <w:style w:type="paragraph" w:styleId="Titre4">
+  <w:style w:type="paragraph" w:styleId="Heading4">
     <w:name w:val="heading 4"/>
     <w:basedOn w:val="Normal"/>
     <w:next w:val="Normal"/>
@@ -15003,7 +15888,7 @@
       <w:lang w:eastAsia="zh-CN"/>
     </w:rPr>
   </w:style>
-  <w:style w:type="paragraph" w:styleId="Titre5">
+  <w:style w:type="paragraph" w:styleId="Heading5">
     <w:name w:val="heading 5"/>
     <w:basedOn w:val="Normal"/>
     <w:next w:val="Normal"/>
@@ -15027,7 +15912,7 @@
       <w:lang w:eastAsia="zh-CN"/>
     </w:rPr>
   </w:style>
-  <w:style w:type="paragraph" w:styleId="Titre6">
+  <w:style w:type="paragraph" w:styleId="Heading6">
     <w:name w:val="heading 6"/>
     <w:basedOn w:val="Normal"/>
     <w:next w:val="Normal"/>
@@ -15052,7 +15937,7 @@
       <w:lang w:eastAsia="zh-CN"/>
     </w:rPr>
   </w:style>
-  <w:style w:type="paragraph" w:styleId="Titre7">
+  <w:style w:type="paragraph" w:styleId="Heading7">
     <w:name w:val="heading 7"/>
     <w:basedOn w:val="Normal"/>
     <w:next w:val="Normal"/>
@@ -15078,13 +15963,13 @@
       <w:lang w:eastAsia="zh-CN"/>
     </w:rPr>
   </w:style>
-  <w:style w:type="character" w:default="1" w:styleId="Policepardfaut">
+  <w:style w:type="character" w:default="1" w:styleId="DefaultParagraphFont">
     <w:name w:val="Default Paragraph Font"/>
     <w:uiPriority w:val="1"/>
     <w:semiHidden/>
     <w:unhideWhenUsed/>
   </w:style>
-  <w:style w:type="table" w:default="1" w:styleId="TableauNormal">
+  <w:style w:type="table" w:default="1" w:styleId="TableNormal">
     <w:name w:val="Normal Table"/>
     <w:uiPriority w:val="99"/>
     <w:semiHidden/>
@@ -15099,7 +15984,7 @@
       </w:tblCellMar>
     </w:tblPr>
   </w:style>
-  <w:style w:type="numbering" w:default="1" w:styleId="Aucuneliste">
+  <w:style w:type="numbering" w:default="1" w:styleId="NoList">
     <w:name w:val="No List"/>
     <w:uiPriority w:val="99"/>
     <w:semiHidden/>
@@ -15315,7 +16200,7 @@
   <w:style w:type="character" w:customStyle="1" w:styleId="WW-Policepardfaut">
     <w:name w:val="WW-Police par défaut"/>
   </w:style>
-  <w:style w:type="character" w:styleId="Numrodepage">
+  <w:style w:type="character" w:styleId="PageNumber">
     <w:name w:val="page number"/>
     <w:basedOn w:val="WW-Policepardfaut"/>
   </w:style>
@@ -15377,10 +16262,10 @@
   <w:style w:type="character" w:customStyle="1" w:styleId="Policepardfaut1">
     <w:name w:val="Police par défaut1"/>
   </w:style>
-  <w:style w:type="paragraph" w:customStyle="1" w:styleId="Titre20">
+  <w:style w:type="paragraph" w:customStyle="1" w:styleId="Titre2">
     <w:name w:val="Titre2"/>
     <w:basedOn w:val="Normal"/>
-    <w:next w:val="Corpsdetexte"/>
+    <w:next w:val="BodyText"/>
     <w:pPr>
       <w:keepNext/>
       <w:suppressAutoHyphens/>
@@ -15397,7 +16282,7 @@
       <w:lang w:eastAsia="zh-CN"/>
     </w:rPr>
   </w:style>
-  <w:style w:type="paragraph" w:styleId="Corpsdetexte">
+  <w:style w:type="paragraph" w:styleId="BodyText">
     <w:name w:val="Body Text"/>
     <w:basedOn w:val="Normal"/>
     <w:pPr>
@@ -15413,14 +16298,14 @@
       <w:lang w:eastAsia="zh-CN"/>
     </w:rPr>
   </w:style>
-  <w:style w:type="paragraph" w:styleId="Liste">
+  <w:style w:type="paragraph" w:styleId="List">
     <w:name w:val="List"/>
-    <w:basedOn w:val="Corpsdetexte"/>
+    <w:basedOn w:val="BodyText"/>
     <w:rPr>
       <w:rFonts w:cs="Tahoma"/>
     </w:rPr>
   </w:style>
-  <w:style w:type="paragraph" w:styleId="Lgende">
+  <w:style w:type="paragraph" w:styleId="Caption">
     <w:name w:val="caption"/>
     <w:basedOn w:val="Normal"/>
     <w:qFormat/>
@@ -15474,7 +16359,7 @@
   <w:style w:type="paragraph" w:customStyle="1" w:styleId="WW-Titre">
     <w:name w:val="WW-Titre"/>
     <w:basedOn w:val="Normal"/>
-    <w:next w:val="Corpsdetexte"/>
+    <w:next w:val="BodyText"/>
     <w:pPr>
       <w:keepNext/>
       <w:suppressAutoHyphens/>
@@ -15491,10 +16376,10 @@
       <w:lang w:eastAsia="zh-CN"/>
     </w:rPr>
   </w:style>
-  <w:style w:type="paragraph" w:styleId="Sous-titre">
+  <w:style w:type="paragraph" w:styleId="Subtitle">
     <w:name w:val="Subtitle"/>
-    <w:basedOn w:val="Titre20"/>
-    <w:next w:val="Corpsdetexte"/>
+    <w:basedOn w:val="Titre2"/>
+    <w:next w:val="BodyText"/>
     <w:qFormat/>
     <w:pPr>
       <w:jc w:val="center"/>
@@ -15521,7 +16406,7 @@
       <w:lang w:eastAsia="zh-CN"/>
     </w:rPr>
   </w:style>
-  <w:style w:type="paragraph" w:styleId="En-tte">
+  <w:style w:type="paragraph" w:styleId="Header">
     <w:name w:val="header"/>
     <w:basedOn w:val="Normal"/>
     <w:pPr>
@@ -15540,7 +16425,7 @@
       <w:lang w:eastAsia="zh-CN"/>
     </w:rPr>
   </w:style>
-  <w:style w:type="paragraph" w:styleId="Pieddepage">
+  <w:style w:type="paragraph" w:styleId="Footer">
     <w:name w:val="footer"/>
     <w:basedOn w:val="Normal"/>
     <w:pPr>
@@ -15655,7 +16540,7 @@
       <w:lang w:eastAsia="zh-CN"/>
     </w:rPr>
   </w:style>
-  <w:style w:type="paragraph" w:styleId="Notedebasdepage">
+  <w:style w:type="paragraph" w:styleId="FootnoteText">
     <w:name w:val="footnote text"/>
     <w:basedOn w:val="Normal"/>
     <w:pPr>
@@ -15825,7 +16710,7 @@
   </w:style>
   <w:style w:type="paragraph" w:customStyle="1" w:styleId="Contenudetableau">
     <w:name w:val="Contenu de tableau"/>
-    <w:basedOn w:val="Corpsdetexte"/>
+    <w:basedOn w:val="BodyText"/>
     <w:pPr>
       <w:suppressLineNumbers/>
     </w:pPr>
@@ -15908,7 +16793,7 @@
       <w:iCs/>
     </w:rPr>
   </w:style>
-  <w:style w:type="paragraph" w:customStyle="1" w:styleId="TITRE40">
+  <w:style w:type="paragraph" w:customStyle="1" w:styleId="TITRE4">
     <w:name w:val="TITRE4"/>
     <w:basedOn w:val="Normal"/>
     <w:pPr>
@@ -15925,7 +16810,7 @@
       <w:lang w:eastAsia="zh-CN"/>
     </w:rPr>
   </w:style>
-  <w:style w:type="paragraph" w:customStyle="1" w:styleId="TITRE50">
+  <w:style w:type="paragraph" w:customStyle="1" w:styleId="TITRE5">
     <w:name w:val="TITRE5"/>
     <w:basedOn w:val="Normal"/>
     <w:pPr>
@@ -15977,12 +16862,12 @@
   </w:style>
   <w:style w:type="paragraph" w:customStyle="1" w:styleId="Contenuducadre">
     <w:name w:val="Contenu du cadre"/>
-    <w:basedOn w:val="Corpsdetexte"/>
+    <w:basedOn w:val="BodyText"/>
   </w:style>
-  <w:style w:type="paragraph" w:customStyle="1" w:styleId="Titre10">
+  <w:style w:type="paragraph" w:customStyle="1" w:styleId="Titre1">
     <w:name w:val="Titre1"/>
     <w:basedOn w:val="Normal"/>
-    <w:next w:val="Corpsdetexte"/>
+    <w:next w:val="BodyText"/>
     <w:pPr>
       <w:keepNext/>
       <w:suppressAutoHyphens/>
@@ -16065,9 +16950,9 @@
       <w:lang w:eastAsia="zh-CN"/>
     </w:rPr>
   </w:style>
-  <w:style w:type="table" w:styleId="Grilledutableau">
+  <w:style w:type="table" w:styleId="TableGrid">
     <w:name w:val="Table Grid"/>
-    <w:basedOn w:val="TableauNormal"/>
+    <w:basedOn w:val="TableNormal"/>
     <w:uiPriority w:val="59"/>
     <w:rsid w:val="00ED0284"/>
     <w:tblPr>
@@ -16081,7 +16966,7 @@
       </w:tblBorders>
     </w:tblPr>
   </w:style>
-  <w:style w:type="paragraph" w:styleId="Paragraphedeliste">
+  <w:style w:type="paragraph" w:styleId="ListParagraph">
     <w:name w:val="List Paragraph"/>
     <w:basedOn w:val="Normal"/>
     <w:uiPriority w:val="34"/>

</xml_diff>